<commit_message>
Complete Phase 2 revert; refactoring and CLAUDE.md improvements
Revert: finish removing similarLocation from response_assembly.py and both
server.py entry points; delete validate_18_similar.xml test fixture.

Refactor (no logic changes):
- Remove dead code: ELEMENT_BY_PIDF_LO and ELEMENT_BY_FIELD from models.py
- Fix CivicCoverageEntry.boundary type: Optional[object] -> Optional[ServiceBoundary]
- Narrow Gate2Result.layer to Optional[Literal["SSAP", "RCL"]]
- Mark Similar Location extension comment as EXPERIMENTAL in server.py

Docs:
- Add full environment variable table to CLAUDE.md; flag LVF_DEFAULT_MAPPING_SOURCE_ID
  as required (server refuses to start without it)
- Fix stale seed.py example: validate_17 -> validate_17_complete
- Label Similar Location Extension section as experimental/draft standard
</commit_message>
<xml_diff>
--- a/LVF_Algorithm_Specification_current.docx
+++ b/LVF_Algorithm_Specification_current.docx
@@ -10610,6 +10610,16 @@
         <w:t xml:space="preserve">response_assembly.py: default_mapping_returned flag corrected to only set True when default_mapping_factory is not None — previously fired unconditionally, potentially producing an empty mapping list in violation of RFC 5222 §8.4.1</w:t>
       </w:r>
     </w:p>
+    <w:p>
+      <w:r>
+        <w:t xml:space="preserve">Similar Location extension phase 1 implemented (draft-ietf-ecrit-similar-location-19): completeLocation element returned on SSAP match when rli:returnAdditionalLocation is “complete” or “any”; controlled by LVF_ENABLE_SIMILAR_LOCATION environment variable (default disabled); SIMILAR_LOCATION_MAX_RESULTS configures result cap (default 5); rli namespace declared only on the element itself when content is returned; §10.3 design decisions added</w:t>
+      </w:r>
+    </w:p>
+    <w:p>
+      <w:r>
+        <w:t xml:space="preserve">Regression test harness added: tests/regression/runner.py discovers all XML request files in tests/, submits each through handle_find_service() directly, and compares responses against golden files in tests/regression/golden/; seed.py captures initial golden files (run once); semantic XML comparison used to avoid false failures from whitespace or attribute ordering differences</w:t>
+      </w:r>
+    </w:p>
     <w:p/>
     <w:p>
       <w:pPr>
@@ -10689,7 +10699,7 @@
         </w:numPr>
       </w:pPr>
       <w:r>
-        <w:t>Similar Location extension (draft-ietf-ecrit-similar-location) integration — the primary mechanism for returning the complete authoritative GIS record to the client, including correct casing and any missing elements. Note: the ambiguous candidate set condition (§5.2, 2+ candidates) is a primary use case for this extension — the client may be able to disambiguate using the candidate records returned via Similar Location.</w:t>
+        <w:t>similarLocation implementation (draft-ietf-ecrit-similar-location-19) — the completeLocation element of this extension is implemented (see §10.3). The similarLocation element, which returns candidate addresses for invalid results, is deferred. Unlike completeLocation, which has a deterministic definition, similarLocation requires a fuzzy matching strategy (phonetic, trigram, or edit-distance based) to return meaningful candidates. Different matching strategies will produce different candidate sets across implementations, which is explicitly permitted by the draft (the server is described as "guessing"). Integration with a PostGIS-based geocoding backend should be evaluated as the foundation for this feature. The consistency guarantee provided by this extension applies to completeLocation only.</w:t>
       </w:r>
     </w:p>
     <w:p>
@@ -10701,7 +10711,7 @@
         </w:numPr>
       </w:pPr>
       <w:r>
-        <w:t>Casing discrepancy handling — a submitted value that matches a GIS record case-insensitively (e.g., ‘MCDONALD’ matching ‘McDonald’) is conforming per §5.7 but the client has no way to receive the corrected value without the Similar Location extension. See also the RFC 5222 warning gap in §9.</w:t>
+        <w:t>Casing discrepancy handling — a submitted value that matches a GIS record case-insensitively (e.g., ‘MCDONALD’ matching ‘McDonald’) is conforming per §5.7 but the client has no way to receive the corrected value without the completeLocation extension. See also the RFC 5222 warning gap in §9.</w:t>
       </w:r>
     </w:p>
     <w:p>
@@ -11713,6 +11723,50 @@
           <w:p>
             <w:r>
               <w:t xml:space="preserve">RFC 5222 §8.4.1 requires &lt;mapping&gt; in every findServiceResponse. When the civic coverage lookup yields no unambiguous boundary for a non-conforming result, no real provisioned boundary has geographic authority for the submitted address — returning a real PSAP boundary (e.g., boundaries[0]) is misleading. A synthetic mapping with displayName “VALIDATION RESULT ONLY” satisfies the protocol requirement without attributing geographic authority. LVF_DEFAULT_MAPPING_SOURCE_ID provides the RFC 5222-required sourceId for this synthetic record. The recommended value is {00000000-0000-0000-0000-000000000000} — an all-zeros UUID that is recognizable as a sentinel value distinct from any real provisioned boundary. The LVF MUST NOT start if this variable is unset, ensuring the behavior is always explicitly configured rather than silently defaulting.</w:t>
+            </w:r>
+          </w:p>
+        </w:tc>
+      </w:tr>
+      <w:tr>
+        <w:tc>
+          <w:tcPr>
+            <w:tcW w:w="4500" w:type="dxa"/>
+          </w:tcPr>
+          <w:p>
+            <w:r>
+              <w:t>completeLocation extension enabled by configuration; disabled by default</w:t>
+            </w:r>
+          </w:p>
+        </w:tc>
+        <w:tc>
+          <w:tcPr>
+            <w:tcW w:w="4500" w:type="dxa"/>
+          </w:tcPr>
+          <w:p>
+            <w:r>
+              <w:t xml:space="preserve">The Similar Location extension (draft-ietf-ecrit-similar-location-19) is experimental and not yet standardized. Enabling it by default would emit non-standard XML elements in every applicable response, potentially breaking clients that do not recognize the rli namespace. The LVF_ENABLE_SIMILAR_LOCATION environment variable provides explicit opt-in. When disabled, the extension is completely invisible — no namespace declarations, no additional elements, no attribute parsing.</w:t>
+            </w:r>
+          </w:p>
+        </w:tc>
+      </w:tr>
+      <w:tr>
+        <w:tc>
+          <w:tcPr>
+            <w:tcW w:w="4500" w:type="dxa"/>
+          </w:tcPr>
+          <w:p>
+            <w:r>
+              <w:t>completeLocation completeness definition: all non-null PIDF-LO civic address fields from the matched SSAP record</w:t>
+            </w:r>
+          </w:p>
+        </w:tc>
+        <w:tc>
+          <w:tcPr>
+            <w:tcW w:w="4500" w:type="dxa"/>
+          </w:tcPr>
+          <w:p>
+            <w:r>
+              <w:t xml:space="preserve">draft-ietf-ecrit-similar-location-19 §4 leaves the definition of “complete” to local policy. This implementation defines it normatively as all non-null PIDF-LO civic address fields present on the matched SSAP record, serialized in ELEMENT_HIERARCHY order. Unconstrained local policy risks inconsistent LIS record storage across deployments — different completeness definitions produce different address records stored in the LIS, with downstream consequences for CAD systems and other consumers that depend on consistent address representations. Defining completeness deterministically eliminates this ambiguity. Only PIDF-LO civic address fields are included; GIS-internal fields (geometry, NGUID, Agency_ID, etc.) are never emitted.</w:t>
             </w:r>
           </w:p>
         </w:tc>

</xml_diff>

<commit_message>
Added some additional regression tests and further alignment with standards
</commit_message>
<xml_diff>
--- a/LVF_Algorithm_Specification_current.docx
+++ b/LVF_Algorithm_Specification_current.docx
@@ -40,7 +40,7 @@
           <w:sz w:val="24"/>
           <w:szCs w:val="24"/>
         </w:rPr>
-        <w:t>Working Document — April 2026</w:t>
+        <w:t>Working Document — May 2026 | Version 27</w:t>
       </w:r>
     </w:p>
     <w:p/>
@@ -90,6 +90,12 @@
     <w:p>
       <w:r>
         <w:t>This document specifies a deterministic algorithm for Location Validation Function (LVF) evaluation of civic PIDF-LO addresses in NG9-1-1 systems. It is intended to provide the industry with a fully-specified, implementable reference that the current body of NENA standards and RFCs does not yet supply, and to inform future standards development by identifying and documenting the gaps this document fills. It draws on NENA-INF-027.1-2018 as its primary reference for LVF evaluation principles, and on NENA-STA-004.2-2024 and NENA-STA-006.3-2026 as authoritative sources for element definitions and GIS data model requirements.</w:t>
+      </w:r>
+    </w:p>
+    <w:p/>
+    <w:p>
+      <w:r>
+        <w:t>The need for this document is rooted in a structural gap. NENA-INF-027.1-2018, NENA-STA-004.2-2024, NENA-STA-006.3-2026, NENA-STA-010.3.1, RFC 5222, RFC 5139, and RFC 6848 collectively define the data model, the protocol, and the general principles of location validation — but the algorithmic decisions an implementer must make are scattered, implicit, or absent. INF-027 itself documents the LVF consistency problem but is outdated and stops short of defining the consistent behavior. Reasonable engineers reading the existing standards will produce divergent implementations, and that anticipated divergence was what motivated INF-027 in the first place. Without a fully-specified algorithm, “having an LVF” can mean materially different things in different deployments, and the protocol’s appearance of authoritative validation can mask underlying inconsistency between implementations.</w:t>
       </w:r>
     </w:p>
     <w:p/>
@@ -404,9 +410,7 @@
           </w:tcPr>
           <w:p>
             <w:r>
-              <w:t>Reference source for LVF evaluation logic, hierarchy principles, and unchecked element definitions. Where INF-</w:t>
-              <w:lastRenderedPageBreak/>
-              <w:t>027 conflicts with STA-004.2-2024 or STA-006.3-2026, the newer standard takes precedence.</w:t>
+              <w:t>Reference source for LVF evaluation logic, hierarchy principles, and unchecked element definitions. Where INF-027 conflicts with STA-004.2-2024 or STA-006.3-2026, the newer standard takes precedence.</w:t>
             </w:r>
           </w:p>
         </w:tc>
@@ -424,7 +428,6 @@
           </w:tcPr>
           <w:p>
             <w:r>
-              <w:lastRenderedPageBreak/>
               <w:t>NENA-STA-010.3.1-2026</w:t>
             </w:r>
           </w:p>
@@ -675,10 +678,21 @@
     <w:p/>
     <w:p>
       <w:r>
-        <w:t>FCC Report and Order 24-78 (July 2024) establishes a two-phased framework for the nationwide transition to NG9-1-1. A valid Phase 2 service request requires a 911 Authority to certify that its infrastructure includes access to a Location Validation Function. As time goes on, 911 Authorities may periodically need to transition between NG9-1-1 Core Services vendors. When a new NGCS vendor brings a different LVF implementation with materially different validation logic, every LIS operator in that jurisdiction is exposed to revalidation failures on previously clean data — not because the addresses are necessarily wrong, but because the logic changed. This document exists to prevent that outcome by providing a single, fully-specified algorithm that any LVF implementation can build against.</w:t>
-      </w:r>
-    </w:p>
-    <w:p/>
+        <w:t>FCC Report and Order 24-78 (July 2024) establishes a two-phased framework for the nationwide transition to NG9-1-1. A valid Phase 2 service request requires a 911 Authority to certify that its infrastructure includes access to a Location Validation Function. The certification framework presumes that “access to an LVF” is a meaningful and consistent capability, but without a specified algorithm that presumption is not supported by the underlying standards.</w:t>
+      </w:r>
+    </w:p>
+    <w:p/>
+    <w:p>
+      <w:r>
+        <w:t>Today, originating service providers (OSPs) validate customer addresses using the Master Street Address Guide (MSAG). The MSAG validation process, while operating on far fewer elements than CLDXF-US, is “mostly” algorithmically consistent between implementations.  However, underlying data within MSAGs is highly inconsistent, where the same physical road may appear as "CORD", "CO RD", "County Rd", or "County Road" depending on jurisdiction. The CLDXF-US data model and the GIS-based provisioning approach defined in NENA-STA-006.3 directly address that data normalization problem. The transition to NG9-1-1, however, introduces a new variable: the LVF's validation logic itself. If two LVFs apply different rules to identical GIS data, the consistency that CLDXF-US and STA-006.3 deliver at the data layer is undone at the evaluation layer.</w:t>
+      </w:r>
+    </w:p>
+    <w:p>
+      <w:r>
+        <w:lastRenderedPageBreak/>
+        <w:t>The broader concern is that the FCC's Phase 2 certification framework presumes that "access to a Location Validation Function" is a meaningful and consistent capability. That presumption is reasonable, the LVF is standardized at the protocol and data model level. What is not standardized is the evaluation logic: the algorithm an LVF applies when it decides whether an address is valid, invalid, or unchecked. Two LVF implementations can be fully compliant with every applicable NENA standard and RFC while producing materially different results for the same address and same GIS data. This document exists to close that gap.</w:t>
+      </w:r>
+    </w:p>
     <w:p>
       <w:pPr>
         <w:pStyle w:val="Heading2"/>
@@ -696,9 +710,7 @@
     <w:p/>
     <w:p>
       <w:r>
-        <w:t xml:space="preserve">The content of this document falls along a spectrum relative to existing standards. At one end are sections that clarify how existing normative requirements apply in practice — the element hierarchy, the Gate 1 minimum element set, the case-insensitive comparison rules. These are </w:t>
-        <w:lastRenderedPageBreak/>
-        <w:t>not departures from the standards; they are explicit statements of what the standards already require but do not say with sufficient precision for consistent implementation. In the middle are sections that formalize guidance the standards imply but do not fully specify — the progressive filter mechanics, the stop-on-first-invalid rule, the layer search order. These are grounded in INF-027 but go beyond what INF-027 itself specifies. At the far end are genuinely novel contributions where no current standard provides guidance — the civic coverage region derivation (§3.5), the mapping element selection logic (§7.5), and the HNO requirement at Gate 1. These sections are explicitly marked as recommended best practice.</w:t>
+        <w:t>The content of this document falls along a spectrum relative to existing standards. At one end are sections that clarify how existing normative requirements apply in practice — the element hierarchy, the Gate 1 minimum element set, the case-insensitive comparison rules. These are not departures from the standards; they are explicit statements of what the standards already require but do not say with sufficient precision for consistent implementation. In the middle are sections that formalize guidance the standards imply but do not fully specify — the progressive filter mechanics, the stop-on-first-invalid rule, the layer search order. These are grounded in INF-027 but go beyond what INF-027 itself specifies. At the far end are genuinely novel contributions where no current standard provides guidance — the civic coverage region derivation (§3.5), the mapping element selection logic (§7.5), and the HNO requirement at Gate 1. These sections are explicitly marked as recommended best practice.</w:t>
       </w:r>
     </w:p>
     <w:p/>
@@ -853,7 +865,9 @@
           </w:tcPr>
           <w:p>
             <w:r>
-              <w:t>RFC 5139 — base civic address elements</w:t>
+              <w:t xml:space="preserve">RFC 5139 — base civic </w:t>
+              <w:lastRenderedPageBreak/>
+              <w:t>address elements</w:t>
             </w:r>
           </w:p>
         </w:tc>
@@ -871,6 +885,7 @@
           </w:tcPr>
           <w:p>
             <w:r>
+              <w:lastRenderedPageBreak/>
               <w:t>cae:</w:t>
             </w:r>
           </w:p>
@@ -1019,7 +1034,6 @@
         <w:pStyle w:val="Heading1"/>
       </w:pPr>
       <w:r>
-        <w:lastRenderedPageBreak/>
         <w:t>2. Algorithm Overview</w:t>
       </w:r>
     </w:p>
@@ -1403,7 +1417,6 @@
         </w:numPr>
       </w:pPr>
       <w:r>
-        <w:lastRenderedPageBreak/>
         <w:t>No match found: the LVF has no provisioned boundary for this service URN and therefore cannot fulfill the request. Returns &lt;serviceNotImplemented&gt; (RFC 5222 §13.1) and terminates processing.</w:t>
       </w:r>
     </w:p>
@@ -1455,6 +1468,7 @@
     <w:p/>
     <w:p>
       <w:r>
+        <w:lastRenderedPageBreak/>
         <w:t>Gate 0 establishes a candidate service boundary that may fulfill this requirement. The &lt;mapping&gt; element is confirmed and assembled at response assembly time, once all gates have been processed and the full context of the response is known.</w:t>
       </w:r>
     </w:p>
@@ -1530,7 +1544,9 @@
     <w:p/>
     <w:p>
       <w:r>
-        <w:t>The civic coverage region is a lookup table mapping administrative address prefixes to service boundaries, structured per the RFC 5582 §4 civic coverage model. Each entry associates an admin tuple (country, A1, A2, and optionally A3–A5) with the service boundary that covers that administrative area. Entries support wildcard matching at the most specific level — for example, an entry for (US, ND, BURLEIGH COUNTY, *) covers all A3 values within Burleigh County not more specifically matched by a finer-grained entry. The table is queried using longest-prefix matching: the most specific matching entry wins. The civic coverage region serves two purposes: (1) at query time, it determines whether a zero-candidate result is within or outside the LVF's authoritative area; and (2) for non-conforming validation results, it provides a geographically grounded service boundary selection based on the elements that did validate, replacing the arbitrary fallback described in §9.</w:t>
+        <w:t xml:space="preserve">The civic coverage region is a lookup table mapping administrative address prefixes to service boundaries, structured per the RFC 5582 §4 civic coverage model. Each entry associates an </w:t>
+        <w:lastRenderedPageBreak/>
+        <w:t>admin tuple (country, A1, A2, and optionally A3–A5) with the service boundary that covers that administrative area. Entries support wildcard matching at the most specific level — for example, an entry for (US, ND, BURLEIGH COUNTY, *) covers all A3 values within Burleigh County not more specifically matched by a finer-grained entry. The table is queried using longest-prefix matching: the most specific matching entry wins. The civic coverage region serves two purposes: (1) at query time, it determines whether a zero-candidate result is within or outside the LVF's authoritative area; and (2) for non-conforming validation results, it provides a geographically grounded service boundary selection based on the elements that did validate, replacing the arbitrary fallback described in §9.</w:t>
       </w:r>
     </w:p>
     <w:p>
@@ -1565,7 +1581,9 @@
     <w:p/>
     <w:p>
       <w:r>
-        <w:t>The civic coverage region lookup table is used in two contexts. Coverage check: when the progressive filter yields zero candidates on all layers, the LVF looks up the submitted administrative elements using longest-prefix matching. If a match is found, the address is within the LVF's authoritative area (genuinely non-existent or unvalidatable address). If no match is found, the address is outside the LVF's coverage. Both return &lt;notFound&gt; in this version per §3.4. Non-conforming mapping selection: when the progressive filter produces a non-conforming result (stop-on-first-invalid), the validated admin elements are looked up in the coverage table using longest-prefix matching. The service boundary associated with the matching entry is used to populate the &lt;mapping&gt; element, replacing the arbitrary boundaries[0] fallback. This resolves the gap documented in §9 — a non-conforming result with validated country, A1, A2, A3 will return the correct jurisdictional boundary rather than an arbitrary one. Longest-prefix matching follows RFC 5582 §4: the most specific matching entry wins. A submitted address with country=US, A1=ND, A2=BURLEIGH COUNTY, A3=BISMARCK matches a specific (US, ND, BURLEIGH COUNTY, BISMARCK) entry if present, otherwise falls back to (US, ND, BURLEIGH COUNTY, *) if present, otherwise (US, ND, *) and so on up the hierarchy.</w:t>
+        <w:t xml:space="preserve">The civic coverage region lookup table is used in two contexts. Coverage check: when the progressive filter yields zero candidates on all layers, the LVF looks up the submitted administrative elements using longest-prefix matching. If a match is found, the address is within the LVF's authoritative area (genuinely non-existent or unvalidatable address). If no match is found, the address is outside the LVF's coverage. Both return &lt;notFound&gt; in this version per §3.4. Non-conforming mapping selection: when the progressive filter produces a non-conforming result (stop-on-first-invalid), the validated admin elements are looked up in the coverage table using longest-prefix matching. The service boundary associated with the </w:t>
+        <w:lastRenderedPageBreak/>
+        <w:t>matching entry is used to populate the &lt;mapping&gt; element, replacing the arbitrary boundaries[0] fallback. This resolves the gap documented in §9 — a non-conforming result with validated country, A1, A2, A3 will return the correct jurisdictional boundary rather than an arbitrary one. Longest-prefix matching follows RFC 5582 §4: the most specific matching entry wins. A submitted address with country=US, A1=ND, A2=BURLEIGH COUNTY, A3=BISMARCK matches a specific (US, ND, BURLEIGH COUNTY, BISMARCK) entry if present, otherwise falls back to (US, ND, BURLEIGH COUNTY, *) if present, otherwise (US, ND, *) and so on up the hierarchy.</w:t>
       </w:r>
     </w:p>
     <w:p/>
@@ -1586,7 +1604,7 @@
     <w:p/>
     <w:p>
       <w:r>
-        <w:t>The rebuilt civic coverage region is published upstream to the LVF tree via LoST-Sync &lt;pushMappings&gt; (RFC 6739; NENA-INF-009.1-2014 §3.4), alongside the geodetic coverage region defined in §3.6.</w:t>
+        <w:t>The rebuilt civic coverage region MUST be made available for publication upstream to the LVF tree via LoST-Sync &lt;pushMappings&gt; (RFC 6739; NENA-INF-009.1-2014 §3.4), alongside the geodetic coverage region defined in §3.6. The push mechanism itself is deferred pending the recursion and redirection work described in §10.2 — without a parent node in the LoST tree, there is no recipient for the push.</w:t>
       </w:r>
     </w:p>
     <w:p/>
@@ -1637,8 +1655,72 @@
     <w:p/>
     <w:p>
       <w:r>
-        <w:lastRenderedPageBreak/>
-        <w:t>The geodetic coverage region MUST be rebuilt whenever the set of provisioned service boundary polygons changes. Like the civic coverage region, the rebuilt geodetic coverage region replaces the prior version atomically and is published upstream promptly after rebuild.</w:t>
+        <w:t>The geodetic coverage region MUST be rebuilt whenever the set of provisioned service boundary polygons changes. Like the civic coverage region, the rebuilt geodetic coverage region replaces the prior version atomically and MUST be made available for publication upstream via LoST-Sync &lt;pushMappings&gt; (RFC 6739). The push mechanism is deferred pending the recursion and redirection work described in §10.2.</w:t>
+      </w:r>
+    </w:p>
+    <w:p/>
+    <w:p>
+      <w:pPr>
+        <w:pStyle w:val="Heading2"/>
+      </w:pPr>
+      <w:r>
+        <w:t>3.7 URN Alias Resolution</w:t>
+      </w:r>
+    </w:p>
+    <w:p>
+      <w:r>
+        <w:t>An LVF may be configured with one or more alias URNs that are treated as equivalent to urn:service:sos for all GIS layer matching and boundary selection. Aliases are configured via the LVF_URN_ALIASES environment variable as a comma-separated list. The primary alias is urn:emergency:service:sos.psap, which is the URN used by ESRPs within an ESInet when querying the LVF for internal routing decisions.</w:t>
+      </w:r>
+    </w:p>
+    <w:p>
+      <w:r>
+        <w:t>When a request arrives for an alias URN, the algorithm proceeds as follows:</w:t>
+      </w:r>
+    </w:p>
+    <w:p>
+      <w:pPr>
+        <w:pStyle w:val="ListParagraph"/>
+        <w:numPr>
+          <w:ilvl w:val="0"/>
+          <w:numId w:val="1"/>
+        </w:numPr>
+      </w:pPr>
+      <w:r>
+        <w:t>Gate 0 evaluates the request against the provisioned urn:service:sos boundary set rather than looking for a boundary whose ServiceURN matches the alias directly.</w:t>
+      </w:r>
+    </w:p>
+    <w:p>
+      <w:pPr>
+        <w:pStyle w:val="ListParagraph"/>
+        <w:numPr>
+          <w:ilvl w:val="0"/>
+          <w:numId w:val="1"/>
+        </w:numPr>
+      </w:pPr>
+      <w:r>
+        <w:t>Gates 1 and 2 proceed using the same SSAP and RCL layers as a urn:service:sos request.</w:t>
+      </w:r>
+    </w:p>
+    <w:p>
+      <w:pPr>
+        <w:pStyle w:val="ListParagraph"/>
+        <w:numPr>
+          <w:ilvl w:val="0"/>
+          <w:numId w:val="1"/>
+        </w:numPr>
+      </w:pPr>
+      <w:r>
+        <w:t>All &lt;mapping&gt; elements in the response MUST carry the URN from the incoming request — not the internally provisioned urn:service:sos. This preserves the client’s ability to round-trip the URN it sent, as required by RFC 5222.</w:t>
+      </w:r>
+    </w:p>
+    <w:p>
+      <w:r>
+        <w:t>The rationale for alias support is rooted in the i3 standard (NENA-STA-010): “All LVFs are provisioned with the same data, whether inside or outside an ESInet.” Because LVF provisioning does not vary by interface, a 911 Authority should only need to maintain a single PsapPolygon boundary layer. Without alias resolution, an ESInet element querying with urn:emergency:service:sos.psap would receive a &lt;serviceNotImplemented&gt; response from an LVF provisioned only for urn:service:sos, despite the GIS data being identical. Alias resolution eliminates this unnecessary provisioning burden while remaining fully consistent with the i3 data model.</w:t>
+      </w:r>
+    </w:p>
+    <w:p>
+      <w:r>
+        <w:t>Note: Alias resolution is a Gate 0 concern only. The alias URN is never used internally for GIS matching, coverage region derivation, or any other purpose — it is substituted back into the response at serialization time only.</w:t>
       </w:r>
     </w:p>
     <w:p/>
@@ -1902,7 +1984,9 @@
           </w:tcPr>
           <w:p>
             <w:r>
-              <w:t>STA-004.2 §3.1.4.7: 'Every civic location record MUST include the county or county-equivalent'</w:t>
+              <w:t xml:space="preserve">STA-004.2 §3.1.4.7: 'Every civic location record </w:t>
+              <w:lastRenderedPageBreak/>
+              <w:t>MUST include the county or county-equivalent'</w:t>
             </w:r>
           </w:p>
         </w:tc>
@@ -1920,6 +2004,7 @@
           </w:tcPr>
           <w:p>
             <w:r>
+              <w:lastRenderedPageBreak/>
               <w:t>ca:RD</w:t>
             </w:r>
           </w:p>
@@ -2198,7 +2283,6 @@
         </w:numPr>
       </w:pPr>
       <w:r>
-        <w:lastRenderedPageBreak/>
         <w:t>If the failing element is above ca:HNO in the hierarchy (country, A1–A5, or any street name element): the submitted address contains a structural mismatch against the provisioned GIS data. The SSAP terminal state is returned immediately as an &lt;invalid&gt; result. RCL is not consulted.</w:t>
       </w:r>
     </w:p>
@@ -2289,6 +2373,7 @@
         </w:numPr>
       </w:pPr>
       <w:r>
+        <w:lastRenderedPageBreak/>
         <w:t>If the element is ca:HNO and the active layer is RCL: apply the range, parity, and validation flag check (§5.6) rather than exact match</w:t>
       </w:r>
     </w:p>
@@ -2361,7 +2446,6 @@
     <w:p/>
     <w:p>
       <w:r>
-        <w:lastRenderedPageBreak/>
         <w:t>If all submitted elements have been processed and the candidate set contains exactly one record with no element having failed, the progressive filter is complete and the LVF proceeds to response assembly.</w:t>
       </w:r>
     </w:p>
@@ -2446,6 +2530,7 @@
           <w:sz w:val="20"/>
           <w:szCs w:val="20"/>
         </w:rPr>
+        <w:lastRenderedPageBreak/>
         <w:t>A &lt;notFound&gt; response means the LVF could not locate a matching record — either because the address does not exist in its data, or because this LVF is not authoritative for the submitted location. A non-conforming result (locationValidation with &lt;invalid&gt;) means the LVF evaluated the address and found a specific mismatch.</w:t>
       </w:r>
     </w:p>
@@ -2638,7 +2723,6 @@
           </w:tcPr>
           <w:p>
             <w:r>
-              <w:lastRenderedPageBreak/>
               <w:t>cdx2:HNC</w:t>
             </w:r>
           </w:p>
@@ -2831,6 +2915,7 @@
                 <w:b/>
                 <w:bCs/>
               </w:rPr>
+              <w:lastRenderedPageBreak/>
               <w:t>PIDF-LO Element</w:t>
             </w:r>
           </w:p>
@@ -3591,7 +3676,6 @@
           </w:tcPr>
           <w:p>
             <w:r>
-              <w:lastRenderedPageBreak/>
               <w:t>cae:PN</w:t>
             </w:r>
           </w:p>
@@ -3819,7 +3903,6 @@
         </w:numPr>
       </w:pPr>
       <w:r>
-        <w:lastRenderedPageBreak/>
         <w:t>Case-insensitive exact string match of submitted value against the STA-006.3 GIS field. Per STA-004.2 and STA-006.3 §3.5, systems MUST preserve case in stored data but comparisons MUST be case-insensitive.</w:t>
       </w:r>
     </w:p>
@@ -4389,7 +4472,6 @@
           </w:tcPr>
           <w:p>
             <w:r>
-              <w:lastRenderedPageBreak/>
               <w:t>4</w:t>
             </w:r>
           </w:p>
@@ -5136,7 +5218,9 @@
           </w:tcPr>
           <w:p>
             <w:r>
-              <w:t>Street Name Pre Type Separator</w:t>
+              <w:t xml:space="preserve">Street Name Pre </w:t>
+              <w:lastRenderedPageBreak/>
+              <w:t>Type Separator</w:t>
             </w:r>
           </w:p>
         </w:tc>
@@ -5152,6 +5236,7 @@
           </w:tcPr>
           <w:p>
             <w:r>
+              <w:lastRenderedPageBreak/>
               <w:t>St_PreSep</w:t>
             </w:r>
           </w:p>
@@ -5736,7 +5821,6 @@
           </w:tcPr>
           <w:p>
             <w:r>
-              <w:lastRenderedPageBreak/>
               <w:t>17</w:t>
             </w:r>
           </w:p>
@@ -6384,6 +6468,7 @@
           </w:tcPr>
           <w:p>
             <w:r>
+              <w:lastRenderedPageBreak/>
               <w:t>23</w:t>
             </w:r>
           </w:p>
@@ -7040,7 +7125,6 @@
           <w:sz w:val="20"/>
           <w:szCs w:val="20"/>
         </w:rPr>
-        <w:lastRenderedPageBreak/>
         <w:t>Ordering rationale for named location elements: INF-027 §2.5.3 includes several of these elements (BLD, FLR, UNIT, ROOM, SEAT) using CLDXF v1 names but does not cover the STA-004.2 additions: Site, SubSite, Wing, UNIT_PRETYPE, UNIT_VALUE, Section, Row, and Location Marker. Order for all elements is derived from the STA-004.2 §3.4.1 size hierarchy, which states that elements from Site through Room form a hierarchy from largest to smallest, with Section, Row, and Seat following. Location Marker is placed last as an alternative location identification method rather than a subdivision within the size hierarchy. This ordering is a documented assumption; a future revision of NENA-INF-027 should define it normatively..</w:t>
       </w:r>
     </w:p>
@@ -7374,6 +7458,7 @@
           </w:tcPr>
           <w:p>
             <w:r>
+              <w:lastRenderedPageBreak/>
               <w:t>33</w:t>
             </w:r>
           </w:p>
@@ -7859,7 +7944,7 @@
           <w:sz w:val="20"/>
           <w:szCs w:val="20"/>
         </w:rPr>
-        <w:t xml:space="preserve">The &lt;mapping&gt; element accompanying a non-conforming result is selected as follows. If the civic coverage region lookup (§3.5.2) on the validated admin elements resolves to a single unambiguous boundary, that boundary is used and no warning is emitted — the mapping is jurisdictionally grounded even though no GIS record was matched. If the lookup does not resolve to a single boundary (no match, or multiple candidates), the LVF constructs a synthetic default mapping from the LVF_DEFAULT_MAPPING_SOURCE_ID environment variable (§7.5) and emits a &lt;defaultMappingReturned&gt; warning (RFC 5222 §13.2) to signal that the mapping is present for protocol compliance only and carries no geographic authority. LIS clients MUST NOT use the &lt;mapping&gt; element for any provisioning decision when &lt;defaultMappingReturned&gt; is present alongside &lt;locationValidation&gt;.</w:t>
+        <w:t>The &lt;mapping&gt; element accompanying a non-conforming result is selected as follows. If the civic coverage region lookup (§3.5.2) on the validated admin elements resolves to a single unambiguous boundary, that boundary is used and no warning is emitted — the mapping is jurisdictionally grounded even though no GIS record was matched. If the lookup does not resolve to a single boundary (no match, or multiple candidates), the LVF constructs a synthetic default mapping from the LVF_DEFAULT_MAPPING_SOURCE_ID environment variable (§7.5) and emits a &lt;defaultMappingReturned&gt; warning (RFC 5222 §13.2) to signal that the mapping is present for protocol compliance only and carries no geographic authority. LIS clients MUST NOT use the &lt;mapping&gt; element for any provisioning decision when &lt;defaultMappingReturned&gt; is present alongside &lt;locationValidation&gt;.</w:t>
       </w:r>
     </w:p>
     <w:p/>
@@ -8185,7 +8270,7 @@
           <w:sz w:val="20"/>
           <w:szCs w:val="20"/>
         </w:rPr>
-        <w:t xml:space="preserve">A &lt;defaultMappingReturned&gt; warning (RFC 5222 §13.2) is emitted alongside a non-conforming &lt;locationValidation&gt; response when the civic coverage region lookup (§3.5.2) on the validated admin elements does not resolve to a single unambiguous boundary. This occurs when no admin elements validated before the stop (e.g., ca:country is the &lt;invalid&gt; element), or when the validated elements are insufficient to narrow the coverage region to a single boundary. When this warning is emitted, the accompanying &lt;mapping&gt; is a synthetic record constructed from the LVF_DEFAULT_MAPPING_SOURCE_ID environment variable (§7.5) with displayName “VALIDATION RESULT ONLY” — it is present solely for RFC 5222 protocol compliance and carries no geographic authority for the submitted address. The LVF will not start if LVF_DEFAULT_MAPPING_SOURCE_ID is not configured.</w:t>
+        <w:t>A &lt;defaultMappingReturned&gt; warning (RFC 5222 §13.2) is emitted alongside a non-conforming &lt;locationValidation&gt; response when the civic coverage region lookup (§3.5.2) on the validated admin elements does not resolve to a single unambiguous boundary. This occurs when no admin elements validated before the stop (e.g., ca:country is the &lt;invalid&gt; element), or when the validated elements are insufficient to narrow the coverage region to a single boundary. When this warning is emitted, the accompanying &lt;mapping&gt; is a synthetic record constructed from the LVF_DEFAULT_MAPPING_SOURCE_ID environment variable (§7.5) with displayName “VALIDATION RESULT ONLY” — it is present solely for RFC 5222 protocol compliance and carries no geographic authority for the submitted address. The LVF will not start if LVF_DEFAULT_MAPPING_SOURCE_ID is not configured.</w:t>
       </w:r>
     </w:p>
     <w:p/>
@@ -8213,12 +8298,12 @@
     <w:p/>
     <w:p>
       <w:r>
-        <w:t xml:space="preserve">When the progressive filter produces a non-conforming result (stop-on-first-invalid), no GIS record was matched and the point-in-polygon selection above is not applicable. Instead, the LVF performs a civic coverage region lookup (§3.5.2) using longest-prefix matching on the validated admin elements. If the lookup resolves to a single unambiguous boundary, that boundary is used to populate &lt;mapping&gt; — this is the normal case when at least country, A1, and A2 have validated, since by that point the LVF has sufficient geographic context to identify the correct jurisdiction. If the lookup does not resolve (no match, or multiple candidates), the LVF constructs a synthetic default mapping and emits &lt;defaultMappingReturned&gt; per §7.4. The synthetic mapping is constructed as follows: expires=“NO-EXPIRATION”; lastUpdated=server start time (UTC); source=LVF_SERVER_URI; sourceId=LVF_DEFAULT_MAPPING_SOURCE_ID; &lt;displayName xml:lang=“{LVF_DISPLAY_NAME_LANG}”&gt;VALIDATION RESULT ONLY&lt;/displayName&gt;; &lt;service&gt; carries the requested service URN. The &lt;uri&gt; and &lt;serviceNumber&gt; child elements are omitted. LVF_DEFAULT_MAPPING_SOURCE_ID is a fixed opaque token (e.g. a UUID) configured by the operator. The recommended value is {00000000-0000-0000-0000-000000000000} — an all-zeros UUID that serves as a recognizable sentinel distinguishing this synthetic record from any real provisioned boundary. The LVF MUST NOT start if LVF_DEFAULT_MAPPING_SOURCE_ID is not set.</w:t>
-      </w:r>
-    </w:p>
-    <w:p>
-      <w:r>
-        <w:t xml:space="preserve">Once the boundary is selected, the &lt;mapping&gt; element is constructed from STA-006.3 service boundary layer fields as follows. Required RFC 5222 attributes are populated from provisioned data with defined fallbacks: the expires attribute uses the boundary Expiration Date (Expire) field, defaulting to “NO-EXPIRATION” if absent; the lastUpdated attribute uses the Date Updated (DateUpdate) field, defaulting to the current UTC datetime if absent; the source attribute uses the Agency Identifier (Agency_ID) field, defaulting to the LVF_SERVER_URI environment variable; and the sourceId attribute uses the NENA Globally Unique ID (NGUID) field. Child elements are populated as follows: &lt;displayName xml:lang=“{LVF_DISPLAY_NAME_LANG}”&gt; uses the Display Name (DsplayName) field if present; &lt;service&gt; carries the ServiceURN; &lt;uri&gt; carries the Service URI (ServiceURI) if present; and &lt;serviceNumber&gt; carries the Service Number (ServiceNum) if present. The &lt;path&gt; element required by RFC 5222 commonResponsePattern is appended to every findServiceResponse containing a single &lt;via source=“{LVF_SERVER_URI}”/&gt; identifying this server. The source attribute on &lt;errors&gt; responses is also set to LVF_SERVER_URI. LVF_SERVER_URI is a U-NAPTR/DDDS application unique string in DNS name form (e.g. lostserver.example.com) per RFC 5222. LVF_DISPLAY_NAME_LANG is a BCP 47 language tag (default: en).</w:t>
+        <w:t>When the progressive filter produces a non-conforming result (stop-on-first-invalid), no GIS record was matched and the point-in-polygon selection above is not applicable. Instead, the LVF performs a civic coverage region lookup (§3.5.2) using longest-prefix matching on the validated admin elements. If the lookup resolves to a single unambiguous boundary, that boundary is used to populate &lt;mapping&gt; — this is the normal case when at least country, A1, and A2 have validated, since by that point the LVF has sufficient geographic context to identify the correct jurisdiction. If the lookup does not resolve (no match, or multiple candidates), the LVF constructs a synthetic default mapping and emits &lt;defaultMappingReturned&gt; per §7.4. The synthetic mapping is constructed as follows: expires=“NO-EXPIRATION”; lastUpdated=server start time (UTC); source=LVF_SERVER_URI; sourceId=LVF_DEFAULT_MAPPING_SOURCE_ID; &lt;displayName xml:lang=“{LVF_DISPLAY_NAME_LANG}”&gt;VALIDATION RESULT ONLY&lt;/displayName&gt;; &lt;service&gt; carries the requested service URN. The &lt;uri&gt; and &lt;serviceNumber&gt; child elements are omitted. LVF_DEFAULT_MAPPING_SOURCE_ID is a fixed opaque token (e.g. a UUID) configured by the operator. The recommended value is {00000000-0000-0000-0000-000000000000} — an all-zeros UUID that serves as a recognizable sentinel distinguishing this synthetic record from any real provisioned boundary. The LVF MUST NOT start if LVF_DEFAULT_MAPPING_SOURCE_ID is not set.</w:t>
+      </w:r>
+    </w:p>
+    <w:p>
+      <w:r>
+        <w:t>Once the boundary is selected, the &lt;mapping&gt; element is constructed from STA-006.3 service boundary layer fields as follows. Required RFC 5222 attributes are populated as follows: the expires attribute uses the boundary Expiration Date (Expire) field, defaulting to “NO-EXPIRATION” if absent; the lastUpdated attribute uses the Date Updated (DateUpdate) field, defaulting to the current UTC datetime if absent; the source attribute is always set to LVF_SERVER_URI — per RFC 5222 §5.1, source identifies the authoritative generator of the mapping (i.e., this LVF server), not the agency whose boundary is being described; and the sourceId attribute uses the NENA Globally Unique ID (NGUID) field, which is a required field per STA-006.3 Table 15-31 and must be present on all provisioned boundaries. Child elements are populated as follows: &lt;displayName xml:lang=“{LVF_DISPLAY_NAME_LANG}”&gt; uses the Display Name (DsplayName) field if present; &lt;service&gt; carries the ServiceURN; &lt;uri&gt; carries the Service URI (ServiceURI) if present; and &lt;serviceNumber&gt; carries the Service Number (ServiceNum) if present. The &lt;path&gt; element required by RFC 5222 commonResponsePattern is appended to every findServiceResponse containing a single &lt;via source=“{LVF_SERVER_URI}”/&gt; identifying this server. The source attribute on &lt;errors&gt; responses is also set to LVF_SERVER_URI. LVF_SERVER_URI is a U-NAPTR/DDDS application unique string in DNS name form (e.g. lostserver.example.com) per RFC 5222. LVF_DISPLAY_NAME_LANG is a BCP 47 language tag (default: en).</w:t>
       </w:r>
     </w:p>
     <w:p/>
@@ -8233,6 +8318,7 @@
           <w:sz w:val="20"/>
           <w:szCs w:val="20"/>
         </w:rPr>
+        <w:lastRenderedPageBreak/>
         <w:t>This is the only use of geometry in this algorithm. It occurs at response assembly only and has no bearing on the validation decision.</w:t>
       </w:r>
     </w:p>
@@ -8310,7 +8396,17 @@
           <w:sz w:val="18"/>
           <w:szCs w:val="18"/>
         </w:rPr>
-        <w:t xml:space="preserve">  IF no provisioned service boundary ServiceURN matches request URN → return &lt;serviceNotImplemented&gt;</w:t>
+        <w:t xml:space="preserve">  IF request URN is in LVF_URN_ALIASES → resolve to urn:service:sos for all GIS matching; retain original URN for response serialization</w:t>
+      </w:r>
+    </w:p>
+    <w:p>
+      <w:r>
+        <w:rPr>
+          <w:rFonts w:ascii="Courier New" w:eastAsia="Courier New" w:hAnsi="Courier New" w:cs="Courier New"/>
+          <w:sz w:val="18"/>
+          <w:szCs w:val="18"/>
+        </w:rPr>
+        <w:t xml:space="preserve">  IF no provisioned service boundary ServiceURN matches request URN (or resolved alias) → return &lt;serviceNotImplemented&gt;</w:t>
       </w:r>
     </w:p>
     <w:p>
@@ -8422,7 +8518,6 @@
           <w:sz w:val="18"/>
           <w:szCs w:val="18"/>
         </w:rPr>
-        <w:lastRenderedPageBreak/>
         <w:t xml:space="preserve">    unchecked_list += pre-defined unchecked elements (§5.5.1) that were submitted</w:t>
       </w:r>
     </w:p>
@@ -8553,6 +8648,7 @@
           <w:sz w:val="18"/>
           <w:szCs w:val="18"/>
         </w:rPr>
+        <w:lastRenderedPageBreak/>
         <w:t xml:space="preserve">          (case-insensitive; for RCL use side-specific field where applicable)</w:t>
       </w:r>
     </w:p>
@@ -8912,8 +9008,110 @@
           </w:tcPr>
           <w:p>
             <w:r>
+              <w:t>INF-027 minimum element set outdated</w:t>
+            </w:r>
+          </w:p>
+        </w:tc>
+        <w:tc>
+          <w:tcPr>
+            <w:tcW w:w="3108" w:type="dxa"/>
+            <w:tcBorders>
+              <w:top w:val="single" w:sz="2" w:space="0" w:color="CCCCCC"/>
+              <w:left w:val="single" w:sz="2" w:space="0" w:color="CCCCCC"/>
+              <w:bottom w:val="single" w:sz="2" w:space="0" w:color="CCCCCC"/>
+              <w:right w:val="single" w:sz="2" w:space="0" w:color="CCCCCC"/>
+            </w:tcBorders>
+          </w:tcPr>
+          <w:p>
+            <w:r>
+              <w:t>INF-027 §2.5.10 references LMK/LMKP which are retired in STA-004.2. Minimum set should reference Site/Structure/Location Marker as alternatives to RD</w:t>
+            </w:r>
+          </w:p>
+        </w:tc>
+        <w:tc>
+          <w:tcPr>
+            <w:tcW w:w="3145" w:type="dxa"/>
+            <w:tcBorders>
+              <w:top w:val="single" w:sz="2" w:space="0" w:color="CCCCCC"/>
+              <w:left w:val="single" w:sz="2" w:space="0" w:color="CCCCCC"/>
+              <w:bottom w:val="single" w:sz="2" w:space="0" w:color="CCCCCC"/>
+              <w:right w:val="single" w:sz="2" w:space="0" w:color="CCCCCC"/>
+            </w:tcBorders>
+          </w:tcPr>
+          <w:p>
+            <w:r>
+              <w:t>Update INF-027 §2.5.10 to reference current STA-004.2 element names</w:t>
+            </w:r>
+          </w:p>
+        </w:tc>
+      </w:tr>
+      <w:tr>
+        <w:tc>
+          <w:tcPr>
+            <w:tcW w:w="3107" w:type="dxa"/>
+            <w:tcBorders>
+              <w:top w:val="single" w:sz="2" w:space="0" w:color="CCCCCC"/>
+              <w:left w:val="single" w:sz="2" w:space="0" w:color="CCCCCC"/>
+              <w:bottom w:val="single" w:sz="2" w:space="0" w:color="CCCCCC"/>
+              <w:right w:val="single" w:sz="2" w:space="0" w:color="CCCCCC"/>
+            </w:tcBorders>
+          </w:tcPr>
+          <w:p>
+            <w:r>
+              <w:t>Named location element evaluation order</w:t>
+            </w:r>
+          </w:p>
+        </w:tc>
+        <w:tc>
+          <w:tcPr>
+            <w:tcW w:w="3108" w:type="dxa"/>
+            <w:tcBorders>
+              <w:top w:val="single" w:sz="2" w:space="0" w:color="CCCCCC"/>
+              <w:left w:val="single" w:sz="2" w:space="0" w:color="CCCCCC"/>
+              <w:bottom w:val="single" w:sz="2" w:space="0" w:color="CCCCCC"/>
+              <w:right w:val="single" w:sz="2" w:space="0" w:color="CCCCCC"/>
+            </w:tcBorders>
+          </w:tcPr>
+          <w:p>
+            <w:r>
+              <w:t xml:space="preserve">This algorithm uses STA-004.2 §3.4.1 size hierarchy for ordering named location elements (positions 19–30). This is a documented </w:t>
               <w:lastRenderedPageBreak/>
-              <w:t>INF-027 minimum element set outdated</w:t>
+              <w:t>assumption, not a normative requirement</w:t>
+            </w:r>
+          </w:p>
+        </w:tc>
+        <w:tc>
+          <w:tcPr>
+            <w:tcW w:w="3145" w:type="dxa"/>
+            <w:tcBorders>
+              <w:top w:val="single" w:sz="2" w:space="0" w:color="CCCCCC"/>
+              <w:left w:val="single" w:sz="2" w:space="0" w:color="CCCCCC"/>
+              <w:bottom w:val="single" w:sz="2" w:space="0" w:color="CCCCCC"/>
+              <w:right w:val="single" w:sz="2" w:space="0" w:color="CCCCCC"/>
+            </w:tcBorders>
+          </w:tcPr>
+          <w:p>
+            <w:r>
+              <w:lastRenderedPageBreak/>
+              <w:t>INF-027 revision should explicitly define normative evaluation order for all STA-004.2 elements</w:t>
+            </w:r>
+          </w:p>
+        </w:tc>
+      </w:tr>
+      <w:tr>
+        <w:tc>
+          <w:tcPr>
+            <w:tcW w:w="3107" w:type="dxa"/>
+            <w:tcBorders>
+              <w:top w:val="single" w:sz="2" w:space="0" w:color="CCCCCC"/>
+              <w:left w:val="single" w:sz="2" w:space="0" w:color="CCCCCC"/>
+              <w:bottom w:val="single" w:sz="2" w:space="0" w:color="CCCCCC"/>
+              <w:right w:val="single" w:sz="2" w:space="0" w:color="CCCCCC"/>
+            </w:tcBorders>
+          </w:tcPr>
+          <w:p>
+            <w:r>
+              <w:t>Floor Index has no PIDF-LO element</w:t>
             </w:r>
           </w:p>
         </w:tc>
@@ -8929,7 +9127,7 @@
           </w:tcPr>
           <w:p>
             <w:r>
-              <w:t>INF-027 §2.5.10 references LMK/LMKP which are retired in STA-004.2. Minimum set should reference Site/Structure/Location Marker as alternatives to RD</w:t>
+              <w:t>STA-006.3 defines FloorIndex as a GIS field (INTEGER) but STA-004.2 has no corresponding PIDF-LO element. The relationship between ca:FLR (Floor Label, text) and FloorIndex (integer sort key) is undefined for validation purposes</w:t>
             </w:r>
           </w:p>
         </w:tc>
@@ -8945,7 +9143,7 @@
           </w:tcPr>
           <w:p>
             <w:r>
-              <w:t>Update INF-027 §2.5.10 to reference current STA-004.2 element names</w:t>
+              <w:t>Future STA-004.2 revision should clarify whether Floor Index is evaluable or GIS-only, and if evaluable, define the corresponding PIDF-LO element</w:t>
             </w:r>
           </w:p>
         </w:tc>
@@ -8963,7 +9161,7 @@
           </w:tcPr>
           <w:p>
             <w:r>
-              <w:t>Named location element evaluation order</w:t>
+              <w:t>SiteStructureAddressPolygon not provisioned to LVF</w:t>
             </w:r>
           </w:p>
         </w:tc>
@@ -8979,7 +9177,7 @@
           </w:tcPr>
           <w:p>
             <w:r>
-              <w:t>This algorithm uses STA-004.2 §3.4.1 size hierarchy for ordering named location elements (positions 19–30). This is a documented assumption, not a normative requirement</w:t>
+              <w:t>STA-006.3 classifies SiteStructureAddressPolygon as Recommended and assigns it to MDS only — it is not provisioned to the LVF or ECRF. Given that polygon extent is geometrically more precise than a point, this classification warrants reconsideration</w:t>
             </w:r>
           </w:p>
         </w:tc>
@@ -8995,7 +9193,7 @@
           </w:tcPr>
           <w:p>
             <w:r>
-              <w:t>INF-027 revision should explicitly define normative evaluation order for all STA-004.2 elements</w:t>
+              <w:t>Future STA-006.3 revision should consider elevating SiteStructureAddressPolygon for LVF provisioning and defining its position in the layer search order</w:t>
             </w:r>
           </w:p>
         </w:tc>
@@ -9013,7 +9211,7 @@
           </w:tcPr>
           <w:p>
             <w:r>
-              <w:t>Floor Index has no PIDF-LO element</w:t>
+              <w:t>A3 conditionality vs Gate 1 requirement</w:t>
             </w:r>
           </w:p>
         </w:tc>
@@ -9029,7 +9227,7 @@
           </w:tcPr>
           <w:p>
             <w:r>
-              <w:t>STA-006.3 defines FloorIndex as a GIS field (INTEGER) but STA-004.2 has no corresponding PIDF-LO element. The relationship between ca:FLR (Floor Label, text) and FloorIndex (integer sort key) is undefined for validation purposes</w:t>
+              <w:t>STA-004.2 §3.1.5.7 makes A3 conditional (required only if within an incorporated municipality). INF-027 §2.5.10 includes A3 in the minimum element set unconditionally. This algorithm aligns with STA-004.2’s conditional requirement, departing from INF-027.</w:t>
             </w:r>
           </w:p>
         </w:tc>
@@ -9045,7 +9243,7 @@
           </w:tcPr>
           <w:p>
             <w:r>
-              <w:t>Future STA-004.2 revision should clarify whether Floor Index is evaluable or GIS-only, and if evaluable, define the corresponding PIDF-LO element</w:t>
+              <w:t>Future standards revision should harmonize these two requirements</w:t>
             </w:r>
           </w:p>
         </w:tc>
@@ -9063,7 +9261,7 @@
           </w:tcPr>
           <w:p>
             <w:r>
-              <w:t>SiteStructureAddressPolygon not provisioned to LVF</w:t>
+              <w:t>No RFC 5222 error for ambiguous candidate sets</w:t>
             </w:r>
           </w:p>
         </w:tc>
@@ -9079,7 +9277,7 @@
           </w:tcPr>
           <w:p>
             <w:r>
-              <w:t>STA-006.3 classifies SiteStructureAddressPolygon as Recommended and assigns it to MDS only — it is not provisioned to the LVF or ECRF. Given that polygon extent is geometrically more precise than a point, this classification warrants reconsideration</w:t>
+              <w:t>RFC 5222 defines no specific error for the condition where the progressive filter yields 2+ candidates and cannot determine a single authoritative record. This algorithm uses &lt;notFound&gt; as the closest applicable error</w:t>
             </w:r>
           </w:p>
         </w:tc>
@@ -9095,7 +9293,7 @@
           </w:tcPr>
           <w:p>
             <w:r>
-              <w:t>Future STA-006.3 revision should consider elevating SiteStructureAddressPolygon for LVF provisioning and defining its position in the layer search order</w:t>
+              <w:t>A future NENA profile of RFC 5222 should define a more specific response for ambiguous candidate set conditions</w:t>
             </w:r>
           </w:p>
         </w:tc>
@@ -9113,7 +9311,7 @@
           </w:tcPr>
           <w:p>
             <w:r>
-              <w:t>A3 conditionality vs Gate 1 requirement</w:t>
+              <w:t>No RFC 5222 warning for validation observations</w:t>
             </w:r>
           </w:p>
         </w:tc>
@@ -9129,7 +9327,9 @@
           </w:tcPr>
           <w:p>
             <w:r>
-              <w:t>STA-004.2 §3.1.5.7 makes A3 conditional (required only if within an incorporated municipality). INF-027 §2.5.10 includes A3 in the minimum element set unconditionally. This algorithm aligns with STA-004.2’s conditional requirement, departing from INF-027.</w:t>
+              <w:t>RFC 5222 §13.2 defines only locationValidationUnavailabl</w:t>
+              <w:lastRenderedPageBreak/>
+              <w:t>e as a validation warning. There is no general-purpose mechanism for the LVF to signal data quality observations that do not affect conformance but are useful to the client — for example, a submitted value of 'MCDONALD' that matches a GIS record value of 'McDonald' is conforming per §5.7 but represents a casing discrepancy the client should correct. See also §10.2 Similar Location extension.</w:t>
             </w:r>
           </w:p>
         </w:tc>
@@ -9145,7 +9345,10 @@
           </w:tcPr>
           <w:p>
             <w:r>
-              <w:t>Future standards revision should harmonize these two requirements</w:t>
+              <w:lastRenderedPageBreak/>
+              <w:t xml:space="preserve">A future NENA profile of RFC 5222 should define a </w:t>
+              <w:lastRenderedPageBreak/>
+              <w:t>locationValidationObservation warning (or equivalent) to allow the LVF to communicate data quality findings alongside a conforming result</w:t>
             </w:r>
           </w:p>
         </w:tc>
@@ -9163,9 +9366,8 @@
           </w:tcPr>
           <w:p>
             <w:r>
-              <w:t xml:space="preserve">No RFC 5222 error for </w:t>
               <w:lastRenderedPageBreak/>
-              <w:t>ambiguous candidate sets</w:t>
+              <w:t>INF-027 field mapping guidance superseded</w:t>
             </w:r>
           </w:p>
         </w:tc>
@@ -9181,10 +9383,112 @@
           </w:tcPr>
           <w:p>
             <w:r>
+              <w:t>INF-027 §2.5 references administrator-configured field mappings between PIDF-LO elements and GIS attributes. STA-006.3 §3.4 mandates standardized field names for all SI-provisioned data, making this guidance unnecessary</w:t>
+            </w:r>
+          </w:p>
+        </w:tc>
+        <w:tc>
+          <w:tcPr>
+            <w:tcW w:w="3145" w:type="dxa"/>
+            <w:tcBorders>
+              <w:top w:val="single" w:sz="2" w:space="0" w:color="CCCCCC"/>
+              <w:left w:val="single" w:sz="2" w:space="0" w:color="CCCCCC"/>
+              <w:bottom w:val="single" w:sz="2" w:space="0" w:color="CCCCCC"/>
+              <w:right w:val="single" w:sz="2" w:space="0" w:color="CCCCCC"/>
+            </w:tcBorders>
+          </w:tcPr>
+          <w:p>
+            <w:r>
+              <w:t>Future INF-027 revision should remove or update field mapping guidance to reference STA-006.3 standardized field names</w:t>
+            </w:r>
+          </w:p>
+        </w:tc>
+      </w:tr>
+      <w:tr>
+        <w:tc>
+          <w:tcPr>
+            <w:tcW w:w="3107" w:type="dxa"/>
+            <w:tcBorders>
+              <w:top w:val="single" w:sz="2" w:space="0" w:color="CCCCCC"/>
+              <w:left w:val="single" w:sz="2" w:space="0" w:color="CCCCCC"/>
+              <w:bottom w:val="single" w:sz="2" w:space="0" w:color="CCCCCC"/>
+              <w:right w:val="single" w:sz="2" w:space="0" w:color="CCCCCC"/>
+            </w:tcBorders>
+          </w:tcPr>
+          <w:p>
+            <w:r>
+              <w:t>Civic coverage region derivation not specified</w:t>
+            </w:r>
+          </w:p>
+        </w:tc>
+        <w:tc>
+          <w:tcPr>
+            <w:tcW w:w="3108" w:type="dxa"/>
+            <w:tcBorders>
+              <w:top w:val="single" w:sz="2" w:space="0" w:color="CCCCCC"/>
+              <w:left w:val="single" w:sz="2" w:space="0" w:color="CCCCCC"/>
+              <w:bottom w:val="single" w:sz="2" w:space="0" w:color="CCCCCC"/>
+              <w:right w:val="single" w:sz="2" w:space="0" w:color="CCCCCC"/>
+            </w:tcBorders>
+          </w:tcPr>
+          <w:p>
+            <w:r>
+              <w:t>The standards require LVFs to publish their coverage regions (NENA-STA-010; NENA-INF-009.1-2014 §3.4) and use those regions to distinguish out-of-coverage notFound from in-coverage notFound. However, no standard specifies how an LVF should derive its civic coverage region from its provisioned RCL data, at what administrative granularity (A1–A5) it should be expressed, or how it should be kept synchronized with the GIS data received via the SI. A recommended best practice approach is defined in §3.5.</w:t>
+            </w:r>
+          </w:p>
+        </w:tc>
+        <w:tc>
+          <w:tcPr>
+            <w:tcW w:w="3145" w:type="dxa"/>
+            <w:tcBorders>
+              <w:top w:val="single" w:sz="2" w:space="0" w:color="CCCCCC"/>
+              <w:left w:val="single" w:sz="2" w:space="0" w:color="CCCCCC"/>
+              <w:bottom w:val="single" w:sz="2" w:space="0" w:color="CCCCCC"/>
+              <w:right w:val="single" w:sz="2" w:space="0" w:color="CCCCCC"/>
+            </w:tcBorders>
+          </w:tcPr>
+          <w:p>
+            <w:r>
+              <w:t>A future revision of NENA-INF-027 or NENA-STA-010 should formally standardize the mechanism defined in §3.5 for deriving and maintaining LVF civic coverage regions from provisioned RCL data</w:t>
+            </w:r>
+          </w:p>
+        </w:tc>
+      </w:tr>
+      <w:tr>
+        <w:tc>
+          <w:tcPr>
+            <w:tcW w:w="3107" w:type="dxa"/>
+            <w:tcBorders>
+              <w:top w:val="single" w:sz="2" w:space="0" w:color="CCCCCC"/>
+              <w:left w:val="single" w:sz="2" w:space="0" w:color="CCCCCC"/>
+              <w:bottom w:val="single" w:sz="2" w:space="0" w:color="CCCCCC"/>
+              <w:right w:val="single" w:sz="2" w:space="0" w:color="CCCCCC"/>
+            </w:tcBorders>
+          </w:tcPr>
+          <w:p>
+            <w:r>
+              <w:t xml:space="preserve">Authoritativeness check </w:t>
               <w:lastRenderedPageBreak/>
-              <w:t xml:space="preserve">RFC 5222 defines no </w:t>
+              <w:t>mechanism not standardized</w:t>
+            </w:r>
+          </w:p>
+        </w:tc>
+        <w:tc>
+          <w:tcPr>
+            <w:tcW w:w="3108" w:type="dxa"/>
+            <w:tcBorders>
+              <w:top w:val="single" w:sz="2" w:space="0" w:color="CCCCCC"/>
+              <w:left w:val="single" w:sz="2" w:space="0" w:color="CCCCCC"/>
+              <w:bottom w:val="single" w:sz="2" w:space="0" w:color="CCCCCC"/>
+              <w:right w:val="single" w:sz="2" w:space="0" w:color="CCCCCC"/>
+            </w:tcBorders>
+          </w:tcPr>
+          <w:p>
+            <w:r>
               <w:lastRenderedPageBreak/>
-              <w:t>specific error for the condition where the progressive filter yields 2+ candidates and cannot determine a single authoritative record. This algorithm uses &lt;notFound&gt; as the closest applicable error</w:t>
+              <w:t>This algorithm uses point-in-</w:t>
+              <w:lastRenderedPageBreak/>
+              <w:t>polygon filtering of RCL sides against provisioned service boundaries (§3.5) as the mechanism for determining LVF authoritativeness. This connection is not made explicitly in any current standard.</w:t>
             </w:r>
           </w:p>
         </w:tc>
@@ -9201,9 +9505,9 @@
           <w:p>
             <w:r>
               <w:lastRenderedPageBreak/>
-              <w:t xml:space="preserve">A future NENA profile of RFC </w:t>
+              <w:t>A future revision of NENA-</w:t>
               <w:lastRenderedPageBreak/>
-              <w:t>5222 should define a more specific response for ambiguous candidate set conditions</w:t>
+              <w:t>INF-027 should explicitly specify the use of service boundary point-in-polygon filtering for LVF authoritativeness determination and civic coverage region derivation</w:t>
             </w:r>
           </w:p>
         </w:tc>
@@ -9222,7 +9526,7 @@
           <w:p>
             <w:r>
               <w:lastRenderedPageBreak/>
-              <w:t>No RFC 5222 warning for validation observations</w:t>
+              <w:t>STA-010 Forest Guide provisioning requirement too narrow</w:t>
             </w:r>
           </w:p>
         </w:tc>
@@ -9238,7 +9542,7 @@
           </w:tcPr>
           <w:p>
             <w:r>
-              <w:t>RFC 5222 §13.2 defines only locationValidationUnavailable as a validation warning. There is no general-purpose mechanism for the LVF to signal data quality observations that do not affect conformance but are useful to the client — for example, a submitted value of 'MCDONALD' that matches a GIS record value of 'McDonald' is conforming per §5.7 but represents a casing discrepancy the client should correct. See also §10.2 Similar Location extension.</w:t>
+              <w:t>NENA-STA-010 states “State ECRF and LVF operators SHALL arrange for their coverage regions to be provisioned in a Forest Guide.” This does not address sub-state LVF operators (county, regional, municipal) who may need to provision the Forest Guide directly when no state-level aggregator exists above them. NENA-INF-009.1-2014 acknowledges that regional deployments may not align with state boundaries, but STA-010 has not been updated to reflect this.</w:t>
             </w:r>
           </w:p>
         </w:tc>
@@ -9254,7 +9558,7 @@
           </w:tcPr>
           <w:p>
             <w:r>
-              <w:t>A future NENA profile of RFC 5222 should define a locationValidationObservation warning (or equivalent) to allow the LVF to communicate data quality findings alongside a conforming result</w:t>
+              <w:t>STA-010 should be updated to explicitly require all LVF operators — regardless of administrative level — to provision their coverage regions to the Forest Guide, either directly or through a parent node</w:t>
             </w:r>
           </w:p>
         </w:tc>
@@ -9272,7 +9576,7 @@
           </w:tcPr>
           <w:p>
             <w:r>
-              <w:t>INF-027 field mapping guidance superseded</w:t>
+              <w:t>SSAP layer absence not addressed in standards</w:t>
             </w:r>
           </w:p>
         </w:tc>
@@ -9288,7 +9592,7 @@
           </w:tcPr>
           <w:p>
             <w:r>
-              <w:t>INF-027 §2.5 references administrator-configured field mappings between PIDF-LO elements and GIS attributes. STA-006.3 §3.4 mandates standardized field names for all SI-provisioned data, making this guidance unnecessary</w:t>
+              <w:t>STA-006.3 classifies SSAP as a Required layer, but neither STA-006.3 nor STA-010 specifies how an LVF should behave when SSAP is absent or empty. INF-027 §2.5.4 uses “if available” language suggesting SSAP absence is a recognized real-world condition. This algorithm treats SSAP absence as a graceful fallback to RCL-only operation (§5.1), but this behavior is not standardized.</w:t>
             </w:r>
           </w:p>
         </w:tc>
@@ -9304,7 +9608,7 @@
           </w:tcPr>
           <w:p>
             <w:r>
-              <w:t>Future INF-027 revision should remove or update field mapping guidance to reference STA-006.3 standardized field names</w:t>
+              <w:t>STA-006.3 and STA-010 should provide explicit guidance on minimum viable LVF provisioning states, including the expected behavior when the SSAP layer is absent or incomplete</w:t>
             </w:r>
           </w:p>
         </w:tc>
@@ -9322,7 +9626,7 @@
           </w:tcPr>
           <w:p>
             <w:r>
-              <w:t>Civic coverage region derivation not specified</w:t>
+              <w:t>cae:PN namespace conflict between RFC 6848 and STA-004.2</w:t>
             </w:r>
           </w:p>
         </w:tc>
@@ -9338,9 +9642,9 @@
           </w:tcPr>
           <w:p>
             <w:r>
-              <w:t xml:space="preserve">The standards require LVFs to publish their coverage regions (NENA-STA-010; NENA-INF-009.1-2014 §3.4) and use those regions to distinguish out-of-coverage notFound from in-coverage notFound. However, no standard specifies how an LVF should derive its civic </w:t>
+              <w:t xml:space="preserve">RFC 6848 defines cae:PN as “Post Number” (lamp post or utility pole identifier). STA-004.2 §3.4.15 repurposes cae:PN as “Location Marker” </w:t>
               <w:lastRenderedPageBreak/>
-              <w:t>coverage region from its provisioned RCL data, at what administrative granularity (A1–A5) it should be expressed, or how it should be kept synchronized with the GIS data received via the SI. A recommended best practice approach is defined in §3.5.</w:t>
+              <w:t>with a broader definition. INF-027.1-2018 excludes PN entirely (“Post (Pole) Number: Not used in NG9-1-1 CLDXF”) but predates STA-004.2’s repurposing. This creates ambiguity for implementers reading across these documents.</w:t>
             </w:r>
           </w:p>
         </w:tc>
@@ -9357,7 +9661,9 @@
           <w:p>
             <w:r>
               <w:lastRenderedPageBreak/>
-              <w:t>A future revision of NENA-INF-027 or NENA-STA-010 should formally standardize the mechanism defined in §3.5 for deriving and maintaining LVF civic coverage regions from provisioned RCL data</w:t>
+              <w:t xml:space="preserve">A future INF-027 revision should explicitly acknowledge STA-004.2’s repurposing of cae:PN as Location Marker and remove or update the </w:t>
+              <w:lastRenderedPageBreak/>
+              <w:t>existing exclusion of PN</w:t>
             </w:r>
           </w:p>
         </w:tc>
@@ -9375,7 +9681,8 @@
           </w:tcPr>
           <w:p>
             <w:r>
-              <w:t>Authoritativeness check mechanism not standardized</w:t>
+              <w:lastRenderedPageBreak/>
+              <w:t>Recursion and redirection out of scope for this version</w:t>
             </w:r>
           </w:p>
         </w:tc>
@@ -9391,7 +9698,7 @@
           </w:tcPr>
           <w:p>
             <w:r>
-              <w:t>This algorithm uses point-in-polygon filtering of RCL sides against provisioned service boundaries (§3.5) as the mechanism for determining LVF authoritativeness. This connection is not made explicitly in any current standard.</w:t>
+              <w:t>This document is scoped to leaf node LVF behavior. RFC 5222 and NENA-STA-010 define recursion and redirection, but consistent implementation depends on LoST tree connectivity and a functioning National Forest Guide — neither of which can be assumed in current Phase 2 deployments. Intra-tree recursion MAY be available where parent-child connectivity exists, but cross-tree resolution requires the Forest Guide. This algorithm returns &lt;notFound&gt; for all zero-candidate results regardless of whether the location is within or outside the LVF’s coverage region. The coverage region distinction is preserved for diagnostic purposes and to enable correct implementation in a future version.</w:t>
             </w:r>
           </w:p>
         </w:tc>
@@ -9407,7 +9714,7 @@
           </w:tcPr>
           <w:p>
             <w:r>
-              <w:t>A future revision of NENA-INF-027 should explicitly specify the use of service boundary point-in-polygon filtering for LVF authoritativeness determination and civic coverage region derivation</w:t>
+              <w:t>A future version of this document should define recursion and redirection behavior for leaf nodes once LoST tree connectivity and Forest Guide availability can be assumed. NENA-STA-010 should be updated to acknowledge the deployment reality that intra-tree recursion and cross-tree resolution have different infrastructure dependencies.</w:t>
             </w:r>
           </w:p>
         </w:tc>
@@ -9425,7 +9732,7 @@
           </w:tcPr>
           <w:p>
             <w:r>
-              <w:t>STA-010 Forest Guide provisioning requirement too narrow</w:t>
+              <w:t>GIS data conformance not enforced at SI boundary</w:t>
             </w:r>
           </w:p>
         </w:tc>
@@ -9441,7 +9748,9 @@
           </w:tcPr>
           <w:p>
             <w:r>
-              <w:t>NENA-STA-010 states “State ECRF and LVF operators SHALL arrange for their coverage regions to be provisioned in a Forest Guide.” This does not address sub-state LVF operators (county, regional, municipal) who may need to provision the Forest Guide directly when no state-level aggregator exists above them. NENA-INF-009.1-2014 acknowledges that regional deployments may not align with state boundaries, but STA-010 has not been updated to reflect this.</w:t>
+              <w:t xml:space="preserve">STA-004.2 requires street types, directionals, and other street name elements to be spelled out in full — no abbreviations are recognized. However, neither STA-006.3 nor STA-010 specifies a conformance validation step at the SI boundary that would reject non-conformant GIS data </w:t>
+              <w:lastRenderedPageBreak/>
+              <w:t>before it reaches the LVF. A 911 Authority that provisions abbreviated data creates a situation where conformant PIDF-LO submissions will fail LVF validation. LIS operators who adapt their records to match abbreviated GIS data face rework when the 911 Authority later brings their data into CLDXF-US conformance. The LVF compares against whatever values are in the provisioned GIS — conformance of those values to STA-004.2 is the responsibility of the SI operator and 911 Authority, not the LVF.</w:t>
             </w:r>
           </w:p>
         </w:tc>
@@ -9457,7 +9766,8 @@
           </w:tcPr>
           <w:p>
             <w:r>
-              <w:t>STA-010 should be updated to explicitly require all LVF operators — regardless of administrative level — to provision their coverage regions to the Forest Guide, either directly or through a parent node</w:t>
+              <w:lastRenderedPageBreak/>
+              <w:t>A future revision of STA-006.3 or STA-010 should require SI operators to validate that field values meet CLDXF-US domain requirements — including full spelling of street types and directionals — before provisioning data to the LVF.</w:t>
             </w:r>
           </w:p>
         </w:tc>
@@ -9475,7 +9785,8 @@
           </w:tcPr>
           <w:p>
             <w:r>
-              <w:t>SSAP layer absence not addressed in standards</w:t>
+              <w:lastRenderedPageBreak/>
+              <w:t>RFC 5222 mapping selection for non-conforming locationValidation results</w:t>
             </w:r>
           </w:p>
         </w:tc>
@@ -9491,227 +9802,25 @@
           </w:tcPr>
           <w:p>
             <w:r>
-              <w:t xml:space="preserve">STA-006.3 classifies SSAP as a Required layer, but neither STA-006.3 nor STA-010 specifies how an LVF should behave when SSAP is absent or empty. INF-027 §2.5.4 uses “if available” language suggesting SSAP absence is a recognized </w:t>
+              <w:t>RFC 5222 §8.4.1 requires one or more &lt;mapping&gt; elements in every findServiceResponse, including responses containing a &lt;locationValidation&gt; with an &lt;invalid&gt; element. The RFC provides no guidance on how to select the mapping when validation fails and no GIS record was matched. RFC 5222 was written assuming a unified LoST server where routing and validation are coextensive — NENA's ECRF/LVF split breaks this assumption. The current implementation falls back to the first provisioned boundary matching the requested URN, which is arbitrary and can produce misleading results — for example, returning a Barnes County mapping for an address in Burleigh County when the street name fails validation.</w:t>
+            </w:r>
+          </w:p>
+        </w:tc>
+        <w:tc>
+          <w:tcPr>
+            <w:tcW w:w="3145" w:type="dxa"/>
+            <w:tcBorders>
+              <w:top w:val="single" w:sz="2" w:space="0" w:color="CCCCCC"/>
+              <w:left w:val="single" w:sz="2" w:space="0" w:color="CCCCCC"/>
+              <w:bottom w:val="single" w:sz="2" w:space="0" w:color="CCCCCC"/>
+              <w:right w:val="single" w:sz="2" w:space="0" w:color="CCCCCC"/>
+            </w:tcBorders>
+          </w:tcPr>
+          <w:p>
+            <w:r>
+              <w:t xml:space="preserve">A future revision of RFC 5222 or NENA-STA-010 should define mapping selection behavior for non-conforming LVF responses. This is a high-priority gap. The resolution in this implementation is: (1) use the civic coverage region lookup table (§3.5) with longest-prefix matching on validated admin elements to select the correct service boundary when the lookup resolves unambiguously — this is the normal case when country, A1, and A2 have all validated; (2) when the lookup does not resolve (insufficient validated elements, no match, or multiple candidates), construct a synthetic default mapping with displayName “VALIDATION RESULT ONLY” from LVF_DEFAULT_MAPPING_SOURCE_ID and emit &lt;defaultMappingReturned&gt; </w:t>
               <w:lastRenderedPageBreak/>
-              <w:t>real-world condition. This algorithm treats SSAP absence as a graceful fallback to RCL-only operation (§5.1), but this behavior is not standardized.</w:t>
-            </w:r>
-          </w:p>
-        </w:tc>
-        <w:tc>
-          <w:tcPr>
-            <w:tcW w:w="3145" w:type="dxa"/>
-            <w:tcBorders>
-              <w:top w:val="single" w:sz="2" w:space="0" w:color="CCCCCC"/>
-              <w:left w:val="single" w:sz="2" w:space="0" w:color="CCCCCC"/>
-              <w:bottom w:val="single" w:sz="2" w:space="0" w:color="CCCCCC"/>
-              <w:right w:val="single" w:sz="2" w:space="0" w:color="CCCCCC"/>
-            </w:tcBorders>
-          </w:tcPr>
-          <w:p>
-            <w:r>
-              <w:lastRenderedPageBreak/>
-              <w:t>STA-006.3 and STA-010 should provide explicit guidance on minimum viable LVF provisioning states, including the expected behavior when the SSAP layer is absent or incomplete</w:t>
-            </w:r>
-          </w:p>
-        </w:tc>
-      </w:tr>
-      <w:tr>
-        <w:tc>
-          <w:tcPr>
-            <w:tcW w:w="3107" w:type="dxa"/>
-            <w:tcBorders>
-              <w:top w:val="single" w:sz="2" w:space="0" w:color="CCCCCC"/>
-              <w:left w:val="single" w:sz="2" w:space="0" w:color="CCCCCC"/>
-              <w:bottom w:val="single" w:sz="2" w:space="0" w:color="CCCCCC"/>
-              <w:right w:val="single" w:sz="2" w:space="0" w:color="CCCCCC"/>
-            </w:tcBorders>
-          </w:tcPr>
-          <w:p>
-            <w:r>
-              <w:t>cae:PN namespace conflict between RFC 6848 and STA-004.2</w:t>
-            </w:r>
-          </w:p>
-        </w:tc>
-        <w:tc>
-          <w:tcPr>
-            <w:tcW w:w="3108" w:type="dxa"/>
-            <w:tcBorders>
-              <w:top w:val="single" w:sz="2" w:space="0" w:color="CCCCCC"/>
-              <w:left w:val="single" w:sz="2" w:space="0" w:color="CCCCCC"/>
-              <w:bottom w:val="single" w:sz="2" w:space="0" w:color="CCCCCC"/>
-              <w:right w:val="single" w:sz="2" w:space="0" w:color="CCCCCC"/>
-            </w:tcBorders>
-          </w:tcPr>
-          <w:p>
-            <w:r>
-              <w:t>RFC 6848 defines cae:PN as “Post Number” (lamp post or utility pole identifier). STA-004.2 §3.4.15 repurposes cae:PN as “Location Marker” with a broader definition. INF-027.1-2018 excludes PN entirely (“Post (Pole) Number: Not used in NG9-1-1 CLDXF”) but predates STA-004.2’s repurposing. This creates ambiguity for implementers reading across these documents.</w:t>
-            </w:r>
-          </w:p>
-        </w:tc>
-        <w:tc>
-          <w:tcPr>
-            <w:tcW w:w="3145" w:type="dxa"/>
-            <w:tcBorders>
-              <w:top w:val="single" w:sz="2" w:space="0" w:color="CCCCCC"/>
-              <w:left w:val="single" w:sz="2" w:space="0" w:color="CCCCCC"/>
-              <w:bottom w:val="single" w:sz="2" w:space="0" w:color="CCCCCC"/>
-              <w:right w:val="single" w:sz="2" w:space="0" w:color="CCCCCC"/>
-            </w:tcBorders>
-          </w:tcPr>
-          <w:p>
-            <w:r>
-              <w:t>A future INF-027 revision should explicitly acknowledge STA-004.2’s repurposing of cae:PN as Location Marker and remove or update the existing exclusion of PN</w:t>
-            </w:r>
-          </w:p>
-        </w:tc>
-      </w:tr>
-      <w:tr>
-        <w:tc>
-          <w:tcPr>
-            <w:tcW w:w="3107" w:type="dxa"/>
-            <w:tcBorders>
-              <w:top w:val="single" w:sz="2" w:space="0" w:color="CCCCCC"/>
-              <w:left w:val="single" w:sz="2" w:space="0" w:color="CCCCCC"/>
-              <w:bottom w:val="single" w:sz="2" w:space="0" w:color="CCCCCC"/>
-              <w:right w:val="single" w:sz="2" w:space="0" w:color="CCCCCC"/>
-            </w:tcBorders>
-          </w:tcPr>
-          <w:p>
-            <w:r>
-              <w:t>Recursion and redirection out of scope for this version</w:t>
-            </w:r>
-          </w:p>
-        </w:tc>
-        <w:tc>
-          <w:tcPr>
-            <w:tcW w:w="3108" w:type="dxa"/>
-            <w:tcBorders>
-              <w:top w:val="single" w:sz="2" w:space="0" w:color="CCCCCC"/>
-              <w:left w:val="single" w:sz="2" w:space="0" w:color="CCCCCC"/>
-              <w:bottom w:val="single" w:sz="2" w:space="0" w:color="CCCCCC"/>
-              <w:right w:val="single" w:sz="2" w:space="0" w:color="CCCCCC"/>
-            </w:tcBorders>
-          </w:tcPr>
-          <w:p>
-            <w:r>
-              <w:t>This document is scoped to leaf node LVF behavior. RFC 5222 and NENA-STA-010 define recursion and redirection, but consistent implementation depends on LoST tree connectivity and a functioning National Forest Guide — neither of which can be assumed in current Phase 2 deployments. Intra-tree recursion MAY be available where parent-child connectivity exists, but cross-tree resolution requires the Forest Guide. This algorithm returns &lt;notFound&gt; for all zero-candidate results regardless of whether the location is within or outside the LVF’s coverage region. The coverage region distinction is preserved for diagnostic purposes and to enable correct implementation in a future version.</w:t>
-            </w:r>
-          </w:p>
-        </w:tc>
-        <w:tc>
-          <w:tcPr>
-            <w:tcW w:w="3145" w:type="dxa"/>
-            <w:tcBorders>
-              <w:top w:val="single" w:sz="2" w:space="0" w:color="CCCCCC"/>
-              <w:left w:val="single" w:sz="2" w:space="0" w:color="CCCCCC"/>
-              <w:bottom w:val="single" w:sz="2" w:space="0" w:color="CCCCCC"/>
-              <w:right w:val="single" w:sz="2" w:space="0" w:color="CCCCCC"/>
-            </w:tcBorders>
-          </w:tcPr>
-          <w:p>
-            <w:r>
-              <w:t>A future version of this document should define recursion and redirection behavior for leaf nodes once LoST tree connectivity and Forest Guide availability can be assumed. NENA-STA-010 should be updated to acknowledge the deployment reality that intra-tree recursion and cross-tree resolution have different infrastructure dependencies.</w:t>
-            </w:r>
-          </w:p>
-        </w:tc>
-      </w:tr>
-      <w:tr>
-        <w:tc>
-          <w:tcPr>
-            <w:tcW w:w="3107" w:type="dxa"/>
-            <w:tcBorders>
-              <w:top w:val="single" w:sz="2" w:space="0" w:color="CCCCCC"/>
-              <w:left w:val="single" w:sz="2" w:space="0" w:color="CCCCCC"/>
-              <w:bottom w:val="single" w:sz="2" w:space="0" w:color="CCCCCC"/>
-              <w:right w:val="single" w:sz="2" w:space="0" w:color="CCCCCC"/>
-            </w:tcBorders>
-          </w:tcPr>
-          <w:p>
-            <w:r>
-              <w:lastRenderedPageBreak/>
-              <w:t>GIS data conformance not enforced at SI boundary</w:t>
-            </w:r>
-          </w:p>
-        </w:tc>
-        <w:tc>
-          <w:tcPr>
-            <w:tcW w:w="3108" w:type="dxa"/>
-            <w:tcBorders>
-              <w:top w:val="single" w:sz="2" w:space="0" w:color="CCCCCC"/>
-              <w:left w:val="single" w:sz="2" w:space="0" w:color="CCCCCC"/>
-              <w:bottom w:val="single" w:sz="2" w:space="0" w:color="CCCCCC"/>
-              <w:right w:val="single" w:sz="2" w:space="0" w:color="CCCCCC"/>
-            </w:tcBorders>
-          </w:tcPr>
-          <w:p>
-            <w:r>
-              <w:t>STA-004.2 requires street types, directionals, and other street name elements to be spelled out in full — no abbreviations are recognized. However, neither STA-006.3 nor STA-010 specifies a conformance validation step at the SI boundary that would reject non-conformant GIS data before it reaches the LVF. A 911 Authority that provisions abbreviated data creates a situation where conformant PIDF-LO submissions will fail LVF validation. LIS operators who adapt their records to match abbreviated GIS data face rework when the 911 Authority later brings their data into CLDXF-US conformance. The LVF compares against whatever values are in the provisioned GIS — conformance of those values to STA-004.2 is the responsibility of the SI operator and 911 Authority, not the LVF.</w:t>
-            </w:r>
-          </w:p>
-        </w:tc>
-        <w:tc>
-          <w:tcPr>
-            <w:tcW w:w="3145" w:type="dxa"/>
-            <w:tcBorders>
-              <w:top w:val="single" w:sz="2" w:space="0" w:color="CCCCCC"/>
-              <w:left w:val="single" w:sz="2" w:space="0" w:color="CCCCCC"/>
-              <w:bottom w:val="single" w:sz="2" w:space="0" w:color="CCCCCC"/>
-              <w:right w:val="single" w:sz="2" w:space="0" w:color="CCCCCC"/>
-            </w:tcBorders>
-          </w:tcPr>
-          <w:p>
-            <w:r>
-              <w:t>A future revision of STA-006.3 or STA-010 should require SI operators to validate that field values meet CLDXF-US domain requirements — including full spelling of street types and directionals — before provisioning data to the LVF.</w:t>
-            </w:r>
-          </w:p>
-        </w:tc>
-      </w:tr>
-      <w:tr>
-        <w:tc>
-          <w:tcPr>
-            <w:tcW w:w="3107" w:type="dxa"/>
-            <w:tcBorders>
-              <w:top w:val="single" w:sz="2" w:space="0" w:color="CCCCCC"/>
-              <w:left w:val="single" w:sz="2" w:space="0" w:color="CCCCCC"/>
-              <w:bottom w:val="single" w:sz="2" w:space="0" w:color="CCCCCC"/>
-              <w:right w:val="single" w:sz="2" w:space="0" w:color="CCCCCC"/>
-            </w:tcBorders>
-          </w:tcPr>
-          <w:p>
-            <w:r>
-              <w:t>RFC 5222 mapping selection for non-conforming locationValidation results</w:t>
-            </w:r>
-          </w:p>
-        </w:tc>
-        <w:tc>
-          <w:tcPr>
-            <w:tcW w:w="3108" w:type="dxa"/>
-            <w:tcBorders>
-              <w:top w:val="single" w:sz="2" w:space="0" w:color="CCCCCC"/>
-              <w:left w:val="single" w:sz="2" w:space="0" w:color="CCCCCC"/>
-              <w:bottom w:val="single" w:sz="2" w:space="0" w:color="CCCCCC"/>
-              <w:right w:val="single" w:sz="2" w:space="0" w:color="CCCCCC"/>
-            </w:tcBorders>
-          </w:tcPr>
-          <w:p>
-            <w:r>
-              <w:t>RFC 5222 §8.4.1 requires one or more &lt;mapping&gt; elements in every findServiceResponse, including responses containing a &lt;locationValidation&gt; with an &lt;invalid&gt; element. The RFC provides no guidance on how to select the mapping when validation fails and no GIS record was matched. RFC 5222 was written assuming a unified LoST server where routing and validation are coextensive — NENA's ECRF/LVF split breaks this assumption. The current implementation falls back to the first provisioned boundary matching the requested URN, which is arbitrary and can produce misleading results — for example, returning a Barnes County mapping for an address in Burleigh County when the street name fails validation.</w:t>
-            </w:r>
-          </w:p>
-        </w:tc>
-        <w:tc>
-          <w:tcPr>
-            <w:tcW w:w="3145" w:type="dxa"/>
-            <w:tcBorders>
-              <w:top w:val="single" w:sz="2" w:space="0" w:color="CCCCCC"/>
-              <w:left w:val="single" w:sz="2" w:space="0" w:color="CCCCCC"/>
-              <w:bottom w:val="single" w:sz="2" w:space="0" w:color="CCCCCC"/>
-              <w:right w:val="single" w:sz="2" w:space="0" w:color="CCCCCC"/>
-            </w:tcBorders>
-          </w:tcPr>
-          <w:p>
-            <w:r>
-              <w:t>A future revision of RFC 5222 or NENA-STA-010 should define mapping selection behavior for non-conforming LVF responses. This is a high-priority gap. The resolution in this implementation is: (1) use the civic coverage region lookup table (§3.5) with longest-prefix matching on validated admin elements to select the correct service boundary when the lookup resolves unambiguously — this is the normal case when country, A1, and A2 have all validated; (2) when the lookup does not resolve (insufficient validated elements, no match, or multiple candidates), construct a synthetic default mapping with displayName “VALIDATION RESULT ONLY” from LVF_DEFAULT_MAPPING_SOURCE_ID and emit &lt;defaultMappingReturned&gt; (RFC 5222 §13.2). This eliminates the arbitrary boundaries[0] fallback and ensures no real PSAP identity appears in a response where the LVF has no geographic authority. This gap remains open pending normative standards guidance.</w:t>
+              <w:t>(RFC 5222 §13.2). This eliminates the arbitrary boundaries[0] fallback and ensures no real PSAP identity appears in a response where the LVF has no geographic authority. This gap remains open pending normative standards guidance.</w:t>
             </w:r>
           </w:p>
         </w:tc>
@@ -9787,7 +9896,6 @@
         </w:numPr>
       </w:pPr>
       <w:r>
-        <w:lastRenderedPageBreak/>
         <w:t>Gate 1 minimum element set defined and grounded in STA-004.2 business rules. OR logic for RD/SITE/BLD/PN grounded in INF-027 §2.5.10 with explicit note that element names are updated to STA-004.2 equivalents.</w:t>
       </w:r>
     </w:p>
@@ -9896,6 +10004,7 @@
         </w:numPr>
       </w:pPr>
       <w:r>
+        <w:lastRenderedPageBreak/>
         <w:t>SiteStructureAddressPolygon removed from layer search order — not provisioned to LVF per STA-006.3</w:t>
       </w:r>
     </w:p>
@@ -10088,7 +10197,6 @@
         </w:numPr>
       </w:pPr>
       <w:r>
-        <w:lastRenderedPageBreak/>
         <w:t>§7.4 updated: response table extended to include &lt;redirect&gt; as a distinct response type</w:t>
       </w:r>
     </w:p>
@@ -10173,6 +10281,7 @@
         </w:numPr>
       </w:pPr>
       <w:r>
+        <w:lastRenderedPageBreak/>
         <w:t>§1.2 updated: FCC 24-78 regulatory context added as opening paragraph — explains that Phase 2 NGCS vendor transitions expose LIS operators to revalidation failures when LVF logic differs between vendors, and that inconsistent LVF behavior creates artificial vendor lock-in</w:t>
       </w:r>
     </w:p>
@@ -10317,7 +10426,6 @@
         </w:numPr>
       </w:pPr>
       <w:r>
-        <w:lastRenderedPageBreak/>
         <w:t>§9 updated: A3 gap entry revised to reflect algorithm now aligns with STA-004.2 conditional requirement; two new gap entries added: recursion/redirection deferred, and GIS data conformance not enforced at SI boundary</w:t>
       </w:r>
     </w:p>
@@ -10330,7 +10438,7 @@
         </w:numPr>
       </w:pPr>
       <w:r>
-        <w:t xml:space="preserve">§5.1 updated: SSAP terminal state and RCL fallback rule added — a terminal SSAP result at HNO or below is discarded and RCL is evaluated from scratch; a terminal result above HNO remains a hard stop</w:t>
+        <w:t>§5.1 updated: SSAP terminal state and RCL fallback rule added — a terminal SSAP result at HNO or below is discarded and RCL is evaluated from scratch; a terminal result above HNO remains a hard stop</w:t>
       </w:r>
     </w:p>
     <w:p>
@@ -10342,7 +10450,7 @@
         </w:numPr>
       </w:pPr>
       <w:r>
-        <w:t xml:space="preserve">§5.6.2 updated: Validation flag condition changed from Valid_L/R = 'Y' to Valid_L/R ≠ 'N' — per STA-006.3, an unpopulated validation flag is assumed permissive; only an explicit 'N' excludes a side from the candidate set</w:t>
+        <w:t>§5.6.2 updated: Validation flag condition changed from Valid_L/R = 'Y' to Valid_L/R ≠ 'N' — per STA-006.3, an unpopulated validation flag is assumed permissive; only an explicit 'N' excludes a side from the candidate set</w:t>
       </w:r>
     </w:p>
     <w:p>
@@ -10354,7 +10462,7 @@
         </w:numPr>
       </w:pPr>
       <w:r>
-        <w:t xml:space="preserve">§8 pseudologic updated: Valid_L/R condition updated to ≠ 'N' to match §5.6.2</w:t>
+        <w:t>§8 pseudologic updated: Valid_L/R condition updated to ≠ 'N' to match §5.6.2</w:t>
       </w:r>
     </w:p>
     <w:p>
@@ -10366,7 +10474,7 @@
         </w:numPr>
       </w:pPr>
       <w:r>
-        <w:t xml:space="preserve">§5.2 updated: valid accumulation rule clarified — an element is added to &lt;valid&gt; whenever it is submitted, evaluable, and the candidate set is non-zero after filtering, including when the count is unchanged because all records matched. Non-discriminating elements (e.g., ca:country in an all-US dataset) are still genuinely valid.</w:t>
+        <w:t>§5.2 updated: valid accumulation rule clarified — an element is added to &lt;valid&gt; whenever it is submitted, evaluable, and the candidate set is non-zero after filtering, including when the count is unchanged because all records matched. Non-discriminating elements (e.g., ca:country in an all-US dataset) are still genuinely valid.</w:t>
       </w:r>
     </w:p>
     <w:p>
@@ -10378,7 +10486,7 @@
         </w:numPr>
       </w:pPr>
       <w:r>
-        <w:t xml:space="preserve">§8 pseudologic updated: valid_list condition changed from candidate_set &lt; prev_size to candidate_set &gt; 0; prev_size tracking removed; else branch updated to reflect that zero is already handled by stop-on-first-invalid</w:t>
+        <w:t>§8 pseudologic updated: valid_list condition changed from candidate_set &lt; prev_size to candidate_set &gt; 0; prev_size tracking removed; else branch updated to reflect that zero is already handled by stop-on-first-invalid</w:t>
       </w:r>
     </w:p>
     <w:p>
@@ -10390,7 +10498,8 @@
         </w:numPr>
       </w:pPr>
       <w:r>
-        <w:t xml:space="preserve">§10.3 updated: valid accumulation design decision rationale updated to document the deliberate departure from original pseudologic intent, and the country/all-US-dataset case that revealed the issue</w:t>
+        <w:lastRenderedPageBreak/>
+        <w:t>§10.3 updated: valid accumulation design decision rationale updated to document the deliberate departure from original pseudologic intent, and the country/all-US-dataset case that revealed the issue</w:t>
       </w:r>
     </w:p>
     <w:p>
@@ -10402,7 +10511,7 @@
         </w:numPr>
       </w:pPr>
       <w:r>
-        <w:t xml:space="preserve">§5.3 updated: all-flags-N notFound condition clarified — specifically requires HNO to be in-range and parity-correct with all sides excluded by explicit Valid_L/R = 'N'; returns notFound rather than &lt;invalid&gt; because the road segment exists but is marked non-validating</w:t>
+        <w:t>§5.3 updated: all-flags-N notFound condition clarified — specifically requires HNO to be in-range and parity-correct with all sides excluded by explicit Valid_L/R = 'N'; returns notFound rather than &lt;invalid&gt; because the road segment exists but is marked non-validating</w:t>
       </w:r>
     </w:p>
     <w:p>
@@ -10414,7 +10523,7 @@
         </w:numPr>
       </w:pPr>
       <w:r>
-        <w:t xml:space="preserve">§10.2 updated: RFC 5222 wire format compliance gap added — &lt;path&gt; missing from findServiceResponse, source attribute missing from &lt;errors&gt;, and mapping required attributes conditionally set; deferred pending LVF_SERVER_URI configuration</w:t>
+        <w:t>§10.2 updated: RFC 5222 wire format compliance gap added — &lt;path&gt; missing from findServiceResponse, source attribute missing from &lt;errors&gt;, and mapping required attributes conditionally set; deferred pending LVF_SERVER_URI configuration</w:t>
       </w:r>
     </w:p>
     <w:p>
@@ -10426,7 +10535,7 @@
         </w:numPr>
       </w:pPr>
       <w:r>
-        <w:t xml:space="preserve">§7.5 expanded: full &lt;mapping&gt; element construction documented — STA-006.3 field mappings to RFC 5222 attributes and child elements, fallback logic for required attributes, and LVF_SERVER_URI / LVF_DISPLAY_NAME_LANG environment variables defined</w:t>
+        <w:t>§7.5 expanded: full &lt;mapping&gt; element construction documented — STA-006.3 field mappings to RFC 5222 attributes and child elements, fallback logic for required attributes, and LVF_SERVER_URI / LVF_DISPLAY_NAME_LANG environment variables defined</w:t>
       </w:r>
     </w:p>
     <w:p>
@@ -10438,7 +10547,7 @@
         </w:numPr>
       </w:pPr>
       <w:r>
-        <w:t xml:space="preserve">§10.2 updated: RFC 5222 wire format compliance gap removed — fully implemented via LVF_SERVER_URI, LVF_DISPLAY_NAME_LANG, expanded ServiceBoundary and MappingElement models, and updated _row_to_boundary(), _mapping_element(), and _serialize_find_service_response() in server.py</w:t>
+        <w:t>§10.2 updated: RFC 5222 wire format compliance gap removed — fully implemented via LVF_SERVER_URI, LVF_DISPLAY_NAME_LANG, expanded ServiceBoundary and MappingElement models, and updated _row_to_boundary(), _mapping_element(), and _serialize_find_service_response() in server.py</w:t>
       </w:r>
     </w:p>
     <w:p>
@@ -10450,7 +10559,7 @@
         </w:numPr>
       </w:pPr>
       <w:r>
-        <w:t xml:space="preserve">§10.3 updated: LVF_SERVER_URI and LVF_DISPLAY_NAME_LANG design decision row added</w:t>
+        <w:t>§10.3 updated: LVF_SERVER_URI and LVF_DISPLAY_NAME_LANG design decision row added</w:t>
       </w:r>
     </w:p>
     <w:p>
@@ -10462,7 +10571,7 @@
         </w:numPr>
       </w:pPr>
       <w:r>
-        <w:t xml:space="preserve">§3.3 updated: LVF local policy added — requests without validateLocation='true' are rejected with &lt;forbidden&gt;; rationale references RFC 5222 §8.3.5, STA-010 §3.4, and ECRF/LVF split</w:t>
+        <w:t>§3.3 updated: LVF local policy added — requests without validateLocation='true' are rejected with &lt;forbidden&gt;; rationale references RFC 5222 §8.3.5, STA-010 §3.4, and ECRF/LVF split</w:t>
       </w:r>
     </w:p>
     <w:p>
@@ -10474,7 +10583,7 @@
         </w:numPr>
       </w:pPr>
       <w:r>
-        <w:t xml:space="preserve">§9 updated: new gap entry added — RFC 5222 mapping selection for non-conforming locationValidation results; documents the arbitrary boundaries[0] fallback and the Barnes County example; flagged as high priority</w:t>
+        <w:t>§9 updated: new gap entry added — RFC 5222 mapping selection for non-conforming locationValidation results; documents the arbitrary boundaries[0] fallback and the Barnes County example; flagged as high priority</w:t>
       </w:r>
     </w:p>
     <w:p>
@@ -10486,7 +10595,7 @@
         </w:numPr>
       </w:pPr>
       <w:r>
-        <w:t xml:space="preserve">§3.5 rewritten: civic coverage region reframed as RFC 5582 §4 lookup table mapping admin prefixes to service boundaries with wildcard/longest-prefix matching; §3.5.1 derivation updated to group by service boundary and aggregate to wildcard entries; §3.5.2 expanded to cover both coverage check and non-conforming mapping selection use cases</w:t>
+        <w:t>§3.5 rewritten: civic coverage region reframed as RFC 5582 §4 lookup table mapping admin prefixes to service boundaries with wildcard/longest-prefix matching; §3.5.1 derivation updated to group by service boundary and aggregate to wildcard entries; §3.5.2 expanded to cover both coverage check and non-conforming mapping selection use cases</w:t>
       </w:r>
     </w:p>
     <w:p>
@@ -10498,7 +10607,7 @@
         </w:numPr>
       </w:pPr>
       <w:r>
-        <w:t xml:space="preserve">§9 updated: Barnes County gap entry updated to note planned resolution via §3.5 civic coverage region lookup table with longest-prefix matching on validated admin elements</w:t>
+        <w:t>§9 updated: Barnes County gap entry updated to note planned resolution via §3.5 civic coverage region lookup table with longest-prefix matching on validated admin elements</w:t>
       </w:r>
     </w:p>
     <w:p>
@@ -10510,7 +10619,7 @@
         </w:numPr>
       </w:pPr>
       <w:r>
-        <w:t xml:space="preserve">Civic coverage region deduplication fixed: output tuple dedup now operates on (country, A1, A2, A3, A4, A5, boundary_display_name, boundary_urn) rather than source record identity; confirmed clean output with no duplicate wildcard entries</w:t>
+        <w:t>Civic coverage region deduplication fixed: output tuple dedup now operates on (country, A1, A2, A3, A4, A5, boundary_display_name, boundary_urn) rather than source record identity; confirmed clean output with no duplicate wildcard entries</w:t>
       </w:r>
     </w:p>
     <w:p>
@@ -10522,7 +10631,7 @@
         </w:numPr>
       </w:pPr>
       <w:r>
-        <w:t xml:space="preserve">Civic coverage region display: null A3–A5 values now displayed as “*” in /coverage/civic endpoint output for consistency with RFC 5582 §4 wildcard notation; internal logic unchanged</w:t>
+        <w:t>Civic coverage region display: null A3–A5 values now displayed as “*” in /coverage/civic endpoint output for consistency with RFC 5582 §4 wildcard notation; internal logic unchanged</w:t>
       </w:r>
     </w:p>
     <w:p>
@@ -10534,7 +10643,7 @@
         </w:numPr>
       </w:pPr>
       <w:r>
-        <w:t xml:space="preserve">GIS data errors resolved: SD/RICHLAND COUNTY entry removed (incorrect A2 attribute on ND/SD border RCL segment); MT and remaining spurious SD border entries confirmed as expected artifacts of point-in-polygon boundary assignment and retained</w:t>
+        <w:t>GIS data errors resolved: SD/RICHLAND COUNTY entry removed (incorrect A2 attribute on ND/SD border RCL segment); MT and remaining spurious SD border entries confirmed as expected artifacts of point-in-polygon boundary assignment and retained</w:t>
       </w:r>
     </w:p>
     <w:p>
@@ -10546,78 +10655,115 @@
         </w:numPr>
       </w:pPr>
       <w:r>
-        <w:t xml:space="preserve">Non-conforming mapping selection confirmed implemented in response_assembly.py: civic coverage lookup (§3.5.2) used when available; falls back to boundaries[0] when lookup unavailable. Out-of-coverage case (civic lookup returns no match) returns &lt;notFound&gt; per §3.4; recursion/redirection deferred per §9.</w:t>
-      </w:r>
-    </w:p>
-    <w:p/>
-    <w:p>
-      <w:r>
-        <w:t xml:space="preserve">§7.3 updated: italic note added documenting mapping selection logic for non-conforming results — civic coverage region lookup used when it resolves unambiguously; falls back to boundaries[0] with &lt;defaultMappingReturned&gt; when it does not; LIS clients MUST NOT use mapping for provisioning decisions when &lt;defaultMappingReturned&gt; is present</w:t>
-      </w:r>
-    </w:p>
-    <w:p>
-      <w:r>
-        <w:t xml:space="preserve">§7.4 updated: note added — &lt;defaultMappingReturned&gt; warning emitted when civic coverage lookup does not resolve to a single boundary for a non-conforming result; defines the specific trigger condition (no validated admin elements, or insufficient elements to narrow to one boundary)</w:t>
-      </w:r>
-    </w:p>
-    <w:p>
-      <w:r>
-        <w:t xml:space="preserve">§7.5 updated: non-conforming mapping selection paragraph added — civic coverage lookup on validated admin elements is the primary path; boundaries[0] + &lt;defaultMappingReturned&gt; is the fallback when lookup does not resolve</w:t>
-      </w:r>
-    </w:p>
-    <w:p>
-      <w:r>
-        <w:t xml:space="preserve">§9 updated: Barnes County gap entry revised — documents two-tier resolution: civic coverage lookup (primary) and boundaries[0] + &lt;defaultMappingReturned&gt; (fallback); gap remains open pending normative standards guidance</w:t>
-      </w:r>
-    </w:p>
-    <w:p>
-      <w:r>
-        <w:t xml:space="preserve">§7.3 updated: defaultMappingReturned fallback changed from boundaries[0] to synthetic default mapping constructed from LVF_DEFAULT_MAPPING_SOURCE_ID with displayName “VALIDATION RESULT ONLY”</w:t>
-      </w:r>
-    </w:p>
-    <w:p>
-      <w:r>
-        <w:t xml:space="preserve">§7.4 updated: synthetic mapping construction described — expires=NO-EXPIRATION, lastUpdated=server start time, source=LVF_SERVER_URI, sourceId=LVF_DEFAULT_MAPPING_SOURCE_ID, displayName=“VALIDATION RESULT ONLY”, service=requested URN, uri and serviceNumber omitted; LVF must not start if LVF_DEFAULT_MAPPING_SOURCE_ID unset</w:t>
-      </w:r>
-    </w:p>
-    <w:p>
-      <w:r>
-        <w:t xml:space="preserve">§7.5 updated: non-conforming fallback path updated — boundaries[0] replaced by synthetic default mapping; full construction spec added including recommended sentinel UUID {00000000-0000-0000-0000-000000000000}</w:t>
-      </w:r>
-    </w:p>
-    <w:p>
-      <w:r>
-        <w:t xml:space="preserve">§9 updated: Barnes County gap entry revised — boundaries[0] fallback eliminated; synthetic default mapping with LVF_DEFAULT_MAPPING_SOURCE_ID is the specified resolution; gap remains open pending normative standards guidance</w:t>
-      </w:r>
-    </w:p>
-    <w:p>
-      <w:r>
-        <w:t xml:space="preserve">§10.3 updated: LVF_DEFAULT_MAPPING_SOURCE_ID design decision row added</w:t>
-      </w:r>
-    </w:p>
-    <w:p>
-      <w:r>
-        <w:t xml:space="preserve">response_assembly.py: civic coverage region lookup for non-conforming results corrected to pass only validated admin elements (ca:country, ca:A1, ca:A2, ca:A3) — elements not present in result.state.valid are passed as None, ensuring the lookup degrades gracefully when an admin element is the invalid element. Previously passed raw submitted values regardless of validation outcome, which could return the wrong boundary with no warning when A3 was the invalid element (§3.5.2, §7.3)</w:t>
-      </w:r>
-    </w:p>
-    <w:p>
-      <w:r>
-        <w:t xml:space="preserve">_derive_civic_coverage extended to implement A4 and A5 aggregation per §3.5.1 — the same wildcard aggregation logic applied at A3 is now applied recursively at A4 and A5; civic_coverage_lookup updated to use A4 and A5 during longest-prefix matching</w:t>
-      </w:r>
-    </w:p>
-    <w:p>
-      <w:r>
-        <w:t xml:space="preserve">response_assembly.py: default_mapping_returned flag corrected to only set True when default_mapping_factory is not None — previously fired unconditionally, potentially producing an empty mapping list in violation of RFC 5222 §8.4.1</w:t>
-      </w:r>
-    </w:p>
-    <w:p>
-      <w:r>
-        <w:t xml:space="preserve">Similar Location extension phase 1 implemented (draft-ietf-ecrit-similar-location-19): completeLocation element returned on SSAP match when rli:returnAdditionalLocation is “complete” or “any”; controlled by LVF_ENABLE_SIMILAR_LOCATION environment variable (default disabled); SIMILAR_LOCATION_MAX_RESULTS configures result cap (default 5); rli namespace declared only on the element itself when content is returned; §10.3 design decisions added</w:t>
-      </w:r>
-    </w:p>
-    <w:p>
-      <w:r>
-        <w:t xml:space="preserve">Regression test harness added: tests/regression/runner.py discovers all XML request files in tests/, submits each through handle_find_service() directly, and compares responses against golden files in tests/regression/golden/; seed.py captures initial golden files (run once); semantic XML comparison used to avoid false failures from whitespace or attribute ordering differences</w:t>
+        <w:t>Non-conforming mapping selection confirmed implemented in response_assembly.py: civic coverage lookup (§3.5.2) used when available; falls back to boundaries[0] when lookup unavailable. Out-of-coverage case (civic lookup returns no match) returns &lt;notFound&gt; per §3.4; recursion/redirection deferred per §9.</w:t>
+      </w:r>
+    </w:p>
+    <w:p/>
+    <w:p>
+      <w:r>
+        <w:t>§7.3 updated: italic note added documenting mapping selection logic for non-conforming results — civic coverage region lookup used when it resolves unambiguously; falls back to boundaries[0] with &lt;defaultMappingReturned&gt; when it does not; LIS clients MUST NOT use mapping for provisioning decisions when &lt;defaultMappingReturned&gt; is present</w:t>
+      </w:r>
+    </w:p>
+    <w:p>
+      <w:r>
+        <w:lastRenderedPageBreak/>
+        <w:t>§7.4 updated: note added — &lt;defaultMappingReturned&gt; warning emitted when civic coverage lookup does not resolve to a single boundary for a non-conforming result; defines the specific trigger condition (no validated admin elements, or insufficient elements to narrow to one boundary)</w:t>
+      </w:r>
+    </w:p>
+    <w:p>
+      <w:r>
+        <w:t>§7.5 updated: non-conforming mapping selection paragraph added — civic coverage lookup on validated admin elements is the primary path; boundaries[0] + &lt;defaultMappingReturned&gt; is the fallback when lookup does not resolve</w:t>
+      </w:r>
+    </w:p>
+    <w:p>
+      <w:r>
+        <w:t>§9 updated: Barnes County gap entry revised — documents two-tier resolution: civic coverage lookup (primary) and boundaries[0] + &lt;defaultMappingReturned&gt; (fallback); gap remains open pending normative standards guidance</w:t>
+      </w:r>
+    </w:p>
+    <w:p>
+      <w:r>
+        <w:t>§7.3 updated: defaultMappingReturned fallback changed from boundaries[0] to synthetic default mapping constructed from LVF_DEFAULT_MAPPING_SOURCE_ID with displayName “VALIDATION RESULT ONLY”</w:t>
+      </w:r>
+    </w:p>
+    <w:p>
+      <w:r>
+        <w:t>§7.4 updated: synthetic mapping construction described — expires=NO-EXPIRATION, lastUpdated=server start time, source=LVF_SERVER_URI, sourceId=LVF_DEFAULT_MAPPING_SOURCE_ID, displayName=“VALIDATION RESULT ONLY”, service=requested URN, uri and serviceNumber omitted; LVF must not start if LVF_DEFAULT_MAPPING_SOURCE_ID unset</w:t>
+      </w:r>
+    </w:p>
+    <w:p>
+      <w:r>
+        <w:t>§7.5 updated: non-conforming fallback path updated — boundaries[0] replaced by synthetic default mapping; full construction spec added including recommended sentinel UUID {00000000-0000-0000-0000-000000000000}</w:t>
+      </w:r>
+    </w:p>
+    <w:p>
+      <w:r>
+        <w:t>§9 updated: Barnes County gap entry revised — boundaries[0] fallback eliminated; synthetic default mapping with LVF_DEFAULT_MAPPING_SOURCE_ID is the specified resolution; gap remains open pending normative standards guidance</w:t>
+      </w:r>
+    </w:p>
+    <w:p>
+      <w:r>
+        <w:t>§10.3 updated: LVF_DEFAULT_MAPPING_SOURCE_ID design decision row added</w:t>
+      </w:r>
+    </w:p>
+    <w:p>
+      <w:r>
+        <w:t>response_assembly.py: civic coverage region lookup for non-conforming results corrected to pass only validated admin elements (ca:country, ca:A1, ca:A2, ca:A3) — elements not present in result.state.valid are passed as None, ensuring the lookup degrades gracefully when an admin element is the invalid element. Previously passed raw submitted values regardless of validation outcome, which could return the wrong boundary with no warning when A3 was the invalid element (§3.5.2, §7.3)</w:t>
+      </w:r>
+    </w:p>
+    <w:p>
+      <w:r>
+        <w:t>_derive_civic_coverage extended to implement A4 and A5 aggregation per §3.5.1 — the same wildcard aggregation logic applied at A3 is now applied recursively at A4 and A5; civic_coverage_lookup updated to use A4 and A5 during longest-prefix matching</w:t>
+      </w:r>
+    </w:p>
+    <w:p>
+      <w:r>
+        <w:t>response_assembly.py: default_mapping_returned flag corrected to only set True when default_mapping_factory is not None — previously fired unconditionally, potentially producing an empty mapping list in violation of RFC 5222 §8.4.1</w:t>
+      </w:r>
+    </w:p>
+    <w:p>
+      <w:r>
+        <w:t>Similar Location extension phase 1 implemented (draft-ietf-ecrit-similar-location-19): completeLocation element returned on SSAP match when rli:returnAdditionalLocation is “complete” or “any”; controlled by LVF_ENABLE_SIMILAR_LOCATION environment variable (default disabled); rli namespace declared only on the element itself when content is returned; §10.3 design decisions added</w:t>
+      </w:r>
+    </w:p>
+    <w:p>
+      <w:r>
+        <w:t>Regression test harness added: tests/regression/runner.py discovers all XML request files in tests/, submits each through handle_find_service() directly, and compares responses against golden files in tests/regression/golden/; seed.py captures initial golden files (run once); semantic XML comparison used to avoid false failures from whitespace or attribute ordering differences</w:t>
+      </w:r>
+    </w:p>
+    <w:p>
+      <w:r>
+        <w:t>§7.5 corrected: source attribute on &lt;mapping&gt; changed to always use LVF_SERVER_URI — per RFC 5222 §5.1, source identifies the authoritative generator of the mapping (this LVF server), not the agency whose boundary is being described. Agency_ID is not used for this attribute. §10.3 design decision row for LVF_SERVER_URI updated accordingly.</w:t>
+      </w:r>
+    </w:p>
+    <w:p>
+      <w:r>
+        <w:lastRenderedPageBreak/>
+        <w:t>§3.5.3 and §3.6 corrected: “published upstream” language softened from implicit MUST to “MUST be made available for publication”; note added that the LoST-Sync push mechanism is deferred pending recursion/redirection work in §10.2. Consistent with the leaf-node scope established in §3.3.</w:t>
+      </w:r>
+    </w:p>
+    <w:p>
+      <w:r>
+        <w:t>§10 changelog corrected: SIMILAR_LOCATION_MAX_RESULTS removed — this variable was referenced in the phase 1 similar location changelog entry but was never implemented. completeLocation returns at most one record per SSAP match; a result cap is not applicable until similarLocation is implemented in a future version (§10.2).</w:t>
+      </w:r>
+    </w:p>
+    <w:p>
+      <w:r>
+        <w:t>§3.7 added: URN Alias Resolution — LVF_URN_ALIASES environment variable allows operator-configured alias URNs (primary: urn:emergency:service:sos.psap) to be resolved to urn:service:sos at Gate 0. Enables a 911 Authority to maintain a single PsapPolygon boundary layer serving both internal and external interfaces, consistent with NENA-STA-010’s statement that all LVFs are provisioned with the same data whether inside or outside an ESInet. Response carries the client’s original URN per RFC 5222. §8 pseudologic updated to reflect alias resolution at Gate 0.</w:t>
+      </w:r>
+    </w:p>
+    <w:p>
+      <w:r>
+        <w:t>§10.3 updated: three new design decision rows added — (1) LVF SHOULD be provisioned with PsapPolygon layer only; (2) source attribute on &lt;mapping&gt; always uses LVF_SERVER_URI per RFC 5222 §5.1, not Agency_ID; (3) URN alias resolution rationale.</w:t>
+      </w:r>
+    </w:p>
+    <w:p>
+      <w:r>
+        <w:t xml:space="preserve">§10.2 updated: “Periodic revalidation trigger conditions” expanded to HIGH PRIORITY entry covering draft-ietf-ecrit-lost-planned-changes and planned:revalidateAfter — NENA-STA-010 MUST requirement; revalidateAfter is GIS-change-driven not cache-expiry-driven; DoS risk from mass revalidation noted per INF-027 §2.6.3.4; distinct from periodic revalidation per RFC 6881.</w:t>
+      </w:r>
+    </w:p>
+    <w:p>
+      <w:r>
+        <w:t>§1 Purpose and Scope and §1.2 Regulatory Context expanded: opening framing strengthened to capture the structural gap (standards collectively define the data model and protocol but not the evaluation algorithm); regulatory context expanded to address the FCC Phase 2 certification presumption, the OSP address validation landscape, the distinction between MSAG-era data inconsistency (resolved by CLDXF-US and STA-006.3) and present-day LVF logic inconsistency (this document’s focus), and the time-sensitive opportunity to close the gap before vendor lock-in sets in.</w:t>
       </w:r>
     </w:p>
     <w:p/>
@@ -10663,7 +10809,7 @@
         </w:numPr>
       </w:pPr>
       <w:r>
-        <w:t>Periodic revalidation trigger conditions</w:t>
+        <w:t xml:space="preserve">⚠️ HIGH PRIORITY: Planned changes support and revalidateAfter (draft-ietf-ecrit-lost-planned-changes, NENA-STA-010 §3.4) — NENA-STA-010 states that LVFs MUST support draft-ietf-ecrit-lost-planned-changes, and INF-027 §2.6.3.4 recommends implementation now. This draft defines a mechanism by which the LVF notifies LIS clients that a previously valid location may become invalid due to a planned GIS data change. The LVF returns a planned:revalidateAfter timestamp in the findServiceResponse indicating when the client should revalidate. This timestamp is not a simple cache expiry — it is driven by known upcoming GIS data changes (road renames, boundary adjustments, address range changes) scheduled via the Spatial Interface. The LVF must have visibility into the GIS change pipeline to set this value meaningfully. INF-027 §2.6.3.4 also notes that a mass revalidation triggered by a large GIS change may resemble a DoS attack — the implementation should consider staggered notification to spread revalidation load over time. This capability is required by STA-010 and is distinct from the periodic revalidation recommended by RFC 6881; both mechanisms should be supported.</w:t>
       </w:r>
     </w:p>
     <w:p>
@@ -10723,6 +10869,7 @@
         </w:numPr>
       </w:pPr>
       <w:r>
+        <w:lastRenderedPageBreak/>
         <w:t>Named location validation without HNO — this algorithm requires ca:HNO for all validation requests. Validation of addresses without a street number (e.g., named landmarks, points of interest, campus locations) is not supported in this version and is deferred for future consideration. A future revision should define how the progressive filter and response assembly operate when HNO is absent.</w:t>
       </w:r>
     </w:p>
@@ -10773,8 +10920,8 @@
         <w:tblLook w:val="04A0" w:firstRow="1" w:lastRow="0" w:firstColumn="1" w:lastColumn="0" w:noHBand="0" w:noVBand="1"/>
       </w:tblPr>
       <w:tblGrid>
-        <w:gridCol w:w="3599"/>
-        <w:gridCol w:w="5761"/>
+        <w:gridCol w:w="4199"/>
+        <w:gridCol w:w="5161"/>
       </w:tblGrid>
       <w:tr>
         <w:trPr>
@@ -10938,9 +11085,110 @@
           </w:tcPr>
           <w:p>
             <w:r>
-              <w:t>&lt;redirect&gt; or recursion for out-of-</w:t>
+              <w:t>&lt;redirect&gt; or recursion for out-of-coverage Gate 2 result</w:t>
+            </w:r>
+          </w:p>
+        </w:tc>
+        <w:tc>
+          <w:tcPr>
+            <w:tcW w:w="5760" w:type="dxa"/>
+            <w:tcBorders>
+              <w:top w:val="single" w:sz="2" w:space="0" w:color="CCCCCC"/>
+              <w:left w:val="single" w:sz="2" w:space="0" w:color="CCCCCC"/>
+              <w:bottom w:val="single" w:sz="2" w:space="0" w:color="CCCCCC"/>
+              <w:right w:val="single" w:sz="2" w:space="0" w:color="CCCCCC"/>
+            </w:tcBorders>
+          </w:tcPr>
+          <w:p>
+            <w:r>
+              <w:t>NENA-STA-010 §3.4 — LVF MUST support both modes; out-of-coverage is determined by comparing submitted administrative elements against the LVF's civic service boundaries (RFC 5222 §12.3)</w:t>
+            </w:r>
+          </w:p>
+        </w:tc>
+      </w:tr>
+      <w:tr>
+        <w:tc>
+          <w:tcPr>
+            <w:tcW w:w="3599" w:type="dxa"/>
+            <w:tcBorders>
+              <w:top w:val="single" w:sz="2" w:space="0" w:color="CCCCCC"/>
+              <w:left w:val="single" w:sz="2" w:space="0" w:color="CCCCCC"/>
+              <w:bottom w:val="single" w:sz="2" w:space="0" w:color="CCCCCC"/>
+              <w:right w:val="single" w:sz="2" w:space="0" w:color="CCCCCC"/>
+            </w:tcBorders>
+          </w:tcPr>
+          <w:p>
+            <w:r>
+              <w:t>Unified progressive filter (GIS investigation and element evaluation collapsed)</w:t>
+            </w:r>
+          </w:p>
+        </w:tc>
+        <w:tc>
+          <w:tcPr>
+            <w:tcW w:w="5760" w:type="dxa"/>
+            <w:tcBorders>
+              <w:top w:val="single" w:sz="2" w:space="0" w:color="CCCCCC"/>
+              <w:left w:val="single" w:sz="2" w:space="0" w:color="CCCCCC"/>
+              <w:bottom w:val="single" w:sz="2" w:space="0" w:color="CCCCCC"/>
+              <w:right w:val="single" w:sz="2" w:space="0" w:color="CCCCCC"/>
+            </w:tcBorders>
+          </w:tcPr>
+          <w:p>
+            <w:r>
+              <w:t>The previous separation was artificial — both steps compared the same PIDF-LO values against the same GIS fields. The progressive filter model is computationally coherent and eliminates redundancy.</w:t>
+            </w:r>
+          </w:p>
+        </w:tc>
+      </w:tr>
+      <w:tr>
+        <w:tc>
+          <w:tcPr>
+            <w:tcW w:w="3599" w:type="dxa"/>
+            <w:tcBorders>
+              <w:top w:val="single" w:sz="2" w:space="0" w:color="CCCCCC"/>
+              <w:left w:val="single" w:sz="2" w:space="0" w:color="CCCCCC"/>
+              <w:bottom w:val="single" w:sz="2" w:space="0" w:color="CCCCCC"/>
+              <w:right w:val="single" w:sz="2" w:space="0" w:color="CCCCCC"/>
+            </w:tcBorders>
+          </w:tcPr>
+          <w:p>
+            <w:r>
+              <w:t>Elements added to &lt;valid&gt; whenever candidate set is non-zero after filtering, including when unchanged</w:t>
+            </w:r>
+          </w:p>
+        </w:tc>
+        <w:tc>
+          <w:tcPr>
+            <w:tcW w:w="5760" w:type="dxa"/>
+            <w:tcBorders>
+              <w:top w:val="single" w:sz="2" w:space="0" w:color="CCCCCC"/>
+              <w:left w:val="single" w:sz="2" w:space="0" w:color="CCCCCC"/>
+              <w:bottom w:val="single" w:sz="2" w:space="0" w:color="CCCCCC"/>
+              <w:right w:val="single" w:sz="2" w:space="0" w:color="CCCCCC"/>
+            </w:tcBorders>
+          </w:tcPr>
+          <w:p>
+            <w:r>
+              <w:t>An element is added to &lt;valid&gt; whenever it is submitted, evaluable, and the candidate set is non-zero after filtering — including when the count is unchanged because all records matched. A non-discriminating element (e.g., ca:country when every GIS record is ‘US’) is still genuinely present and correct. The §8 pseudologic originally said ‘only if count decreases’ but this produced incorrect results in practice — country was absent from &lt;valid&gt; in all-US datasets. The code behavior is correct; the pseudologic has been updated to match.</w:t>
+            </w:r>
+          </w:p>
+        </w:tc>
+      </w:tr>
+      <w:tr>
+        <w:tc>
+          <w:tcPr>
+            <w:tcW w:w="3599" w:type="dxa"/>
+            <w:tcBorders>
+              <w:top w:val="single" w:sz="2" w:space="0" w:color="CCCCCC"/>
+              <w:left w:val="single" w:sz="2" w:space="0" w:color="CCCCCC"/>
+              <w:bottom w:val="single" w:sz="2" w:space="0" w:color="CCCCCC"/>
+              <w:right w:val="single" w:sz="2" w:space="0" w:color="CCCCCC"/>
+            </w:tcBorders>
+          </w:tcPr>
+          <w:p>
+            <w:r>
               <w:lastRenderedPageBreak/>
-              <w:t>coverage Gate 2 result</w:t>
+              <w:t>RCL side determination occurs at HNO's position in the hierarchy</w:t>
             </w:r>
           </w:p>
         </w:tc>
@@ -10956,10 +11204,452 @@
           </w:tcPr>
           <w:p>
             <w:r>
+              <w:t>Side determination is a product of HNO evaluation, not a pre-step. Administrative elements evaluated before HNO use the full RCL candidate set; elements after HNO use side-specific fields.</w:t>
+            </w:r>
+          </w:p>
+        </w:tc>
+      </w:tr>
+      <w:tr>
+        <w:tc>
+          <w:tcPr>
+            <w:tcW w:w="3599" w:type="dxa"/>
+            <w:tcBorders>
+              <w:top w:val="single" w:sz="2" w:space="0" w:color="CCCCCC"/>
+              <w:left w:val="single" w:sz="2" w:space="0" w:color="CCCCCC"/>
+              <w:bottom w:val="single" w:sz="2" w:space="0" w:color="CCCCCC"/>
+              <w:right w:val="single" w:sz="2" w:space="0" w:color="CCCCCC"/>
+            </w:tcBorders>
+          </w:tcPr>
+          <w:p>
+            <w:r>
+              <w:t>Stop-on-first-invalid (one &lt;invalid&gt; element maximum)</w:t>
+            </w:r>
+          </w:p>
+        </w:tc>
+        <w:tc>
+          <w:tcPr>
+            <w:tcW w:w="5760" w:type="dxa"/>
+            <w:tcBorders>
+              <w:top w:val="single" w:sz="2" w:space="0" w:color="CCCCCC"/>
+              <w:left w:val="single" w:sz="2" w:space="0" w:color="CCCCCC"/>
+              <w:bottom w:val="single" w:sz="2" w:space="0" w:color="CCCCCC"/>
+              <w:right w:val="single" w:sz="2" w:space="0" w:color="CCCCCC"/>
+            </w:tcBorders>
+          </w:tcPr>
+          <w:p>
+            <w:r>
+              <w:t>INF-027 §2.4.2.2 — ensures consistent results across LVF implementations</w:t>
+            </w:r>
+          </w:p>
+        </w:tc>
+      </w:tr>
+      <w:tr>
+        <w:tc>
+          <w:tcPr>
+            <w:tcW w:w="3599" w:type="dxa"/>
+            <w:tcBorders>
+              <w:top w:val="single" w:sz="2" w:space="0" w:color="CCCCCC"/>
+              <w:left w:val="single" w:sz="2" w:space="0" w:color="CCCCCC"/>
+              <w:bottom w:val="single" w:sz="2" w:space="0" w:color="CCCCCC"/>
+              <w:right w:val="single" w:sz="2" w:space="0" w:color="CCCCCC"/>
+            </w:tcBorders>
+          </w:tcPr>
+          <w:p>
+            <w:r>
+              <w:t>HNO against RCL = &lt;unchecked&gt; not &lt;valid&gt;</w:t>
+            </w:r>
+          </w:p>
+        </w:tc>
+        <w:tc>
+          <w:tcPr>
+            <w:tcW w:w="5760" w:type="dxa"/>
+            <w:tcBorders>
+              <w:top w:val="single" w:sz="2" w:space="0" w:color="CCCCCC"/>
+              <w:left w:val="single" w:sz="2" w:space="0" w:color="CCCCCC"/>
+              <w:bottom w:val="single" w:sz="2" w:space="0" w:color="CCCCCC"/>
+              <w:right w:val="single" w:sz="2" w:space="0" w:color="CCCCCC"/>
+            </w:tcBorders>
+          </w:tcPr>
+          <w:p>
+            <w:r>
+              <w:t>INF-027 §2.5.8 — LVF can only confirm address falls within range, not that it physically exists. HNO still actively participates in candidate filtering.</w:t>
+            </w:r>
+          </w:p>
+        </w:tc>
+      </w:tr>
+      <w:tr>
+        <w:tc>
+          <w:tcPr>
+            <w:tcW w:w="3599" w:type="dxa"/>
+            <w:tcBorders>
+              <w:top w:val="single" w:sz="2" w:space="0" w:color="CCCCCC"/>
+              <w:left w:val="single" w:sz="2" w:space="0" w:color="CCCCCC"/>
+              <w:bottom w:val="single" w:sz="2" w:space="0" w:color="CCCCCC"/>
+              <w:right w:val="single" w:sz="2" w:space="0" w:color="CCCCCC"/>
+            </w:tcBorders>
+          </w:tcPr>
+          <w:p>
+            <w:r>
+              <w:t>No alias resolution</w:t>
+            </w:r>
+          </w:p>
+        </w:tc>
+        <w:tc>
+          <w:tcPr>
+            <w:tcW w:w="5760" w:type="dxa"/>
+            <w:tcBorders>
+              <w:top w:val="single" w:sz="2" w:space="0" w:color="CCCCCC"/>
+              <w:left w:val="single" w:sz="2" w:space="0" w:color="CCCCCC"/>
+              <w:bottom w:val="single" w:sz="2" w:space="0" w:color="CCCCCC"/>
+              <w:right w:val="single" w:sz="2" w:space="0" w:color="CCCCCC"/>
+            </w:tcBorders>
+          </w:tcPr>
+          <w:p>
+            <w:r>
+              <w:t>INF-027 §2.5.9 — only primary GIS field values used for validation</w:t>
+            </w:r>
+          </w:p>
+        </w:tc>
+      </w:tr>
+      <w:tr>
+        <w:tc>
+          <w:tcPr>
+            <w:tcW w:w="3599" w:type="dxa"/>
+            <w:tcBorders>
+              <w:top w:val="single" w:sz="2" w:space="0" w:color="CCCCCC"/>
+              <w:left w:val="single" w:sz="2" w:space="0" w:color="CCCCCC"/>
+              <w:bottom w:val="single" w:sz="2" w:space="0" w:color="CCCCCC"/>
+              <w:right w:val="single" w:sz="2" w:space="0" w:color="CCCCCC"/>
+            </w:tcBorders>
+          </w:tcPr>
+          <w:p>
+            <w:r>
+              <w:t>cdx2:DT, ca:LOC, ca:PLC pre-defined unchecked on both layers</w:t>
+            </w:r>
+          </w:p>
+        </w:tc>
+        <w:tc>
+          <w:tcPr>
+            <w:tcW w:w="5760" w:type="dxa"/>
+            <w:tcBorders>
+              <w:top w:val="single" w:sz="2" w:space="0" w:color="CCCCCC"/>
+              <w:left w:val="single" w:sz="2" w:space="0" w:color="CCCCCC"/>
+              <w:bottom w:val="single" w:sz="2" w:space="0" w:color="CCCCCC"/>
+              <w:right w:val="single" w:sz="2" w:space="0" w:color="CCCCCC"/>
+            </w:tcBorders>
+          </w:tcPr>
+          <w:p>
+            <w:r>
+              <w:t>These elements describe the nature or context of a location rather than identifying it. Not suitable for deterministic attribute matching.</w:t>
+            </w:r>
+          </w:p>
+        </w:tc>
+      </w:tr>
+      <w:tr>
+        <w:tc>
+          <w:tcPr>
+            <w:tcW w:w="3599" w:type="dxa"/>
+            <w:tcBorders>
+              <w:top w:val="single" w:sz="2" w:space="0" w:color="CCCCCC"/>
+              <w:left w:val="single" w:sz="2" w:space="0" w:color="CCCCCC"/>
+              <w:bottom w:val="single" w:sz="2" w:space="0" w:color="CCCCCC"/>
+              <w:right w:val="single" w:sz="2" w:space="0" w:color="CCCCCC"/>
+            </w:tcBorders>
+          </w:tcPr>
+          <w:p>
+            <w:r>
+              <w:t>cdx2:HNC pre-defined unchecked on both layers</w:t>
+            </w:r>
+          </w:p>
+        </w:tc>
+        <w:tc>
+          <w:tcPr>
+            <w:tcW w:w="5760" w:type="dxa"/>
+            <w:tcBorders>
+              <w:top w:val="single" w:sz="2" w:space="0" w:color="CCCCCC"/>
+              <w:left w:val="single" w:sz="2" w:space="0" w:color="CCCCCC"/>
+              <w:bottom w:val="single" w:sz="2" w:space="0" w:color="CCCCCC"/>
+              <w:right w:val="single" w:sz="2" w:space="0" w:color="CCCCCC"/>
+            </w:tcBorders>
+          </w:tcPr>
+          <w:p>
+            <w:r>
+              <w:t>Composite of HNO, HNP, and HNS. Redundant when components are evaluated individually; risks false non-conforming results from composite string formatting differences.</w:t>
+            </w:r>
+          </w:p>
+        </w:tc>
+      </w:tr>
+      <w:tr>
+        <w:tc>
+          <w:tcPr>
+            <w:tcW w:w="3599" w:type="dxa"/>
+            <w:tcBorders>
+              <w:top w:val="single" w:sz="2" w:space="0" w:color="CCCCCC"/>
+              <w:left w:val="single" w:sz="2" w:space="0" w:color="CCCCCC"/>
+              <w:bottom w:val="single" w:sz="2" w:space="0" w:color="CCCCCC"/>
+              <w:right w:val="single" w:sz="2" w:space="0" w:color="CCCCCC"/>
+            </w:tcBorders>
+          </w:tcPr>
+          <w:p>
+            <w:r>
+              <w:t>SiteStructureAddressPolygon excluded from layer search order</w:t>
+            </w:r>
+          </w:p>
+        </w:tc>
+        <w:tc>
+          <w:tcPr>
+            <w:tcW w:w="5760" w:type="dxa"/>
+            <w:tcBorders>
+              <w:top w:val="single" w:sz="2" w:space="0" w:color="CCCCCC"/>
+              <w:left w:val="single" w:sz="2" w:space="0" w:color="CCCCCC"/>
+              <w:bottom w:val="single" w:sz="2" w:space="0" w:color="CCCCCC"/>
+              <w:right w:val="single" w:sz="2" w:space="0" w:color="CCCCCC"/>
+            </w:tcBorders>
+          </w:tcPr>
+          <w:p>
+            <w:r>
+              <w:t>STA-006.3 classifies this layer as Recommended and assigns it to MDS only — not provisioned to the LVF.</w:t>
+            </w:r>
+          </w:p>
+        </w:tc>
+      </w:tr>
+      <w:tr>
+        <w:tc>
+          <w:tcPr>
+            <w:tcW w:w="3599" w:type="dxa"/>
+            <w:tcBorders>
+              <w:top w:val="single" w:sz="2" w:space="0" w:color="CCCCCC"/>
+              <w:left w:val="single" w:sz="2" w:space="0" w:color="CCCCCC"/>
+              <w:bottom w:val="single" w:sz="2" w:space="0" w:color="CCCCCC"/>
+              <w:right w:val="single" w:sz="2" w:space="0" w:color="CCCCCC"/>
+            </w:tcBorders>
+          </w:tcPr>
+          <w:p>
+            <w:r>
+              <w:t>Named location element order from STA-004.2 §3.4.1 size hierarchy</w:t>
+            </w:r>
+          </w:p>
+        </w:tc>
+        <w:tc>
+          <w:tcPr>
+            <w:tcW w:w="5760" w:type="dxa"/>
+            <w:tcBorders>
+              <w:top w:val="single" w:sz="2" w:space="0" w:color="CCCCCC"/>
+              <w:left w:val="single" w:sz="2" w:space="0" w:color="CCCCCC"/>
+              <w:bottom w:val="single" w:sz="2" w:space="0" w:color="CCCCCC"/>
+              <w:right w:val="single" w:sz="2" w:space="0" w:color="CCCCCC"/>
+            </w:tcBorders>
+          </w:tcPr>
+          <w:p>
+            <w:r>
+              <w:t>Documented assumption — INF-027 does not cover these elements; future INF-027 revision needed</w:t>
+            </w:r>
+          </w:p>
+        </w:tc>
+      </w:tr>
+      <w:tr>
+        <w:tc>
+          <w:tcPr>
+            <w:tcW w:w="3599" w:type="dxa"/>
+            <w:tcBorders>
+              <w:top w:val="single" w:sz="2" w:space="0" w:color="CCCCCC"/>
+              <w:left w:val="single" w:sz="2" w:space="0" w:color="CCCCCC"/>
+              <w:bottom w:val="single" w:sz="2" w:space="0" w:color="CCCCCC"/>
+              <w:right w:val="single" w:sz="2" w:space="0" w:color="CCCCCC"/>
+            </w:tcBorders>
+          </w:tcPr>
+          <w:p>
+            <w:r>
+              <w:t>LMK/LMKP replaced by SITE, BLD, PN in minimum element set</w:t>
+            </w:r>
+          </w:p>
+        </w:tc>
+        <w:tc>
+          <w:tcPr>
+            <w:tcW w:w="5760" w:type="dxa"/>
+            <w:tcBorders>
+              <w:top w:val="single" w:sz="2" w:space="0" w:color="CCCCCC"/>
+              <w:left w:val="single" w:sz="2" w:space="0" w:color="CCCCCC"/>
+              <w:bottom w:val="single" w:sz="2" w:space="0" w:color="CCCCCC"/>
+              <w:right w:val="single" w:sz="2" w:space="0" w:color="CCCCCC"/>
+            </w:tcBorders>
+          </w:tcPr>
+          <w:p>
+            <w:r>
+              <w:t>STA-004.2 §3.6 explicitly retires LMK and LMKP. OR logic preserved from INF-027 §2.5.10.</w:t>
+            </w:r>
+          </w:p>
+        </w:tc>
+      </w:tr>
+      <w:tr>
+        <w:tc>
+          <w:tcPr>
+            <w:tcW w:w="3599" w:type="dxa"/>
+            <w:tcBorders>
+              <w:top w:val="single" w:sz="2" w:space="0" w:color="CCCCCC"/>
+              <w:left w:val="single" w:sz="2" w:space="0" w:color="CCCCCC"/>
+              <w:bottom w:val="single" w:sz="2" w:space="0" w:color="CCCCCC"/>
+              <w:right w:val="single" w:sz="2" w:space="0" w:color="CCCCCC"/>
+            </w:tcBorders>
+          </w:tcPr>
+          <w:p>
+            <w:r>
+              <w:t>UNIT retired; UNIT_PRETYPE + UNIT_VALUE used instead</w:t>
+            </w:r>
+          </w:p>
+        </w:tc>
+        <w:tc>
+          <w:tcPr>
+            <w:tcW w:w="5760" w:type="dxa"/>
+            <w:tcBorders>
+              <w:top w:val="single" w:sz="2" w:space="0" w:color="CCCCCC"/>
+              <w:left w:val="single" w:sz="2" w:space="0" w:color="CCCCCC"/>
+              <w:bottom w:val="single" w:sz="2" w:space="0" w:color="CCCCCC"/>
+              <w:right w:val="single" w:sz="2" w:space="0" w:color="CCCCCC"/>
+            </w:tcBorders>
+          </w:tcPr>
+          <w:p>
+            <w:r>
+              <w:t>STA-004.2 §3.6 explicitly retires UNIT element</w:t>
+            </w:r>
+          </w:p>
+        </w:tc>
+      </w:tr>
+      <w:tr>
+        <w:tc>
+          <w:tcPr>
+            <w:tcW w:w="3599" w:type="dxa"/>
+            <w:tcBorders>
+              <w:top w:val="single" w:sz="2" w:space="0" w:color="CCCCCC"/>
+              <w:left w:val="single" w:sz="2" w:space="0" w:color="CCCCCC"/>
+              <w:bottom w:val="single" w:sz="2" w:space="0" w:color="CCCCCC"/>
+              <w:right w:val="single" w:sz="2" w:space="0" w:color="CCCCCC"/>
+            </w:tcBorders>
+          </w:tcPr>
+          <w:p>
+            <w:r>
+              <w:t>Attribute comparison only; geometry ignored</w:t>
+            </w:r>
+          </w:p>
+        </w:tc>
+        <w:tc>
+          <w:tcPr>
+            <w:tcW w:w="5760" w:type="dxa"/>
+            <w:tcBorders>
+              <w:top w:val="single" w:sz="2" w:space="0" w:color="CCCCCC"/>
+              <w:left w:val="single" w:sz="2" w:space="0" w:color="CCCCCC"/>
+              <w:bottom w:val="single" w:sz="2" w:space="0" w:color="CCCCCC"/>
+              <w:right w:val="single" w:sz="2" w:space="0" w:color="CCCCCC"/>
+            </w:tcBorders>
+          </w:tcPr>
+          <w:p>
+            <w:r>
+              <w:t>INF-027 §2.4.1.2 — spatial boundary intersection plays no role in civic address validation</w:t>
+            </w:r>
+          </w:p>
+        </w:tc>
+      </w:tr>
+      <w:tr>
+        <w:tc>
+          <w:tcPr>
+            <w:tcW w:w="3599" w:type="dxa"/>
+            <w:tcBorders>
+              <w:top w:val="single" w:sz="2" w:space="0" w:color="CCCCCC"/>
+              <w:left w:val="single" w:sz="2" w:space="0" w:color="CCCCCC"/>
+              <w:bottom w:val="single" w:sz="2" w:space="0" w:color="CCCCCC"/>
+              <w:right w:val="single" w:sz="2" w:space="0" w:color="CCCCCC"/>
+            </w:tcBorders>
+          </w:tcPr>
+          <w:p>
+            <w:r>
+              <w:t>STA-006.3 field names used directly; no mapping required</w:t>
+            </w:r>
+          </w:p>
+        </w:tc>
+        <w:tc>
+          <w:tcPr>
+            <w:tcW w:w="5760" w:type="dxa"/>
+            <w:tcBorders>
+              <w:top w:val="single" w:sz="2" w:space="0" w:color="CCCCCC"/>
+              <w:left w:val="single" w:sz="2" w:space="0" w:color="CCCCCC"/>
+              <w:bottom w:val="single" w:sz="2" w:space="0" w:color="CCCCCC"/>
+              <w:right w:val="single" w:sz="2" w:space="0" w:color="CCCCCC"/>
+            </w:tcBorders>
+          </w:tcPr>
+          <w:p>
+            <w:r>
+              <w:t>STA-006.3 §3.4 mandates standardized field names for all data provisioned through the SI</w:t>
+            </w:r>
+          </w:p>
+        </w:tc>
+      </w:tr>
+      <w:tr>
+        <w:tc>
+          <w:tcPr>
+            <w:tcW w:w="3599" w:type="dxa"/>
+            <w:tcBorders>
+              <w:top w:val="single" w:sz="2" w:space="0" w:color="CCCCCC"/>
+              <w:left w:val="single" w:sz="2" w:space="0" w:color="CCCCCC"/>
+              <w:bottom w:val="single" w:sz="2" w:space="0" w:color="CCCCCC"/>
+              <w:right w:val="single" w:sz="2" w:space="0" w:color="CCCCCC"/>
+            </w:tcBorders>
+          </w:tcPr>
+          <w:p>
+            <w:r>
+              <w:t>Civic service boundaries (RFC 5222 §12.3) used for authoritativeness determination</w:t>
+            </w:r>
+          </w:p>
+        </w:tc>
+        <w:tc>
+          <w:tcPr>
+            <w:tcW w:w="5760" w:type="dxa"/>
+            <w:tcBorders>
+              <w:top w:val="single" w:sz="2" w:space="0" w:color="CCCCCC"/>
+              <w:left w:val="single" w:sz="2" w:space="0" w:color="CCCCCC"/>
+              <w:bottom w:val="single" w:sz="2" w:space="0" w:color="CCCCCC"/>
+              <w:right w:val="single" w:sz="2" w:space="0" w:color="CCCCCC"/>
+            </w:tcBorders>
+          </w:tcPr>
+          <w:p>
+            <w:r>
+              <w:t>RFC 5222 §12.3 defines civic &lt;serviceBoundary&gt; as describing all addresses that textually match its civic elements. The union of the LVF's civic service boundaries is its civic coverage region. Comparing submitted administrative elements (country, A1, A2) against this representation provides a standards-based mechanism for distinguishing in-coverage notFound from out-of-</w:t>
               <w:lastRenderedPageBreak/>
-              <w:t xml:space="preserve">NENA-STA-010 §3.4 — LVF MUST support both </w:t>
+              <w:t>coverage conditions without requiring a separate coverage polygon layer.</w:t>
+            </w:r>
+          </w:p>
+        </w:tc>
+      </w:tr>
+      <w:tr>
+        <w:tc>
+          <w:tcPr>
+            <w:tcW w:w="3599" w:type="dxa"/>
+            <w:tcBorders>
+              <w:top w:val="single" w:sz="2" w:space="0" w:color="CCCCCC"/>
+              <w:left w:val="single" w:sz="2" w:space="0" w:color="CCCCCC"/>
+              <w:bottom w:val="single" w:sz="2" w:space="0" w:color="CCCCCC"/>
+              <w:right w:val="single" w:sz="2" w:space="0" w:color="CCCCCC"/>
+            </w:tcBorders>
+          </w:tcPr>
+          <w:p>
+            <w:r>
               <w:lastRenderedPageBreak/>
-              <w:t>modes; out-of-coverage is determined by comparing submitted administrative elements against the LVF's civic service boundaries (RFC 5222 §12.3)</w:t>
+              <w:t>&lt;serviceNotImplemented&gt; at Gate 0 rather than &lt;notFound&gt;</w:t>
+            </w:r>
+          </w:p>
+        </w:tc>
+        <w:tc>
+          <w:tcPr>
+            <w:tcW w:w="5760" w:type="dxa"/>
+            <w:tcBorders>
+              <w:top w:val="single" w:sz="2" w:space="0" w:color="CCCCCC"/>
+              <w:left w:val="single" w:sz="2" w:space="0" w:color="CCCCCC"/>
+              <w:bottom w:val="single" w:sz="2" w:space="0" w:color="CCCCCC"/>
+              <w:right w:val="single" w:sz="2" w:space="0" w:color="CCCCCC"/>
+            </w:tcBorders>
+          </w:tcPr>
+          <w:p>
+            <w:r>
+              <w:t>serviceNotImplemented (RFC 5222 §13.1) is semantically more precise for a Gate 0 failure — the problem is that the requested service URN has no provisioned boundary, which is a provisioning state not a location-based failure. Virtually all LVF validation queries use urn:service:sos (NENA-STA-010 §3.4); a Gate 0 failure for that URN indicates an operationally significant provisioning gap. notFound is reserved for conditions where the service URN is recognized but the location cannot be resolved.</w:t>
             </w:r>
           </w:p>
         </w:tc>
@@ -10977,8 +11667,146 @@
           </w:tcPr>
           <w:p>
             <w:r>
+              <w:t>&lt;locationValidationUnavailable&gt; response does not assume mapping</w:t>
+            </w:r>
+          </w:p>
+        </w:tc>
+        <w:tc>
+          <w:tcPr>
+            <w:tcW w:w="5760" w:type="dxa"/>
+            <w:tcBorders>
+              <w:top w:val="single" w:sz="2" w:space="0" w:color="CCCCCC"/>
+              <w:left w:val="single" w:sz="2" w:space="0" w:color="CCCCCC"/>
+              <w:bottom w:val="single" w:sz="2" w:space="0" w:color="CCCCCC"/>
+              <w:right w:val="single" w:sz="2" w:space="0" w:color="CCCCCC"/>
+            </w:tcBorders>
+          </w:tcPr>
+          <w:p>
+            <w:r>
+              <w:t>This algorithm is scoped to the LVF function and does not assume co-location with an ECRF. RFC 5222 §13.2 permits a mapping to accompany locationValidationUnavailable, but whether one is available depends on deployment. This is an implementation concern outside the scope of this algorithm.</w:t>
+            </w:r>
+          </w:p>
+        </w:tc>
+      </w:tr>
+      <w:tr>
+        <w:tc>
+          <w:tcPr>
+            <w:tcW w:w="3599" w:type="dxa"/>
+            <w:tcBorders>
+              <w:top w:val="single" w:sz="2" w:space="0" w:color="CCCCCC"/>
+              <w:left w:val="single" w:sz="2" w:space="0" w:color="CCCCCC"/>
+              <w:bottom w:val="single" w:sz="2" w:space="0" w:color="CCCCCC"/>
+              <w:right w:val="single" w:sz="2" w:space="0" w:color="CCCCCC"/>
+            </w:tcBorders>
+          </w:tcPr>
+          <w:p>
+            <w:r>
+              <w:t>LoST tree resolution assumption — no pre-evaluation redirect logic</w:t>
+            </w:r>
+          </w:p>
+        </w:tc>
+        <w:tc>
+          <w:tcPr>
+            <w:tcW w:w="5760" w:type="dxa"/>
+            <w:tcBorders>
+              <w:top w:val="single" w:sz="2" w:space="0" w:color="CCCCCC"/>
+              <w:left w:val="single" w:sz="2" w:space="0" w:color="CCCCCC"/>
+              <w:bottom w:val="single" w:sz="2" w:space="0" w:color="CCCCCC"/>
+              <w:right w:val="single" w:sz="2" w:space="0" w:color="CCCCCC"/>
+            </w:tcBorders>
+          </w:tcPr>
+          <w:p>
+            <w:r>
+              <w:t>A LIS has a provisioned LVF (NENA-STA-010). Clients should never start at the Forest Guide (INF-027 §2.3.4). The algorithm assumes the queried LVF is the intended recipient; out-of-coverage determination happens post-evaluation (§3.4).</w:t>
+            </w:r>
+          </w:p>
+        </w:tc>
+      </w:tr>
+      <w:tr>
+        <w:tc>
+          <w:tcPr>
+            <w:tcW w:w="3599" w:type="dxa"/>
+            <w:tcBorders>
+              <w:top w:val="single" w:sz="2" w:space="0" w:color="CCCCCC"/>
+              <w:left w:val="single" w:sz="2" w:space="0" w:color="CCCCCC"/>
+              <w:bottom w:val="single" w:sz="2" w:space="0" w:color="CCCCCC"/>
+              <w:right w:val="single" w:sz="2" w:space="0" w:color="CCCCCC"/>
+            </w:tcBorders>
+          </w:tcPr>
+          <w:p>
+            <w:r>
+              <w:t>HNO required for all validation requests</w:t>
+            </w:r>
+          </w:p>
+        </w:tc>
+        <w:tc>
+          <w:tcPr>
+            <w:tcW w:w="5760" w:type="dxa"/>
+            <w:tcBorders>
+              <w:top w:val="single" w:sz="2" w:space="0" w:color="CCCCCC"/>
+              <w:left w:val="single" w:sz="2" w:space="0" w:color="CCCCCC"/>
+              <w:bottom w:val="single" w:sz="2" w:space="0" w:color="CCCCCC"/>
+              <w:right w:val="single" w:sz="2" w:space="0" w:color="CCCCCC"/>
+            </w:tcBorders>
+          </w:tcPr>
+          <w:p>
+            <w:r>
+              <w:t>This algorithm requires ca:HNO as a Gate 1 minimum element. The use case for validating named locations without a street address number (landmarks, points of interest, campus locations) is thin in the LVF context — the LVF’s role is civic address validation for LIS provisioning, and a PIDF-LO without HNO is at best ambiguous. Requiring HNO also enables reliable RCL side determination (§5.4) and consistent &lt;mapping&gt; element selection (§7.5). Validation of no-HNO addresses is deferred as a future work item — see §10.2.</w:t>
+            </w:r>
+          </w:p>
+        </w:tc>
+      </w:tr>
+      <w:tr>
+        <w:tc>
+          <w:tcPr>
+            <w:tcW w:w="3599" w:type="dxa"/>
+            <w:tcBorders>
+              <w:top w:val="single" w:sz="2" w:space="0" w:color="CCCCCC"/>
+              <w:left w:val="single" w:sz="2" w:space="0" w:color="CCCCCC"/>
+              <w:bottom w:val="single" w:sz="2" w:space="0" w:color="CCCCCC"/>
+              <w:right w:val="single" w:sz="2" w:space="0" w:color="CCCCCC"/>
+            </w:tcBorders>
+          </w:tcPr>
+          <w:p>
+            <w:r>
+              <w:t>Civic coverage region derived from RCL with service boundary point-in-polygon filter</w:t>
+            </w:r>
+          </w:p>
+        </w:tc>
+        <w:tc>
+          <w:tcPr>
+            <w:tcW w:w="5760" w:type="dxa"/>
+            <w:tcBorders>
+              <w:top w:val="single" w:sz="2" w:space="0" w:color="CCCCCC"/>
+              <w:left w:val="single" w:sz="2" w:space="0" w:color="CCCCCC"/>
+              <w:bottom w:val="single" w:sz="2" w:space="0" w:color="CCCCCC"/>
+              <w:right w:val="single" w:sz="2" w:space="0" w:color="CCCCCC"/>
+            </w:tcBorders>
+          </w:tcPr>
+          <w:p>
+            <w:r>
+              <w:t xml:space="preserve">The civic coverage region is derived from RCL administrative attribute values (Country, A1–A5 per side), filtered by a point-in-polygon test against provisioned service boundaries using a 0.0001-degree perpendicular offset from each segment side. This ensures that road segments coincident with coverage boundaries (e.g., state </w:t>
               <w:lastRenderedPageBreak/>
-              <w:t>Unified progressive filter (GIS investigation and element evaluation collapsed)</w:t>
+              <w:t>lines) do not cause the LVF to claim authority for administrative elements on the outward-facing side. See §3.5.</w:t>
+            </w:r>
+          </w:p>
+        </w:tc>
+      </w:tr>
+      <w:tr>
+        <w:tc>
+          <w:tcPr>
+            <w:tcW w:w="3600" w:type="dxa"/>
+            <w:tcBorders>
+              <w:top w:val="single" w:sz="2" w:space="0" w:color="CCCCCC"/>
+              <w:left w:val="single" w:sz="2" w:space="0" w:color="CCCCCC"/>
+              <w:bottom w:val="single" w:sz="2" w:space="0" w:color="CCCCCC"/>
+              <w:right w:val="single" w:sz="2" w:space="0" w:color="CCCCCC"/>
+            </w:tcBorders>
+          </w:tcPr>
+          <w:p>
+            <w:r>
+              <w:lastRenderedPageBreak/>
+              <w:t>LVF_SERVER_URI and LVF_DISPLAY_NAME_LANG environment variables for RFC 5222 wire format compliance</w:t>
             </w:r>
           </w:p>
         </w:tc>
@@ -10994,689 +11822,7 @@
           </w:tcPr>
           <w:p>
             <w:r>
-              <w:t>The previous separation was artificial — both steps compared the same PIDF-LO values against the same GIS fields. The progressive filter model is computationally coherent and eliminates redundancy.</w:t>
-            </w:r>
-          </w:p>
-        </w:tc>
-      </w:tr>
-      <w:tr>
-        <w:tc>
-          <w:tcPr>
-            <w:tcW w:w="3599" w:type="dxa"/>
-            <w:tcBorders>
-              <w:top w:val="single" w:sz="2" w:space="0" w:color="CCCCCC"/>
-              <w:left w:val="single" w:sz="2" w:space="0" w:color="CCCCCC"/>
-              <w:bottom w:val="single" w:sz="2" w:space="0" w:color="CCCCCC"/>
-              <w:right w:val="single" w:sz="2" w:space="0" w:color="CCCCCC"/>
-            </w:tcBorders>
-          </w:tcPr>
-          <w:p>
-            <w:r>
-              <w:t>Elements added to &lt;valid&gt; whenever candidate set is non-zero after filtering, including when unchanged</w:t>
-            </w:r>
-          </w:p>
-        </w:tc>
-        <w:tc>
-          <w:tcPr>
-            <w:tcW w:w="5760" w:type="dxa"/>
-            <w:tcBorders>
-              <w:top w:val="single" w:sz="2" w:space="0" w:color="CCCCCC"/>
-              <w:left w:val="single" w:sz="2" w:space="0" w:color="CCCCCC"/>
-              <w:bottom w:val="single" w:sz="2" w:space="0" w:color="CCCCCC"/>
-              <w:right w:val="single" w:sz="2" w:space="0" w:color="CCCCCC"/>
-            </w:tcBorders>
-          </w:tcPr>
-          <w:p>
-            <w:r>
-              <w:t>An element is added to &lt;valid&gt; whenever it is submitted, evaluable, and the candidate set is non-zero after filtering — including when the count is unchanged because all records matched. A non-discriminating element (e.g., ca:country when every GIS record is ‘US’) is still genuinely present and correct. The §8 pseudologic originally said ‘only if count decreases’ but this produced incorrect results in practice — country was absent from &lt;valid&gt; in all-US datasets. The code behavior is correct; the pseudologic has been updated to match.</w:t>
-            </w:r>
-          </w:p>
-        </w:tc>
-      </w:tr>
-      <w:tr>
-        <w:tc>
-          <w:tcPr>
-            <w:tcW w:w="3599" w:type="dxa"/>
-            <w:tcBorders>
-              <w:top w:val="single" w:sz="2" w:space="0" w:color="CCCCCC"/>
-              <w:left w:val="single" w:sz="2" w:space="0" w:color="CCCCCC"/>
-              <w:bottom w:val="single" w:sz="2" w:space="0" w:color="CCCCCC"/>
-              <w:right w:val="single" w:sz="2" w:space="0" w:color="CCCCCC"/>
-            </w:tcBorders>
-          </w:tcPr>
-          <w:p>
-            <w:r>
-              <w:t>RCL side determination occurs at HNO's position in the hierarchy</w:t>
-            </w:r>
-          </w:p>
-        </w:tc>
-        <w:tc>
-          <w:tcPr>
-            <w:tcW w:w="5760" w:type="dxa"/>
-            <w:tcBorders>
-              <w:top w:val="single" w:sz="2" w:space="0" w:color="CCCCCC"/>
-              <w:left w:val="single" w:sz="2" w:space="0" w:color="CCCCCC"/>
-              <w:bottom w:val="single" w:sz="2" w:space="0" w:color="CCCCCC"/>
-              <w:right w:val="single" w:sz="2" w:space="0" w:color="CCCCCC"/>
-            </w:tcBorders>
-          </w:tcPr>
-          <w:p>
-            <w:r>
-              <w:t>Side determination is a product of HNO evaluation, not a pre-step. Administrative elements evaluated before HNO use the full RCL candidate set; elements after HNO use side-specific fields.</w:t>
-            </w:r>
-          </w:p>
-        </w:tc>
-      </w:tr>
-      <w:tr>
-        <w:tc>
-          <w:tcPr>
-            <w:tcW w:w="3599" w:type="dxa"/>
-            <w:tcBorders>
-              <w:top w:val="single" w:sz="2" w:space="0" w:color="CCCCCC"/>
-              <w:left w:val="single" w:sz="2" w:space="0" w:color="CCCCCC"/>
-              <w:bottom w:val="single" w:sz="2" w:space="0" w:color="CCCCCC"/>
-              <w:right w:val="single" w:sz="2" w:space="0" w:color="CCCCCC"/>
-            </w:tcBorders>
-          </w:tcPr>
-          <w:p>
-            <w:r>
-              <w:t>Stop-on-first-invalid (one &lt;invalid&gt; element maximum)</w:t>
-            </w:r>
-          </w:p>
-        </w:tc>
-        <w:tc>
-          <w:tcPr>
-            <w:tcW w:w="5760" w:type="dxa"/>
-            <w:tcBorders>
-              <w:top w:val="single" w:sz="2" w:space="0" w:color="CCCCCC"/>
-              <w:left w:val="single" w:sz="2" w:space="0" w:color="CCCCCC"/>
-              <w:bottom w:val="single" w:sz="2" w:space="0" w:color="CCCCCC"/>
-              <w:right w:val="single" w:sz="2" w:space="0" w:color="CCCCCC"/>
-            </w:tcBorders>
-          </w:tcPr>
-          <w:p>
-            <w:r>
-              <w:t>INF-027 §2.4.2.2 — ensures consistent results across LVF implementations</w:t>
-            </w:r>
-          </w:p>
-        </w:tc>
-      </w:tr>
-      <w:tr>
-        <w:tc>
-          <w:tcPr>
-            <w:tcW w:w="3599" w:type="dxa"/>
-            <w:tcBorders>
-              <w:top w:val="single" w:sz="2" w:space="0" w:color="CCCCCC"/>
-              <w:left w:val="single" w:sz="2" w:space="0" w:color="CCCCCC"/>
-              <w:bottom w:val="single" w:sz="2" w:space="0" w:color="CCCCCC"/>
-              <w:right w:val="single" w:sz="2" w:space="0" w:color="CCCCCC"/>
-            </w:tcBorders>
-          </w:tcPr>
-          <w:p>
-            <w:r>
-              <w:t>HNO against RCL = &lt;unchecked&gt; not &lt;valid&gt;</w:t>
-            </w:r>
-          </w:p>
-        </w:tc>
-        <w:tc>
-          <w:tcPr>
-            <w:tcW w:w="5760" w:type="dxa"/>
-            <w:tcBorders>
-              <w:top w:val="single" w:sz="2" w:space="0" w:color="CCCCCC"/>
-              <w:left w:val="single" w:sz="2" w:space="0" w:color="CCCCCC"/>
-              <w:bottom w:val="single" w:sz="2" w:space="0" w:color="CCCCCC"/>
-              <w:right w:val="single" w:sz="2" w:space="0" w:color="CCCCCC"/>
-            </w:tcBorders>
-          </w:tcPr>
-          <w:p>
-            <w:r>
-              <w:t>INF-027 §2.5.8 — LVF can only confirm address falls within range, not that it physically exists. HNO still actively participates in candidate filtering.</w:t>
-            </w:r>
-          </w:p>
-        </w:tc>
-      </w:tr>
-      <w:tr>
-        <w:tc>
-          <w:tcPr>
-            <w:tcW w:w="3599" w:type="dxa"/>
-            <w:tcBorders>
-              <w:top w:val="single" w:sz="2" w:space="0" w:color="CCCCCC"/>
-              <w:left w:val="single" w:sz="2" w:space="0" w:color="CCCCCC"/>
-              <w:bottom w:val="single" w:sz="2" w:space="0" w:color="CCCCCC"/>
-              <w:right w:val="single" w:sz="2" w:space="0" w:color="CCCCCC"/>
-            </w:tcBorders>
-          </w:tcPr>
-          <w:p>
-            <w:r>
-              <w:t>No alias resolution</w:t>
-            </w:r>
-          </w:p>
-        </w:tc>
-        <w:tc>
-          <w:tcPr>
-            <w:tcW w:w="5760" w:type="dxa"/>
-            <w:tcBorders>
-              <w:top w:val="single" w:sz="2" w:space="0" w:color="CCCCCC"/>
-              <w:left w:val="single" w:sz="2" w:space="0" w:color="CCCCCC"/>
-              <w:bottom w:val="single" w:sz="2" w:space="0" w:color="CCCCCC"/>
-              <w:right w:val="single" w:sz="2" w:space="0" w:color="CCCCCC"/>
-            </w:tcBorders>
-          </w:tcPr>
-          <w:p>
-            <w:r>
-              <w:t>INF-027 §2.5.9 — only primary GIS field values used for validation</w:t>
-            </w:r>
-          </w:p>
-        </w:tc>
-      </w:tr>
-      <w:tr>
-        <w:tc>
-          <w:tcPr>
-            <w:tcW w:w="3599" w:type="dxa"/>
-            <w:tcBorders>
-              <w:top w:val="single" w:sz="2" w:space="0" w:color="CCCCCC"/>
-              <w:left w:val="single" w:sz="2" w:space="0" w:color="CCCCCC"/>
-              <w:bottom w:val="single" w:sz="2" w:space="0" w:color="CCCCCC"/>
-              <w:right w:val="single" w:sz="2" w:space="0" w:color="CCCCCC"/>
-            </w:tcBorders>
-          </w:tcPr>
-          <w:p>
-            <w:r>
-              <w:t>cdx2:DT, ca:LOC, ca:PLC pre-defined unchecked on both layers</w:t>
-            </w:r>
-          </w:p>
-        </w:tc>
-        <w:tc>
-          <w:tcPr>
-            <w:tcW w:w="5760" w:type="dxa"/>
-            <w:tcBorders>
-              <w:top w:val="single" w:sz="2" w:space="0" w:color="CCCCCC"/>
-              <w:left w:val="single" w:sz="2" w:space="0" w:color="CCCCCC"/>
-              <w:bottom w:val="single" w:sz="2" w:space="0" w:color="CCCCCC"/>
-              <w:right w:val="single" w:sz="2" w:space="0" w:color="CCCCCC"/>
-            </w:tcBorders>
-          </w:tcPr>
-          <w:p>
-            <w:r>
-              <w:t>These elements describe the nature or context of a location rather than identifying it. Not suitable for deterministic attribute matching.</w:t>
-            </w:r>
-          </w:p>
-        </w:tc>
-      </w:tr>
-      <w:tr>
-        <w:tc>
-          <w:tcPr>
-            <w:tcW w:w="3599" w:type="dxa"/>
-            <w:tcBorders>
-              <w:top w:val="single" w:sz="2" w:space="0" w:color="CCCCCC"/>
-              <w:left w:val="single" w:sz="2" w:space="0" w:color="CCCCCC"/>
-              <w:bottom w:val="single" w:sz="2" w:space="0" w:color="CCCCCC"/>
-              <w:right w:val="single" w:sz="2" w:space="0" w:color="CCCCCC"/>
-            </w:tcBorders>
-          </w:tcPr>
-          <w:p>
-            <w:r>
-              <w:t>cdx2:HNC pre-defined unchecked on both layers</w:t>
-            </w:r>
-          </w:p>
-        </w:tc>
-        <w:tc>
-          <w:tcPr>
-            <w:tcW w:w="5760" w:type="dxa"/>
-            <w:tcBorders>
-              <w:top w:val="single" w:sz="2" w:space="0" w:color="CCCCCC"/>
-              <w:left w:val="single" w:sz="2" w:space="0" w:color="CCCCCC"/>
-              <w:bottom w:val="single" w:sz="2" w:space="0" w:color="CCCCCC"/>
-              <w:right w:val="single" w:sz="2" w:space="0" w:color="CCCCCC"/>
-            </w:tcBorders>
-          </w:tcPr>
-          <w:p>
-            <w:r>
-              <w:t>Composite of HNO, HNP, and HNS. Redundant when components are evaluated individually; risks false non-conforming results from composite string formatting differences.</w:t>
-            </w:r>
-          </w:p>
-        </w:tc>
-      </w:tr>
-      <w:tr>
-        <w:tc>
-          <w:tcPr>
-            <w:tcW w:w="3599" w:type="dxa"/>
-            <w:tcBorders>
-              <w:top w:val="single" w:sz="2" w:space="0" w:color="CCCCCC"/>
-              <w:left w:val="single" w:sz="2" w:space="0" w:color="CCCCCC"/>
-              <w:bottom w:val="single" w:sz="2" w:space="0" w:color="CCCCCC"/>
-              <w:right w:val="single" w:sz="2" w:space="0" w:color="CCCCCC"/>
-            </w:tcBorders>
-          </w:tcPr>
-          <w:p>
-            <w:r>
-              <w:t>SiteStructureAddressPolygon excluded from layer search order</w:t>
-            </w:r>
-          </w:p>
-        </w:tc>
-        <w:tc>
-          <w:tcPr>
-            <w:tcW w:w="5760" w:type="dxa"/>
-            <w:tcBorders>
-              <w:top w:val="single" w:sz="2" w:space="0" w:color="CCCCCC"/>
-              <w:left w:val="single" w:sz="2" w:space="0" w:color="CCCCCC"/>
-              <w:bottom w:val="single" w:sz="2" w:space="0" w:color="CCCCCC"/>
-              <w:right w:val="single" w:sz="2" w:space="0" w:color="CCCCCC"/>
-            </w:tcBorders>
-          </w:tcPr>
-          <w:p>
-            <w:r>
-              <w:t>STA-006.3 classifies this layer as Recommended and assigns it to MDS only — not provisioned to the LVF.</w:t>
-            </w:r>
-          </w:p>
-        </w:tc>
-      </w:tr>
-      <w:tr>
-        <w:tc>
-          <w:tcPr>
-            <w:tcW w:w="3599" w:type="dxa"/>
-            <w:tcBorders>
-              <w:top w:val="single" w:sz="2" w:space="0" w:color="CCCCCC"/>
-              <w:left w:val="single" w:sz="2" w:space="0" w:color="CCCCCC"/>
-              <w:bottom w:val="single" w:sz="2" w:space="0" w:color="CCCCCC"/>
-              <w:right w:val="single" w:sz="2" w:space="0" w:color="CCCCCC"/>
-            </w:tcBorders>
-          </w:tcPr>
-          <w:p>
-            <w:r>
-              <w:t>Named location element order from STA-004.2 §3.4.1 size hierarchy</w:t>
-            </w:r>
-          </w:p>
-        </w:tc>
-        <w:tc>
-          <w:tcPr>
-            <w:tcW w:w="5760" w:type="dxa"/>
-            <w:tcBorders>
-              <w:top w:val="single" w:sz="2" w:space="0" w:color="CCCCCC"/>
-              <w:left w:val="single" w:sz="2" w:space="0" w:color="CCCCCC"/>
-              <w:bottom w:val="single" w:sz="2" w:space="0" w:color="CCCCCC"/>
-              <w:right w:val="single" w:sz="2" w:space="0" w:color="CCCCCC"/>
-            </w:tcBorders>
-          </w:tcPr>
-          <w:p>
-            <w:r>
-              <w:t>Documented assumption — INF-027 does not cover these elements; future INF-027 revision needed</w:t>
-            </w:r>
-          </w:p>
-        </w:tc>
-      </w:tr>
-      <w:tr>
-        <w:tc>
-          <w:tcPr>
-            <w:tcW w:w="3599" w:type="dxa"/>
-            <w:tcBorders>
-              <w:top w:val="single" w:sz="2" w:space="0" w:color="CCCCCC"/>
-              <w:left w:val="single" w:sz="2" w:space="0" w:color="CCCCCC"/>
-              <w:bottom w:val="single" w:sz="2" w:space="0" w:color="CCCCCC"/>
-              <w:right w:val="single" w:sz="2" w:space="0" w:color="CCCCCC"/>
-            </w:tcBorders>
-          </w:tcPr>
-          <w:p>
-            <w:r>
-              <w:t>LMK/LMKP replaced by SITE, BLD, PN in minimum element set</w:t>
-            </w:r>
-          </w:p>
-        </w:tc>
-        <w:tc>
-          <w:tcPr>
-            <w:tcW w:w="5760" w:type="dxa"/>
-            <w:tcBorders>
-              <w:top w:val="single" w:sz="2" w:space="0" w:color="CCCCCC"/>
-              <w:left w:val="single" w:sz="2" w:space="0" w:color="CCCCCC"/>
-              <w:bottom w:val="single" w:sz="2" w:space="0" w:color="CCCCCC"/>
-              <w:right w:val="single" w:sz="2" w:space="0" w:color="CCCCCC"/>
-            </w:tcBorders>
-          </w:tcPr>
-          <w:p>
-            <w:r>
-              <w:t>STA-004.2 §3.6 explicitly retires LMK and LMKP. OR logic preserved from INF-027 §2.5.10.</w:t>
-            </w:r>
-          </w:p>
-        </w:tc>
-      </w:tr>
-      <w:tr>
-        <w:tc>
-          <w:tcPr>
-            <w:tcW w:w="3599" w:type="dxa"/>
-            <w:tcBorders>
-              <w:top w:val="single" w:sz="2" w:space="0" w:color="CCCCCC"/>
-              <w:left w:val="single" w:sz="2" w:space="0" w:color="CCCCCC"/>
-              <w:bottom w:val="single" w:sz="2" w:space="0" w:color="CCCCCC"/>
-              <w:right w:val="single" w:sz="2" w:space="0" w:color="CCCCCC"/>
-            </w:tcBorders>
-          </w:tcPr>
-          <w:p>
-            <w:r>
-              <w:t>UNIT retired; UNIT_PRETYPE + UNIT_VALUE used instead</w:t>
-            </w:r>
-          </w:p>
-        </w:tc>
-        <w:tc>
-          <w:tcPr>
-            <w:tcW w:w="5760" w:type="dxa"/>
-            <w:tcBorders>
-              <w:top w:val="single" w:sz="2" w:space="0" w:color="CCCCCC"/>
-              <w:left w:val="single" w:sz="2" w:space="0" w:color="CCCCCC"/>
-              <w:bottom w:val="single" w:sz="2" w:space="0" w:color="CCCCCC"/>
-              <w:right w:val="single" w:sz="2" w:space="0" w:color="CCCCCC"/>
-            </w:tcBorders>
-          </w:tcPr>
-          <w:p>
-            <w:r>
-              <w:t>STA-004.2 §3.6 explicitly retires UNIT element</w:t>
-            </w:r>
-          </w:p>
-        </w:tc>
-      </w:tr>
-      <w:tr>
-        <w:tc>
-          <w:tcPr>
-            <w:tcW w:w="3599" w:type="dxa"/>
-            <w:tcBorders>
-              <w:top w:val="single" w:sz="2" w:space="0" w:color="CCCCCC"/>
-              <w:left w:val="single" w:sz="2" w:space="0" w:color="CCCCCC"/>
-              <w:bottom w:val="single" w:sz="2" w:space="0" w:color="CCCCCC"/>
-              <w:right w:val="single" w:sz="2" w:space="0" w:color="CCCCCC"/>
-            </w:tcBorders>
-          </w:tcPr>
-          <w:p>
-            <w:r>
-              <w:t>Attribute comparison only; geometry ignored</w:t>
-            </w:r>
-          </w:p>
-        </w:tc>
-        <w:tc>
-          <w:tcPr>
-            <w:tcW w:w="5760" w:type="dxa"/>
-            <w:tcBorders>
-              <w:top w:val="single" w:sz="2" w:space="0" w:color="CCCCCC"/>
-              <w:left w:val="single" w:sz="2" w:space="0" w:color="CCCCCC"/>
-              <w:bottom w:val="single" w:sz="2" w:space="0" w:color="CCCCCC"/>
-              <w:right w:val="single" w:sz="2" w:space="0" w:color="CCCCCC"/>
-            </w:tcBorders>
-          </w:tcPr>
-          <w:p>
-            <w:r>
-              <w:t>INF-027 §2.4.1.2 — spatial boundary intersection plays no role in civic address validation</w:t>
-            </w:r>
-          </w:p>
-        </w:tc>
-      </w:tr>
-      <w:tr>
-        <w:tc>
-          <w:tcPr>
-            <w:tcW w:w="3599" w:type="dxa"/>
-            <w:tcBorders>
-              <w:top w:val="single" w:sz="2" w:space="0" w:color="CCCCCC"/>
-              <w:left w:val="single" w:sz="2" w:space="0" w:color="CCCCCC"/>
-              <w:bottom w:val="single" w:sz="2" w:space="0" w:color="CCCCCC"/>
-              <w:right w:val="single" w:sz="2" w:space="0" w:color="CCCCCC"/>
-            </w:tcBorders>
-          </w:tcPr>
-          <w:p>
-            <w:r>
-              <w:lastRenderedPageBreak/>
-              <w:t>STA-006.3 field names used directly; no mapping required</w:t>
-            </w:r>
-          </w:p>
-        </w:tc>
-        <w:tc>
-          <w:tcPr>
-            <w:tcW w:w="5760" w:type="dxa"/>
-            <w:tcBorders>
-              <w:top w:val="single" w:sz="2" w:space="0" w:color="CCCCCC"/>
-              <w:left w:val="single" w:sz="2" w:space="0" w:color="CCCCCC"/>
-              <w:bottom w:val="single" w:sz="2" w:space="0" w:color="CCCCCC"/>
-              <w:right w:val="single" w:sz="2" w:space="0" w:color="CCCCCC"/>
-            </w:tcBorders>
-          </w:tcPr>
-          <w:p>
-            <w:r>
-              <w:t>STA-006.3 §3.4 mandates standardized field names for all data provisioned through the SI</w:t>
-            </w:r>
-          </w:p>
-        </w:tc>
-      </w:tr>
-      <w:tr>
-        <w:tc>
-          <w:tcPr>
-            <w:tcW w:w="3599" w:type="dxa"/>
-            <w:tcBorders>
-              <w:top w:val="single" w:sz="2" w:space="0" w:color="CCCCCC"/>
-              <w:left w:val="single" w:sz="2" w:space="0" w:color="CCCCCC"/>
-              <w:bottom w:val="single" w:sz="2" w:space="0" w:color="CCCCCC"/>
-              <w:right w:val="single" w:sz="2" w:space="0" w:color="CCCCCC"/>
-            </w:tcBorders>
-          </w:tcPr>
-          <w:p>
-            <w:r>
-              <w:t>Civic service boundaries (RFC 5222 §12.3) used for authoritativeness determination</w:t>
-            </w:r>
-          </w:p>
-        </w:tc>
-        <w:tc>
-          <w:tcPr>
-            <w:tcW w:w="5760" w:type="dxa"/>
-            <w:tcBorders>
-              <w:top w:val="single" w:sz="2" w:space="0" w:color="CCCCCC"/>
-              <w:left w:val="single" w:sz="2" w:space="0" w:color="CCCCCC"/>
-              <w:bottom w:val="single" w:sz="2" w:space="0" w:color="CCCCCC"/>
-              <w:right w:val="single" w:sz="2" w:space="0" w:color="CCCCCC"/>
-            </w:tcBorders>
-          </w:tcPr>
-          <w:p>
-            <w:r>
-              <w:t>RFC 5222 §12.3 defines civic &lt;serviceBoundary&gt; as describing all addresses that textually match its civic elements. The union of the LVF's civic service boundaries is its civic coverage region. Comparing submitted administrative elements (country, A1, A2) against this representation provides a standards-based mechanism for distinguishing in-coverage notFound from out-of-coverage conditions without requiring a separate coverage polygon layer.</w:t>
-            </w:r>
-          </w:p>
-        </w:tc>
-      </w:tr>
-      <w:tr>
-        <w:tc>
-          <w:tcPr>
-            <w:tcW w:w="3599" w:type="dxa"/>
-            <w:tcBorders>
-              <w:top w:val="single" w:sz="2" w:space="0" w:color="CCCCCC"/>
-              <w:left w:val="single" w:sz="2" w:space="0" w:color="CCCCCC"/>
-              <w:bottom w:val="single" w:sz="2" w:space="0" w:color="CCCCCC"/>
-              <w:right w:val="single" w:sz="2" w:space="0" w:color="CCCCCC"/>
-            </w:tcBorders>
-          </w:tcPr>
-          <w:p>
-            <w:r>
-              <w:t>&lt;serviceNotImplemented&gt; at Gate 0 rather than &lt;notFound&gt;</w:t>
-            </w:r>
-          </w:p>
-        </w:tc>
-        <w:tc>
-          <w:tcPr>
-            <w:tcW w:w="5760" w:type="dxa"/>
-            <w:tcBorders>
-              <w:top w:val="single" w:sz="2" w:space="0" w:color="CCCCCC"/>
-              <w:left w:val="single" w:sz="2" w:space="0" w:color="CCCCCC"/>
-              <w:bottom w:val="single" w:sz="2" w:space="0" w:color="CCCCCC"/>
-              <w:right w:val="single" w:sz="2" w:space="0" w:color="CCCCCC"/>
-            </w:tcBorders>
-          </w:tcPr>
-          <w:p>
-            <w:r>
-              <w:t>serviceNotImplemented (RFC 5222 §13.1) is semantically more precise for a Gate 0 failure — the problem is that the requested service URN has no provisioned boundary, which is a provisioning state not a location-based failure. Virtually all LVF validation queries use urn:service:sos (NENA-STA-010 §3.4); a Gate 0 failure for that URN indicates an operationally significant provisioning gap. notFound is reserved for conditions where the service URN is recognized but the location cannot be resolved.</w:t>
-            </w:r>
-          </w:p>
-        </w:tc>
-      </w:tr>
-      <w:tr>
-        <w:tc>
-          <w:tcPr>
-            <w:tcW w:w="3599" w:type="dxa"/>
-            <w:tcBorders>
-              <w:top w:val="single" w:sz="2" w:space="0" w:color="CCCCCC"/>
-              <w:left w:val="single" w:sz="2" w:space="0" w:color="CCCCCC"/>
-              <w:bottom w:val="single" w:sz="2" w:space="0" w:color="CCCCCC"/>
-              <w:right w:val="single" w:sz="2" w:space="0" w:color="CCCCCC"/>
-            </w:tcBorders>
-          </w:tcPr>
-          <w:p>
-            <w:r>
-              <w:t>&lt;locationValidationUnavailable&gt; response does not assume mapping</w:t>
-            </w:r>
-          </w:p>
-        </w:tc>
-        <w:tc>
-          <w:tcPr>
-            <w:tcW w:w="5760" w:type="dxa"/>
-            <w:tcBorders>
-              <w:top w:val="single" w:sz="2" w:space="0" w:color="CCCCCC"/>
-              <w:left w:val="single" w:sz="2" w:space="0" w:color="CCCCCC"/>
-              <w:bottom w:val="single" w:sz="2" w:space="0" w:color="CCCCCC"/>
-              <w:right w:val="single" w:sz="2" w:space="0" w:color="CCCCCC"/>
-            </w:tcBorders>
-          </w:tcPr>
-          <w:p>
-            <w:r>
-              <w:t>This algorithm is scoped to the LVF function and does not assume co-location with an ECRF. RFC 5222 §13.2 permits a mapping to accompany locationValidationUnavailable, but whether one is available depends on deployment. This is an implementation concern outside the scope of this algorithm.</w:t>
-            </w:r>
-          </w:p>
-        </w:tc>
-      </w:tr>
-      <w:tr>
-        <w:tc>
-          <w:tcPr>
-            <w:tcW w:w="3599" w:type="dxa"/>
-            <w:tcBorders>
-              <w:top w:val="single" w:sz="2" w:space="0" w:color="CCCCCC"/>
-              <w:left w:val="single" w:sz="2" w:space="0" w:color="CCCCCC"/>
-              <w:bottom w:val="single" w:sz="2" w:space="0" w:color="CCCCCC"/>
-              <w:right w:val="single" w:sz="2" w:space="0" w:color="CCCCCC"/>
-            </w:tcBorders>
-          </w:tcPr>
-          <w:p>
-            <w:r>
-              <w:t>LoST tree resolution assumption — no pre-evaluation redirect logic</w:t>
-            </w:r>
-          </w:p>
-        </w:tc>
-        <w:tc>
-          <w:tcPr>
-            <w:tcW w:w="5760" w:type="dxa"/>
-            <w:tcBorders>
-              <w:top w:val="single" w:sz="2" w:space="0" w:color="CCCCCC"/>
-              <w:left w:val="single" w:sz="2" w:space="0" w:color="CCCCCC"/>
-              <w:bottom w:val="single" w:sz="2" w:space="0" w:color="CCCCCC"/>
-              <w:right w:val="single" w:sz="2" w:space="0" w:color="CCCCCC"/>
-            </w:tcBorders>
-          </w:tcPr>
-          <w:p>
-            <w:r>
-              <w:t>A LIS has a provisioned LVF (NENA-STA-010). Clients should never start at the Forest Guide (INF-027 §2.3.4). The algorithm assumes the queried LVF is the intended recipient; out-of-coverage determination happens post-evaluation (§3.4).</w:t>
-            </w:r>
-          </w:p>
-        </w:tc>
-      </w:tr>
-      <w:tr>
-        <w:tc>
-          <w:tcPr>
-            <w:tcW w:w="3599" w:type="dxa"/>
-            <w:tcBorders>
-              <w:top w:val="single" w:sz="2" w:space="0" w:color="CCCCCC"/>
-              <w:left w:val="single" w:sz="2" w:space="0" w:color="CCCCCC"/>
-              <w:bottom w:val="single" w:sz="2" w:space="0" w:color="CCCCCC"/>
-              <w:right w:val="single" w:sz="2" w:space="0" w:color="CCCCCC"/>
-            </w:tcBorders>
-          </w:tcPr>
-          <w:p>
-            <w:r>
-              <w:t>HNO required for all validation requests</w:t>
-            </w:r>
-          </w:p>
-        </w:tc>
-        <w:tc>
-          <w:tcPr>
-            <w:tcW w:w="5760" w:type="dxa"/>
-            <w:tcBorders>
-              <w:top w:val="single" w:sz="2" w:space="0" w:color="CCCCCC"/>
-              <w:left w:val="single" w:sz="2" w:space="0" w:color="CCCCCC"/>
-              <w:bottom w:val="single" w:sz="2" w:space="0" w:color="CCCCCC"/>
-              <w:right w:val="single" w:sz="2" w:space="0" w:color="CCCCCC"/>
-            </w:tcBorders>
-          </w:tcPr>
-          <w:p>
-            <w:r>
-              <w:t>This algorithm requires ca:HNO as a Gate 1 minimum element. The use case for validating named locations without a street address number (landmarks, points of interest, campus locations) is thin in the LVF context — the LVF’s role is civic address validation for LIS provisioning, and a PIDF-LO without HNO is at best ambiguous. Requiring HNO also enables reliable RCL side determination (§5.4) and consistent &lt;mapping&gt; element selection (§7.5). Validation of no-HNO addresses is deferred as a future work item — see §10.2.</w:t>
-            </w:r>
-          </w:p>
-        </w:tc>
-      </w:tr>
-      <w:tr>
-        <w:tc>
-          <w:tcPr>
-            <w:tcW w:w="3599" w:type="dxa"/>
-            <w:tcBorders>
-              <w:top w:val="single" w:sz="2" w:space="0" w:color="CCCCCC"/>
-              <w:left w:val="single" w:sz="2" w:space="0" w:color="CCCCCC"/>
-              <w:bottom w:val="single" w:sz="2" w:space="0" w:color="CCCCCC"/>
-              <w:right w:val="single" w:sz="2" w:space="0" w:color="CCCCCC"/>
-            </w:tcBorders>
-          </w:tcPr>
-          <w:p>
-            <w:r>
-              <w:lastRenderedPageBreak/>
-              <w:t>Civic coverage region derived from RCL with service boundary point-in-polygon filter</w:t>
-            </w:r>
-          </w:p>
-        </w:tc>
-        <w:tc>
-          <w:tcPr>
-            <w:tcW w:w="5760" w:type="dxa"/>
-            <w:tcBorders>
-              <w:top w:val="single" w:sz="2" w:space="0" w:color="CCCCCC"/>
-              <w:left w:val="single" w:sz="2" w:space="0" w:color="CCCCCC"/>
-              <w:bottom w:val="single" w:sz="2" w:space="0" w:color="CCCCCC"/>
-              <w:right w:val="single" w:sz="2" w:space="0" w:color="CCCCCC"/>
-            </w:tcBorders>
-          </w:tcPr>
-          <w:p>
-            <w:r>
-              <w:t>The civic coverage region is derived from RCL administrative attribute values (Country, A1–A5 per side), filtered by a point-in-polygon test against provisioned service boundaries using a 0.0001-degree perpendicular offset from each segment side. This ensures that road segments coincident with coverage boundaries (e.g., state lines) do not cause the LVF to claim authority for administrative elements on the outward-facing side. See §3.5.</w:t>
-            </w:r>
-          </w:p>
-        </w:tc>
-      </w:tr>
-      <w:tr>
-        <w:tc>
-          <w:tcPr>
-            <w:tcW w:w="3600" w:type="dxa"/>
-            <w:tcBorders>
-              <w:top w:val="single" w:sz="2" w:space="0" w:color="CCCCCC"/>
-              <w:left w:val="single" w:sz="2" w:space="0" w:color="CCCCCC"/>
-              <w:bottom w:val="single" w:sz="2" w:space="0" w:color="CCCCCC"/>
-              <w:right w:val="single" w:sz="2" w:space="0" w:color="CCCCCC"/>
-            </w:tcBorders>
-          </w:tcPr>
-          <w:p>
-            <w:r>
-              <w:t>LVF_SERVER_URI and LVF_DISPLAY_NAME_LANG environment variables for RFC 5222 wire format compliance</w:t>
-            </w:r>
-          </w:p>
-        </w:tc>
-        <w:tc>
-          <w:tcPr>
-            <w:tcW w:w="5760" w:type="dxa"/>
-            <w:tcBorders>
-              <w:top w:val="single" w:sz="2" w:space="0" w:color="CCCCCC"/>
-              <w:left w:val="single" w:sz="2" w:space="0" w:color="CCCCCC"/>
-              <w:bottom w:val="single" w:sz="2" w:space="0" w:color="CCCCCC"/>
-              <w:right w:val="single" w:sz="2" w:space="0" w:color="CCCCCC"/>
-            </w:tcBorders>
-          </w:tcPr>
-          <w:p>
-            <w:r>
-              <w:t>RFC 5222 requires source attributes on &lt;errors&gt; and &lt;path&gt;&lt;via&gt;, and a full set of attributes and child elements on &lt;mapping&gt;. LVF_SERVER_URI provides the U-NAPTR/DDDS application unique string (DNS name form, e.g. lostserver.example.com) used as source on &lt;path&gt;&lt;via&gt; and &lt;errors&gt;, and as fallback source on &lt;mapping&gt; when Agency_ID is absent from the boundary data. LVF_DISPLAY_NAME_LANG provides the BCP 47 language tag for xml:lang on &lt;displayName&gt; elements (default: en). Required &lt;mapping&gt; attributes (expires, lastUpdated, source, sourceId) use STA-006.3 boundary fields (Expire, DateUpdate, Agency_ID, NGUID) with defined fallbacks so that RFC 5222 schema compliance is maintained regardless of data completeness. &lt;mapping&gt; child elements &lt;uri&gt; (ServiceURI), &lt;serviceNumber&gt; (ServiceNum), and &lt;displayName&gt; (DsplayName) are included when present in the provisioned boundary data.</w:t>
+              <w:t>RFC 5222 requires source attributes on &lt;errors&gt; and &lt;path&gt;&lt;via&gt;, and a full set of attributes and child elements on &lt;mapping&gt;. LVF_SERVER_URI provides the U-NAPTR/DDDS application unique string (DNS name form, e.g. lostserver.example.com) used as source on &lt;path&gt;&lt;via&gt;, &lt;errors&gt;, and all &lt;mapping&gt; elements — per RFC 5222 §5.1, source identifies the authoritative generator of the mapping (this LVF server). Agency_ID is not used for the source attribute. LVF_DISPLAY_NAME_LANG provides the BCP 47 language tag for xml:lang on &lt;displayName&gt; elements (default: en). Required &lt;mapping&gt; attributes (expires, lastUpdated, source, sourceId) are populated as follows: expires from Expire (defaulting to NO-EXPIRATION), lastUpdated from DateUpdate (defaulting to current UTC), source always from LVF_SERVER_URI, sourceId from NGUID (required — no fallback). &lt;mapping&gt; child elements &lt;uri&gt; (ServiceURI), &lt;serviceNumber&gt; (ServiceNum), and &lt;displayName&gt; (DsplayName) are included when present in the provisioned boundary data.</w:t>
             </w:r>
           </w:p>
         </w:tc>
@@ -11722,7 +11868,7 @@
           </w:tcPr>
           <w:p>
             <w:r>
-              <w:t xml:space="preserve">RFC 5222 §8.4.1 requires &lt;mapping&gt; in every findServiceResponse. When the civic coverage lookup yields no unambiguous boundary for a non-conforming result, no real provisioned boundary has geographic authority for the submitted address — returning a real PSAP boundary (e.g., boundaries[0]) is misleading. A synthetic mapping with displayName “VALIDATION RESULT ONLY” satisfies the protocol requirement without attributing geographic authority. LVF_DEFAULT_MAPPING_SOURCE_ID provides the RFC 5222-required sourceId for this synthetic record. The recommended value is {00000000-0000-0000-0000-000000000000} — an all-zeros UUID that is recognizable as a sentinel value distinct from any real provisioned boundary. The LVF MUST NOT start if this variable is unset, ensuring the behavior is always explicitly configured rather than silently defaulting.</w:t>
+              <w:t>RFC 5222 §8.4.1 requires &lt;mapping&gt; in every findServiceResponse. When the civic coverage lookup yields no unambiguous boundary for a non-conforming result, no real provisioned boundary has geographic authority for the submitted address — returning a real PSAP boundary (e.g., boundaries[0]) is misleading. A synthetic mapping with displayName “VALIDATION RESULT ONLY” satisfies the protocol requirement without attributing geographic authority. LVF_DEFAULT_MAPPING_SOURCE_ID provides the RFC 5222-required sourceId for this synthetic record. The recommended value is {00000000-0000-0000-0000-000000000000} — an all-zeros UUID that is recognizable as a sentinel value distinct from any real provisioned boundary. The LVF MUST NOT start if this variable is unset, ensuring the behavior is always explicitly configured rather than silently defaulting.</w:t>
             </w:r>
           </w:p>
         </w:tc>
@@ -11734,6 +11880,7 @@
           </w:tcPr>
           <w:p>
             <w:r>
+              <w:lastRenderedPageBreak/>
               <w:t>completeLocation extension enabled by configuration; disabled by default</w:t>
             </w:r>
           </w:p>
@@ -11744,7 +11891,7 @@
           </w:tcPr>
           <w:p>
             <w:r>
-              <w:t xml:space="preserve">The Similar Location extension (draft-ietf-ecrit-similar-location-19) is experimental and not yet standardized. Enabling it by default would emit non-standard XML elements in every applicable response, potentially breaking clients that do not recognize the rli namespace. The LVF_ENABLE_SIMILAR_LOCATION environment variable provides explicit opt-in. When disabled, the extension is completely invisible — no namespace declarations, no additional elements, no attribute parsing.</w:t>
+              <w:t>The Similar Location extension (draft-ietf-ecrit-similar-location-19) is experimental and not yet standardized. Enabling it by default would emit non-standard XML elements in every applicable response, potentially breaking clients that do not recognize the rli namespace. The LVF_ENABLE_SIMILAR_LOCATION environment variable provides explicit opt-in. When disabled, the extension is completely invisible — no namespace declarations, no additional elements, no attribute parsing.</w:t>
             </w:r>
           </w:p>
         </w:tc>
@@ -11766,7 +11913,114 @@
           </w:tcPr>
           <w:p>
             <w:r>
-              <w:t xml:space="preserve">draft-ietf-ecrit-similar-location-19 §4 leaves the definition of “complete” to local policy. This implementation defines it normatively as all non-null PIDF-LO civic address fields present on the matched SSAP record, serialized in ELEMENT_HIERARCHY order. Unconstrained local policy risks inconsistent LIS record storage across deployments — different completeness definitions produce different address records stored in the LIS, with downstream consequences for CAD systems and other consumers that depend on consistent address representations. Defining completeness deterministically eliminates this ambiguity. Only PIDF-LO civic address fields are included; GIS-internal fields (geometry, NGUID, Agency_ID, etc.) are never emitted.</w:t>
+              <w:t>draft-ietf-ecrit-similar-location-19 §4 leaves the definition of “complete” to local policy. This implementation defines it normatively as all non-null PIDF-LO civic address fields present on the matched SSAP record, serialized in ELEMENT_HIERARCHY order. Unconstrained local policy risks inconsistent LIS record storage across deployments — different completeness definitions produce different address records stored in the LIS, with downstream consequences for CAD systems and other consumers that depend on consistent address representations. Defining completeness deterministically eliminates this ambiguity. Only PIDF-LO civic address fields are included; GIS-internal fields (geometry, NGUID, Agency_ID, etc.) are never emitted.</w:t>
+            </w:r>
+          </w:p>
+        </w:tc>
+      </w:tr>
+      <w:tr>
+        <w:tc>
+          <w:tcPr>
+            <w:tcW w:w="4680" w:type="dxa"/>
+            <w:tcBorders>
+              <w:top w:val="single" w:sz="2" w:space="0" w:color="CCCCCC"/>
+              <w:left w:val="single" w:sz="2" w:space="0" w:color="CCCCCC"/>
+              <w:bottom w:val="single" w:sz="2" w:space="0" w:color="CCCCCC"/>
+              <w:right w:val="single" w:sz="2" w:space="0" w:color="CCCCCC"/>
+            </w:tcBorders>
+          </w:tcPr>
+          <w:p>
+            <w:r>
+              <w:t>LVF SHOULD be provisioned with PsapPolygon layer only</w:t>
+            </w:r>
+          </w:p>
+        </w:tc>
+        <w:tc>
+          <w:tcPr>
+            <w:tcW w:w="4680" w:type="dxa"/>
+            <w:tcBorders>
+              <w:top w:val="single" w:sz="2" w:space="0" w:color="CCCCCC"/>
+              <w:left w:val="single" w:sz="2" w:space="0" w:color="CCCCCC"/>
+              <w:bottom w:val="single" w:sz="2" w:space="0" w:color="CCCCCC"/>
+              <w:right w:val="single" w:sz="2" w:space="0" w:color="CCCCCC"/>
+            </w:tcBorders>
+          </w:tcPr>
+          <w:p>
+            <w:r>
+              <w:t>The &lt;uri&gt; returned in &lt;mapping&gt; represents the PSAP serving the validated address. Loading other boundary layer types (e.g., ESRP or BCF boundaries) is an ECRF routing concern — the LVF’s role is civic address validation, and the URI it returns should reflect the authoritative PSAP destination. This is consistent with i3’s position that LVF provisioning does not vary by interface (NENA-STA-010).</w:t>
+            </w:r>
+          </w:p>
+        </w:tc>
+      </w:tr>
+      <w:tr>
+        <w:tc>
+          <w:tcPr>
+            <w:tcW w:w="4680" w:type="dxa"/>
+            <w:tcBorders>
+              <w:top w:val="single" w:sz="2" w:space="0" w:color="CCCCCC"/>
+              <w:left w:val="single" w:sz="2" w:space="0" w:color="CCCCCC"/>
+              <w:bottom w:val="single" w:sz="2" w:space="0" w:color="CCCCCC"/>
+              <w:right w:val="single" w:sz="2" w:space="0" w:color="CCCCCC"/>
+            </w:tcBorders>
+          </w:tcPr>
+          <w:p>
+            <w:r>
+              <w:t>source attribute on &lt;mapping&gt; always uses LVF_SERVER_URI, not Agency_ID</w:t>
+            </w:r>
+          </w:p>
+        </w:tc>
+        <w:tc>
+          <w:tcPr>
+            <w:tcW w:w="4680" w:type="dxa"/>
+            <w:tcBorders>
+              <w:top w:val="single" w:sz="2" w:space="0" w:color="CCCCCC"/>
+              <w:left w:val="single" w:sz="2" w:space="0" w:color="CCCCCC"/>
+              <w:bottom w:val="single" w:sz="2" w:space="0" w:color="CCCCCC"/>
+              <w:right w:val="single" w:sz="2" w:space="0" w:color="CCCCCC"/>
+            </w:tcBorders>
+          </w:tcPr>
+          <w:p>
+            <w:r>
+              <w:t>RFC 5222 §5.1 defines source as identifying “the authoritative generator of the mapping” — i.e., the server producing the response. This is the LVF server itself, identified by LVF_SERVER_URI. Agency_ID identifies the agency that owns the service boundary, which is a different concept. Using Agency_ID for source is a misapplication of the RFC 5222 data model.</w:t>
+            </w:r>
+          </w:p>
+        </w:tc>
+      </w:tr>
+      <w:tr>
+        <w:tc>
+          <w:tcPr>
+            <w:tcW w:w="4680" w:type="dxa"/>
+            <w:tcBorders>
+              <w:top w:val="single" w:sz="2" w:space="0" w:color="CCCCCC"/>
+              <w:left w:val="single" w:sz="2" w:space="0" w:color="CCCCCC"/>
+              <w:bottom w:val="single" w:sz="2" w:space="0" w:color="CCCCCC"/>
+              <w:right w:val="single" w:sz="2" w:space="0" w:color="CCCCCC"/>
+            </w:tcBorders>
+          </w:tcPr>
+          <w:p>
+            <w:r>
+              <w:t xml:space="preserve">URN alias resolution via LVF_URN_ALIASES — single </w:t>
+              <w:lastRenderedPageBreak/>
+              <w:t>PsapPolygon layer serves all interfaces</w:t>
+            </w:r>
+          </w:p>
+        </w:tc>
+        <w:tc>
+          <w:tcPr>
+            <w:tcW w:w="4680" w:type="dxa"/>
+            <w:tcBorders>
+              <w:top w:val="single" w:sz="2" w:space="0" w:color="CCCCCC"/>
+              <w:left w:val="single" w:sz="2" w:space="0" w:color="CCCCCC"/>
+              <w:bottom w:val="single" w:sz="2" w:space="0" w:color="CCCCCC"/>
+              <w:right w:val="single" w:sz="2" w:space="0" w:color="CCCCCC"/>
+            </w:tcBorders>
+          </w:tcPr>
+          <w:p>
+            <w:r>
+              <w:lastRenderedPageBreak/>
+              <w:t xml:space="preserve">NENA-STA-010 states that all LVFs are provisioned with the same data, whether inside or </w:t>
+              <w:lastRenderedPageBreak/>
+              <w:t>outside an ESInet. A 911 Authority should only need to maintain one PsapPolygon boundary layer. Without alias resolution, an ESInet element querying with urn:emergency:service:sos.psap would receive &lt;serviceNotImplemented&gt; from an LVF provisioned only for urn:service:sos, despite identical GIS data. LVF_URN_ALIASES allows operator-configured alias URNs to be resolved to urn:service:sos at Gate 0. The response carries the client’s original URN per RFC 5222 round-trip requirements.</w:t>
             </w:r>
           </w:p>
         </w:tc>
@@ -13511,28 +13765,6 @@
 </file>
 
 <file path=customXml/item1.xml><?xml version="1.0" encoding="utf-8"?>
-<p:properties xmlns:p="http://schemas.microsoft.com/office/2006/metadata/properties" xmlns:xsi="http://www.w3.org/2001/XMLSchema-instance" xmlns:pc="http://schemas.microsoft.com/office/infopath/2007/PartnerControls">
-  <documentManagement>
-    <_ip_UnifiedCompliancePolicyUIAction xmlns="http://schemas.microsoft.com/sharepoint/v3" xsi:nil="true"/>
-    <TaxCatchAll xmlns="8e2ac45b-d875-4cc0-a09b-705ead14c44e" xsi:nil="true"/>
-    <_ip_UnifiedCompliancePolicyProperties xmlns="http://schemas.microsoft.com/sharepoint/v3" xsi:nil="true"/>
-    <lcf76f155ced4ddcb4097134ff3c332f xmlns="41389003-bbed-4aa2-97c4-1c86992b5a30">
-      <Terms xmlns="http://schemas.microsoft.com/office/infopath/2007/PartnerControls"/>
-    </lcf76f155ced4ddcb4097134ff3c332f>
-  </documentManagement>
-</p:properties>
-</file>
-
-<file path=customXml/item2.xml><?xml version="1.0" encoding="utf-8"?>
-<?mso-contentType ?>
-<FormTemplates xmlns="http://schemas.microsoft.com/sharepoint/v3/contenttype/forms">
-  <Display>DocumentLibraryForm</Display>
-  <Edit>DocumentLibraryForm</Edit>
-  <New>DocumentLibraryForm</New>
-</FormTemplates>
-</file>
-
-<file path=customXml/item3.xml><?xml version="1.0" encoding="utf-8"?>
 <ct:contentTypeSchema xmlns:ct="http://schemas.microsoft.com/office/2006/metadata/contentType" xmlns:ma="http://schemas.microsoft.com/office/2006/metadata/properties/metaAttributes" ct:_="" ma:_="" ma:contentTypeName="Document" ma:contentTypeID="0x0101006B579F38E1D5BD4A9D2AA62E50E83A34" ma:contentTypeVersion="14" ma:contentTypeDescription="Create a new document." ma:contentTypeScope="" ma:versionID="4abafea7b3931f778c9c2da7edbbe3ab">
   <xsd:schema xmlns:xsd="http://www.w3.org/2001/XMLSchema" xmlns:xs="http://www.w3.org/2001/XMLSchema" xmlns:p="http://schemas.microsoft.com/office/2006/metadata/properties" xmlns:ns1="http://schemas.microsoft.com/sharepoint/v3" xmlns:ns2="41389003-bbed-4aa2-97c4-1c86992b5a30" xmlns:ns3="8e2ac45b-d875-4cc0-a09b-705ead14c44e" targetNamespace="http://schemas.microsoft.com/office/2006/metadata/properties" ma:root="true" ma:fieldsID="bfad364f52c936984cea429568bff535" ns1:_="" ns2:_="" ns3:_="">
     <xsd:import namespace="http://schemas.microsoft.com/sharepoint/v3"/>
@@ -13750,27 +13982,29 @@
 </ct:contentTypeSchema>
 </file>
 
-<file path=customXml/itemProps1.xml><?xml version="1.0" encoding="utf-8"?>
-<ds:datastoreItem xmlns:ds="http://schemas.openxmlformats.org/officeDocument/2006/customXml" ds:itemID="{CD286D78-450A-4CA4-9D05-19A451889467}">
-  <ds:schemaRefs>
-    <ds:schemaRef ds:uri="http://schemas.microsoft.com/office/2006/metadata/properties"/>
-    <ds:schemaRef ds:uri="http://schemas.microsoft.com/office/infopath/2007/PartnerControls"/>
-    <ds:schemaRef ds:uri="http://schemas.microsoft.com/sharepoint/v3"/>
-    <ds:schemaRef ds:uri="8e2ac45b-d875-4cc0-a09b-705ead14c44e"/>
-    <ds:schemaRef ds:uri="41389003-bbed-4aa2-97c4-1c86992b5a30"/>
-  </ds:schemaRefs>
-</ds:datastoreItem>
+<file path=customXml/item2.xml><?xml version="1.0" encoding="utf-8"?>
+<?mso-contentType ?>
+<FormTemplates xmlns="http://schemas.microsoft.com/sharepoint/v3/contenttype/forms">
+  <Display>DocumentLibraryForm</Display>
+  <Edit>DocumentLibraryForm</Edit>
+  <New>DocumentLibraryForm</New>
+</FormTemplates>
 </file>
 
-<file path=customXml/itemProps2.xml><?xml version="1.0" encoding="utf-8"?>
-<ds:datastoreItem xmlns:ds="http://schemas.openxmlformats.org/officeDocument/2006/customXml" ds:itemID="{8E413237-868A-4F93-8A7E-44FCF08A2CE0}">
-  <ds:schemaRefs>
-    <ds:schemaRef ds:uri="http://schemas.microsoft.com/sharepoint/v3/contenttype/forms"/>
-  </ds:schemaRefs>
-</ds:datastoreItem>
+<file path=customXml/item3.xml><?xml version="1.0" encoding="utf-8"?>
+<p:properties xmlns:p="http://schemas.microsoft.com/office/2006/metadata/properties" xmlns:xsi="http://www.w3.org/2001/XMLSchema-instance" xmlns:pc="http://schemas.microsoft.com/office/infopath/2007/PartnerControls">
+  <documentManagement>
+    <_ip_UnifiedCompliancePolicyUIAction xmlns="http://schemas.microsoft.com/sharepoint/v3" xsi:nil="true"/>
+    <TaxCatchAll xmlns="8e2ac45b-d875-4cc0-a09b-705ead14c44e" xsi:nil="true"/>
+    <_ip_UnifiedCompliancePolicyProperties xmlns="http://schemas.microsoft.com/sharepoint/v3" xsi:nil="true"/>
+    <lcf76f155ced4ddcb4097134ff3c332f xmlns="41389003-bbed-4aa2-97c4-1c86992b5a30">
+      <Terms xmlns="http://schemas.microsoft.com/office/infopath/2007/PartnerControls"/>
+    </lcf76f155ced4ddcb4097134ff3c332f>
+  </documentManagement>
+</p:properties>
 </file>
 
-<file path=customXml/itemProps3.xml><?xml version="1.0" encoding="utf-8"?>
+<file path=customXml/itemProps1.xml><?xml version="1.0" encoding="utf-8"?>
 <ds:datastoreItem xmlns:ds="http://schemas.openxmlformats.org/officeDocument/2006/customXml" ds:itemID="{C66E9BB7-E154-40B2-B016-91E6870259B9}">
   <ds:schemaRefs>
     <ds:schemaRef ds:uri="http://schemas.microsoft.com/office/2006/metadata/contentType"/>
@@ -13788,4 +14022,24 @@
     <ds:schemaRef ds:uri="http://schemas.microsoft.com/internal/obd"/>
   </ds:schemaRefs>
 </ds:datastoreItem>
+</file>
+
+<file path=customXml/itemProps2.xml><?xml version="1.0" encoding="utf-8"?>
+<ds:datastoreItem xmlns:ds="http://schemas.openxmlformats.org/officeDocument/2006/customXml" ds:itemID="{8E413237-868A-4F93-8A7E-44FCF08A2CE0}">
+  <ds:schemaRefs>
+    <ds:schemaRef ds:uri="http://schemas.microsoft.com/sharepoint/v3/contenttype/forms"/>
+  </ds:schemaRefs>
+</ds:datastoreItem>
+</file>
+
+<file path=customXml/itemProps3.xml><?xml version="1.0" encoding="utf-8"?>
+<ds:datastoreItem xmlns:ds="http://schemas.openxmlformats.org/officeDocument/2006/customXml" ds:itemID="{CD286D78-450A-4CA4-9D05-19A451889467}">
+  <ds:schemaRefs>
+    <ds:schemaRef ds:uri="http://schemas.microsoft.com/office/2006/metadata/properties"/>
+    <ds:schemaRef ds:uri="http://schemas.microsoft.com/office/infopath/2007/PartnerControls"/>
+    <ds:schemaRef ds:uri="http://schemas.microsoft.com/sharepoint/v3"/>
+    <ds:schemaRef ds:uri="8e2ac45b-d875-4cc0-a09b-705ead14c44e"/>
+    <ds:schemaRef ds:uri="41389003-bbed-4aa2-97c4-1c86992b5a30"/>
+  </ds:schemaRefs>
+</ds:datastoreItem>
 </file>
</xml_diff>